<commit_message>
A Menina Elefante: leitura das postagens e textos da Luciana
Transcreve 20 postagens/textos (2025–2026) como fonte, extrai fatos, eixos do
pensamento e voz em docs/LEITURA_INSTAGRAM.md, e encaixa as histórias novas
na bíblia e no roteiro: Parte VI passa a ter O salto (30/1/2025) e As águas
(batismo no Brasil); três filhas e nascimento em set/1988 confirmados.

Co-Authored-By: Claude Opus 5.5 <noreply@anthropic.com>
Claude-Session: https://claude.ai/code/session_011ZTeK22H8KBNtWenzEUTZE
</commit_message>
<xml_diff>
--- a/menina_elefante/saidas/A_Menina_Elefante_V2.docx
+++ b/menina_elefante/saidas/A_Menina_Elefante_V2.docx
@@ -81,7 +81,7 @@
     </w:p>
     <w:p>
       <w:r>
-        <w:t xml:space="preserve">Eu tinha me preparado. Durante o dia, entre uma ligação de cliente e a saída da escola, tinha feito mentalmente a lista do que contar, na ordem certa, como quem prepara a apresentação de uma casa. Idade, casada, filhos, Japão desde quando, trabalho com o meu marido no mercado imobiliário, a gente atende brasileiros que querem comprar casa aqui. Falei tudo em uns quatro minutos. Ela não anotou nada.</w:t>
+        <w:t xml:space="preserve">Eu tinha me preparado. Durante o dia, entre uma ligação de cliente e a saída da escola, tinha feito mentalmente a lista do que contar, na ordem certa, como quem prepara a apresentação de uma casa. Idade, casada, três filhas, Japão desde quando, trabalho com o meu marido no mercado imobiliário, a gente atende brasileiros que querem comprar casa aqui. Falei tudo em uns quatro minutos. Ela não anotou nada.</w:t>
       </w:r>
     </w:p>
     <w:p>
@@ -1147,7 +1147,7 @@
     </w:p>
     <w:p>
       <w:r>
-        <w:t xml:space="preserve">Ninguém anunciou isso numa cartolina. Mas a sala nova, na escola nova, tinha regras que todo mundo parecia ter recebido por escrito menos eu. Aos quinze anos já não bastava ser amiga de todos. Era preciso ser de alguém. As turmas tinham ficado mais duras nas bordas, e quem andava entre elas não era mais sociável; era esquisito, ou pior, era falso. Eu ouvi essa palavra dita sobre outra menina, numa roda no corredor, e senti um frio atrás do pescoço, como se tivessem dito o meu nome.</w:t>
+        <w:t xml:space="preserve">Ninguém anunciou isso numa cartolina. Mas a sala nova, na escola nova, tinha regras que todo mundo parecia ter recebido por escrito menos eu. Aos catorze anos já não bastava ser amiga de todos. Era preciso ser de alguém. As turmas tinham ficado mais duras nas bordas, e quem andava entre elas não era mais sociável; era esquisito, ou pior, era falso. Eu ouvi essa palavra dita sobre outra menina, numa roda no corredor, e senti um frio atrás do pescoço, como se tivessem dito o meu nome.</w:t>
       </w:r>
     </w:p>
     <w:p>
@@ -1442,7 +1442,7 @@
     </w:p>
     <w:p>
       <w:r>
-        <w:t xml:space="preserve">Eu não sabia o que tinha acontecido. Sabia em linhas gerais o que vinha acontecendo havia meses na casa dela, porque ela me contava aos pedaços, no caminho da escola, sempre olhando para a frente, nunca para mim: a mãe dela, as brigas, as noites, as coisas que uma filha de quinze anos não devia ter de ouvir nem de fazer. Eu ouvia tudo e guardava tudo. Mas naquela noite, com ela sentada na nossa cozinha comendo arroz com ovo frito que minha mãe tinha feito em dois minutos, eu entendi que dessa vez era outra coisa. Dessa vez ela tinha trazido as roupas.</w:t>
+        <w:t xml:space="preserve">Eu não sabia o que tinha acontecido. Sabia em linhas gerais o que vinha acontecendo havia meses na casa dela, porque ela me contava aos pedaços, no caminho da escola, sempre olhando para a frente, nunca para mim: a mãe dela, as brigas, as noites, as coisas que uma menina da nossa idade não devia ter de ouvir nem de fazer. Eu ouvia tudo e guardava tudo. Mas naquela noite, com ela sentada na nossa cozinha comendo arroz com ovo frito que minha mãe tinha feito em dois minutos, eu entendi que dessa vez era outra coisa. Dessa vez ela tinha trazido as roupas.</w:t>
       </w:r>
     </w:p>
     <w:p>

</xml_diff>

<commit_message>
A Menina Elefante: terceiro lote de postagens; Recomeço (2025) vira o clímax
Transcreve mais 14 textos/posts; nomes das filhas (Mity, Tiemi), irmão Marcos,
marido chamado de Kousuke na voz dela; crise e recomeço do casal no Natal de
2025 viram o cap. 28; Parte VI com 5 capítulos. Pseudônimos da Parte I
trocados para não coincidir com pessoas reais (Simone→Cíntia, Camila→Renata).

Co-Authored-By: Claude Opus 5.5 <noreply@anthropic.com>
Claude-Session: https://claude.ai/code/session_011ZTeK22H8KBNtWenzEUTZE
</commit_message>
<xml_diff>
--- a/menina_elefante/saidas/A_Menina_Elefante_V2.docx
+++ b/menina_elefante/saidas/A_Menina_Elefante_V2.docx
@@ -63,7 +63,7 @@
     </w:p>
     <w:p>
       <w:r>
-        <w:t xml:space="preserve">Escolhi o horário por eliminação. Às nove as crianças já estavam no quarto, o Alan já tinha lavado a louça do jantar e a casa ficava naquele silêncio de geladeira que só existe depois que todo mundo desiste de pedir alguma coisa. Montei o notebook na mesa da cozinha, apoiado em dois livros de receita para a câmera não pegar meu queixo de baixo, e pus os fones de ouvido. Não queria que ninguém escutasse. Não sabia ainda o que eu ia dizer, mas já sabia que não queria que ninguém escutasse.</w:t>
+        <w:t xml:space="preserve">Escolhi o horário por eliminação. Às nove as crianças já estavam no quarto, o Kousuke já tinha lavado a louça do jantar e a casa ficava naquele silêncio de geladeira que só existe depois que todo mundo desiste de pedir alguma coisa. Montei o notebook na mesa da cozinha, apoiado em dois livros de receita para a câmera não pegar meu queixo de baixo, e pus os fones de ouvido. Não queria que ninguém escutasse. Não sabia ainda o que eu ia dizer, mas já sabia que não queria que ninguém escutasse.</w:t>
       </w:r>
     </w:p>
     <w:p>
@@ -270,7 +270,7 @@
     </w:p>
     <w:p>
       <w:r>
-        <w:t xml:space="preserve">Mandei mensagem para ela ali mesmo, deitada, com o brilho do celular no mínimo para não acordar o Alan.</w:t>
+        <w:t xml:space="preserve">Mandei mensagem para ela ali mesmo, deitada, com o brilho do celular no mínimo para não acordar o Kousuke.</w:t>
       </w:r>
     </w:p>
     <w:p>
@@ -960,7 +960,7 @@
     </w:p>
     <w:p>
       <w:r>
-        <w:t xml:space="preserve">Na minha sala, como em todas as salas do mundo, as crianças foram se separando sozinhas, sem ninguém mandar, como feijão e pedrinha na peneira. Tinha a turma da Camila, que morava numa casa com piscina e trazia lanche de padaria em vez de pão com margarina, e que dava as festas de aniversário mais disputadas da série. Tinha o Thiago e os amigos dele, que sabiam a tabuada do nove de trás para frente e corrigiam a professora quando ela errava uma conta no quadro. Tinha o Marcão, que era um ano mais velho porque tinha repetido, e a turma dele, que passava o recreio inteiro correndo e voltava para a sala vermelha e fedida. E tinha a Érica, que falava tão baixo que a professora pedia para ela repetir três vezes, e as duas ou três meninas que sentavam perto dela e desenhavam cavalos na última folha do caderno.</w:t>
+        <w:t xml:space="preserve">Na minha sala, como em todas as salas do mundo, as crianças foram se separando sozinhas, sem ninguém mandar, como feijão e pedrinha na peneira. Tinha a turma da Renata, que morava numa casa com piscina e trazia lanche de padaria em vez de pão com margarina, e que dava as festas de aniversário mais disputadas da série. Tinha o Thiago e os amigos dele, que sabiam a tabuada do nove de trás para frente e corrigiam a professora quando ela errava uma conta no quadro. Tinha o Marcão, que era um ano mais velho porque tinha repetido, e a turma dele, que passava o recreio inteiro correndo e voltava para a sala vermelha e fedida. E tinha a Érica, que falava tão baixo que a professora pedia para ela repetir três vezes, e as duas ou três meninas que sentavam perto dela e desenhavam cavalos na última folha do caderno.</w:t>
       </w:r>
     </w:p>
     <w:p>
@@ -973,7 +973,7 @@
     </w:p>
     <w:p>
       <w:r>
-        <w:t xml:space="preserve">Não era uma decisão. Eu simplesmente sabia, sem saber que sabia, o que cada turma queria de mim. Com a Camila, eu falava da novela das sete e das Barbies que eu não tinha, e ria das coisas que ela achava engraçadas um segundo antes de ela terminar de contar, para ela ver que eu tinha entendido. Com o Thiago, eu ficava séria e fazia perguntas sobre dinossauros. Com o Marcão, eu falava mais alto, corria, e uma vez disse "droga" com tanta convicção que ele me olhou com respeito. Com a Érica, eu baixava a voz até quase sumir, e desenhava cavalos também, piores que os dela, para ela poder me ensinar.</w:t>
+        <w:t xml:space="preserve">Não era uma decisão. Eu simplesmente sabia, sem saber que sabia, o que cada turma queria de mim. Com a Renata, eu falava da novela das sete e das Barbies que eu não tinha, e ria das coisas que ela achava engraçadas um segundo antes de ela terminar de contar, para ela ver que eu tinha entendido. Com o Thiago, eu ficava séria e fazia perguntas sobre dinossauros. Com o Marcão, eu falava mais alto, corria, e uma vez disse "droga" com tanta convicção que ele me olhou com respeito. Com a Érica, eu baixava a voz até quase sumir, e desenhava cavalos também, piores que os dela, para ela poder me ensinar.</w:t>
       </w:r>
     </w:p>
     <w:p>
@@ -1037,7 +1037,7 @@
     </w:p>
     <w:p>
       <w:r>
-        <w:t xml:space="preserve">Ninguém esperou os dois minutos. As cadeiras rasparam no chão ao mesmo tempo, e em segundos a sala tinha se dividido do jeito de sempre, só que agora de pé, e com as fronteiras à vista de todo mundo. A Camila juntou as amigas perto da janela. O Thiago e os dele já discutiam o vulcão na primeira fileira. O Marcão tinha subido numa carteira no fundo e gritava nomes. A Érica continuava sentada, com as duas amigas de sempre em volta, esperando, como se esperar fosse uma forma de escolher.</w:t>
+        <w:t xml:space="preserve">Ninguém esperou os dois minutos. As cadeiras rasparam no chão ao mesmo tempo, e em segundos a sala tinha se dividido do jeito de sempre, só que agora de pé, e com as fronteiras à vista de todo mundo. A Renata juntou as amigas perto da janela. O Thiago e os dele já discutiam o vulcão na primeira fileira. O Marcão tinha subido numa carteira no fundo e gritava nomes. A Érica continuava sentada, com as duas amigas de sempre em volta, esperando, como se esperar fosse uma forma de escolher.</w:t>
       </w:r>
     </w:p>
     <w:p>
@@ -1053,7 +1053,7 @@
         <w:ind w:firstLine="0"/>
       </w:pPr>
       <w:r>
-        <w:t xml:space="preserve">— Lu! — chamou a Camila, da janela. — Vem, falta uma.</w:t>
+        <w:t xml:space="preserve">— Lu! — chamou a Renata, da janela. — Vem, falta uma.</w:t>
       </w:r>
     </w:p>
     <w:p>
@@ -1079,7 +1079,7 @@
     </w:p>
     <w:p>
       <w:r>
-        <w:t xml:space="preserve">Eu olhei para os quatro cantos da sala, um de cada vez, e não consegui me mexer. Não era timidez. Eu sabia exatamente como ser em cada um daqueles grupos; já tinha sido. O que eu não sabia era como ser só em um. Se eu fosse para a janela, o Thiago ia achar que eu era fútil. Se fosse para o vulcão, a Camila não ia me chamar para o aniversário. Se fosse para o fundo, a dona Lourdes ia me olhar diferente. Se eu sentasse com a Érica, as outras turmas iam olhar para mim do jeito que olhavam para ela.</w:t>
+        <w:t xml:space="preserve">Eu olhei para os quatro cantos da sala, um de cada vez, e não consegui me mexer. Não era timidez. Eu sabia exatamente como ser em cada um daqueles grupos; já tinha sido. O que eu não sabia era como ser só em um. Se eu fosse para a janela, o Thiago ia achar que eu era fútil. Se fosse para o vulcão, a Renata não ia me chamar para o aniversário. Se fosse para o fundo, a dona Lourdes ia me olhar diferente. Se eu sentasse com a Érica, as outras turmas iam olhar para mim do jeito que olhavam para ela.</w:t>
       </w:r>
     </w:p>
     <w:p>
@@ -1185,12 +1185,12 @@
         <w:ind w:firstLine="0"/>
       </w:pPr>
       <w:r>
-        <w:t xml:space="preserve">A Simone sentava na primeira fileira e levantava a mão para tudo.</w:t>
+        <w:t xml:space="preserve">A Cíntia sentava na primeira fileira e levantava a mão para tudo.</w:t>
       </w:r>
     </w:p>
     <w:p>
       <w:r>
-        <w:t xml:space="preserve">Não era por mal, e não era para aparecer. Ela sabia mesmo as respostas e ficava aflita se ninguém dizia. Quando a professora de biologia fazia uma pergunta e a sala ficava em silêncio, a Simone aguentava uns três segundos e depois esticava o braço tão alto que o corpo inteiro subia junto na cadeira.</w:t>
+        <w:t xml:space="preserve">Não era por mal, e não era para aparecer. Ela sabia mesmo as respostas e ficava aflita se ninguém dizia. Quando a professora de biologia fazia uma pergunta e a sala ficava em silêncio, a Cíntia aguentava uns três segundos e depois esticava o braço tão alto que o corpo inteiro subia junto na cadeira.</w:t>
       </w:r>
     </w:p>
     <w:p>
@@ -1208,7 +1208,7 @@
     </w:p>
     <w:p>
       <w:r>
-        <w:t xml:space="preserve">Nas primeiras semanas, eu não tinha opinião sobre a Simone. Não tinha nem pensado nela. Depois que entrei no grupo, descobri que ali se tinha opinião sobre ela, e que a opinião era sempre a mesma. Ela era a piada de reserva. Quando a conversa esfriava, alguém fazia "professora, professora" com a voz fina, e todo mundo ria. Eu ria também. No começo, um pouco atrasada, só depois de ver os outros rindo. Depois, na hora certa.</w:t>
+        <w:t xml:space="preserve">Nas primeiras semanas, eu não tinha opinião sobre a Cíntia. Não tinha nem pensado nela. Depois que entrei no grupo, descobri que ali se tinha opinião sobre ela, e que a opinião era sempre a mesma. Ela era a piada de reserva. Quando a conversa esfriava, alguém fazia "professora, professora" com a voz fina, e todo mundo ria. Eu ria também. No começo, um pouco atrasada, só depois de ver os outros rindo. Depois, na hora certa.</w:t>
       </w:r>
     </w:p>
     <w:p>
@@ -1221,7 +1221,7 @@
         <w:ind w:firstLine="0"/>
       </w:pPr>
       <w:r>
-        <w:t xml:space="preserve">— Faz a Simone.</w:t>
+        <w:t xml:space="preserve">— Faz a Cíntia.</w:t>
       </w:r>
     </w:p>
     <w:p>
@@ -1237,7 +1237,7 @@
         <w:ind w:firstLine="0"/>
       </w:pPr>
       <w:r>
-        <w:t xml:space="preserve">— Você imita todo mundo. Eu vi você imitando a de matemática. Faz a Simone.</w:t>
+        <w:t xml:space="preserve">— Você imita todo mundo. Eu vi você imitando a de matemática. Faz a Cíntia.</w:t>
       </w:r>
     </w:p>
     <w:p>
@@ -1252,7 +1252,7 @@
     </w:p>
     <w:p>
       <w:r>
-        <w:t xml:space="preserve">A Simone estava sentada na frente, a umas quatro carteiras, lendo o livro de história por conta própria, porque a aula estava vaga e ela não sabia ficar sem fazer nada. Estava de costas. Eu via a nuca dela, o elástico azul no cabelo, a camiseta para dentro da calça.</w:t>
+        <w:t xml:space="preserve">A Cíntia estava sentada na frente, a umas quatro carteiras, lendo o livro de história por conta própria, porque a aula estava vaga e ela não sabia ficar sem fazer nada. Estava de costas. Eu via a nuca dela, o elástico azul no cabelo, a camiseta para dentro da calça.</w:t>
       </w:r>
     </w:p>
     <w:p>
@@ -1299,7 +1299,7 @@
         <w:ind w:firstLine="0"/>
       </w:pPr>
       <w:r>
-        <w:t xml:space="preserve">Então a Simone se virou.</w:t>
+        <w:t xml:space="preserve">Então a Cíntia se virou.</w:t>
       </w:r>
     </w:p>
     <w:p>
@@ -1348,7 +1348,7 @@
     </w:p>
     <w:p>
       <w:r>
-        <w:t xml:space="preserve">Eu olhei para a primeira fileira. Todo mundo olhou, porque todo mundo estava esperando o braço. A Simone estava com o caderno aberto, a caneta na mão, e eu vi de lado a boca dela se mexendo sem som, formando a resposta, palavra por palavra, direitinha.</w:t>
+        <w:t xml:space="preserve">Eu olhei para a primeira fileira. Todo mundo olhou, porque todo mundo estava esperando o braço. A Cíntia estava com o caderno aberto, a caneta na mão, e eu vi de lado a boca dela se mexendo sem som, formando a resposta, palavra por palavra, direitinha.</w:t>
       </w:r>
     </w:p>
     <w:p>
@@ -1364,17 +1364,17 @@
         <w:ind w:firstLine="0"/>
       </w:pPr>
       <w:r>
-        <w:t xml:space="preserve">— Ninguém? — disse a professora. — Nem você, Simone?</w:t>
+        <w:t xml:space="preserve">— Ninguém? — disse a professora. — Nem você, Cíntia?</w:t>
       </w:r>
     </w:p>
     <w:p>
       <w:r>
-        <w:t xml:space="preserve">A Simone fez que não com a cabeça, sem levantar os olhos do caderno.</w:t>
+        <w:t xml:space="preserve">A Cíntia fez que não com a cabeça, sem levantar os olhos do caderno.</w:t>
       </w:r>
     </w:p>
     <w:p>
       <w:r>
-        <w:t xml:space="preserve">No fundo da sala, a Débora me cutucou com o cotovelo, sorrindo, esperando que eu fizesse de novo. Eu sorri de volta e fiquei muito quieta, olhando para o elástico azul na nuca da Simone, com as duas mãos debaixo da carteira.</w:t>
+        <w:t xml:space="preserve">No fundo da sala, a Débora me cutucou com o cotovelo, sorrindo, esperando que eu fizesse de novo. Eu sorri de volta e fiquei muito quieta, olhando para o elástico azul na nuca da Cíntia, com as duas mãos debaixo da carteira.</w:t>
       </w:r>
     </w:p>
     <w:p>
@@ -1706,7 +1706,7 @@
     </w:p>
     <w:p>
       <w:r>
-        <w:t xml:space="preserve">Eu pensei na Simone. No braço que não subia mais. Na Débora me esperando no portão, no tênis em três vezes, nos vinte minutos para decidir entre "kkkkk" e "hahaha". Pensei em todas as noites acordada, ouvindo a respiração da Carla, e numa coisa estranha que eu vinha sentindo no peito e que não tinha nome.</w:t>
+        <w:t xml:space="preserve">Eu pensei na Cíntia. No braço que não subia mais. Na Débora me esperando no portão, no tênis em três vezes, nos vinte minutos para decidir entre "kkkkk" e "hahaha". Pensei em todas as noites acordada, ouvindo a respiração da Carla, e numa coisa estranha que eu vinha sentindo no peito e que não tinha nome.</w:t>
       </w:r>
     </w:p>
     <w:p>

</xml_diff>

<commit_message>
A Menina Elefante: revisão editorial de ritmo, tensão e arcos
docs/REVISAO_EDITORIAL.md com mapa de ritmo e tensão e diagnóstico. Cap. 28
reescrito em cena (a sala alugada sem avisar, o limite do Kousuke, o pai e a
caneca de asa colada, 'Mãe sabe', a saída juntos pela porta automática).
Pistas plantadas nos caps. 18, 20, 25, 26 e 27; o Kousuke no cap. 29; três
filhas, três gestos no epílogo. Invenções novas listadas em DECISOES_V2.md.

Co-Authored-By: Claude Opus 5.5 <noreply@anthropic.com>
Claude-Session: https://claude.ai/code/session_011ZTeK22H8KBNtWenzEUTZE
</commit_message>
<xml_diff>
--- a/menina_elefante/saidas/A_Menina_Elefante_V2.docx
+++ b/menina_elefante/saidas/A_Menina_Elefante_V2.docx
@@ -4863,7 +4863,7 @@
     </w:p>
     <w:p>
       <w:r>
-        <w:t xml:space="preserve">Não passou pela minha cabeça que eu estava voltando justamente para o único lugar em que eu tinha certeza de que dava conta: a fábrica. Não passou pela minha cabeça que uma parte de mim achava, lá no fundo, que era isso o que eu sabia fazer. Aguentar. Virar a peça, conferir, marcar, pôr na caixa.</w:t>
+        <w:t xml:space="preserve">Liguei o carro. No rádio, alguém anunciava vagas numa empreiteira de Aichi, fábrica de autopeças, com zangyō garantido e apartamento. Eu aumentei o volume e anotei o telefone no verso do cupom do supermercado.</w:t>
       </w:r>
     </w:p>
     <w:p>
@@ -5423,7 +5423,7 @@
         <w:ind w:firstLine="0"/>
       </w:pPr>
       <w:r>
-        <w:t xml:space="preserve">Minha mãe nunca soube da primeira notícia. Soube só da segunda, e achou que era a primeira.</w:t>
+        <w:t xml:space="preserve">Contei à minha mãe só a segunda notícia, como se fosse a primeira. Ela ouviu, fez que sim com a cabeça, agradeceu ao médico com uma reverência pequena, sentada na cama, e não perguntou nada. Na hora, achei que era alívio.</w:t>
       </w:r>
     </w:p>
     <w:p>
@@ -6659,7 +6659,20 @@
     </w:p>
     <w:p>
       <w:r>
-        <w:t xml:space="preserve">Não era mentira. Eu acreditava em cada palavra. Só que eu não sabia mais onde elas moravam.</w:t>
+        <w:t xml:space="preserve">De manhã, o Kousuke leu o texto no celular, de pé na cozinha, esperando o arroz. Leu até o fim, devagar, rolando a tela com o polegar. Depois pôs o celular na bancada, com a tela para baixo.</w:t>
+      </w:r>
+    </w:p>
+    <w:p>
+      <w:pPr>
+        <w:ind w:firstLine="0"/>
+      </w:pPr>
+      <w:r>
+        <w:t xml:space="preserve">— Bonito — disse.</w:t>
+      </w:r>
+    </w:p>
+    <w:p>
+      <w:r>
+        <w:t xml:space="preserve">Disse sem ironia nenhuma. Disse com a mesma cara com que, no tempo da praça da matriz, esperava o ônibus da faculdade encostado no poste. Eu esperei que ele dissesse mais alguma coisa. Ele abriu a panela de arroz e começou a servir as meninas.</w:t>
       </w:r>
     </w:p>
     <w:p>
@@ -6835,7 +6848,17 @@
     </w:p>
     <w:p>
       <w:r>
-        <w:t xml:space="preserve">Foi o ano em que eu marquei terapia. O ano em que eu disse a uma mulher desconhecida, numa tela, que a minha vida era simples e comum e que eu estava cansada. O ano em que a minha mãe me mandou, pelo celular, a foto de uma menina de franja reta segurando a barra do vestido.</w:t>
+        <w:t xml:space="preserve">Eu não marquei terapia por causa do dragão. Marquei por causa de uma porta.</w:t>
+      </w:r>
+    </w:p>
+    <w:p>
+      <w:r>
+        <w:t xml:space="preserve">Desde aquela madrugada de novembro, eu não conseguia tirar da cabeça a Ayumi parada no batente da cozinha, de pijama, com os braços cruzados de frio, esperando. E eu terminando de digitar a frase para o cliente. Ela tinha voltado para a cama sem dizer nada, e na manhã seguinte não tocou no assunto, e eu também não, e o assunto ficou morando entre nós duas, no café da manhã, no carro da escola, na hora do banho, como um móvel que ninguém tira do lugar. Numa noite de janeiro, depois de buscar as três na casa de uma amiga e ouvir a Ayumi dizer para a Tiemi, no banco de trás, "não chama a mamãe, ela está trabalhando", eu estacionei na garagem, fiquei um tempo com as mãos no volante e, antes de descer, procurei no celular uma terapeuta brasileira que atendesse online.</w:t>
+      </w:r>
+    </w:p>
+    <w:p>
+      <w:r>
+        <w:t xml:space="preserve">Foi o ano em que eu disse a uma mulher desconhecida, numa tela, que a minha vida era simples e comum e que eu estava cansada. O ano em que a minha mãe me mandou, pelo celular, a foto de uma menina de franja reta segurando a barra do vestido.</w:t>
       </w:r>
     </w:p>
     <w:p>
@@ -7149,7 +7172,41 @@
     </w:p>
     <w:p>
       <w:r>
-        <w:t xml:space="preserve">O Kousuke não perguntou por quê. Depois de quinze anos, ele tinha parado de perguntar por quê. Perguntou só a que horas tinha de sair de casa.</w:t>
+        <w:t xml:space="preserve">Só contei ao Kousuke depois de marcar. Ele não perguntou por quê. Depois de quase vinte anos, ele tinha parado de perguntar por quê. Perguntou só a que horas tinha de sair de casa.</w:t>
+      </w:r>
+    </w:p>
+    <w:p>
+      <w:r>
+        <w:t xml:space="preserve">No carro, a caminho, ele dirigiu calado. A Tiemi dormia na cadeirinha, de boca aberta, com o gorro rosa caído sobre um olho. Eu passei a primeira hora respondendo mensagens de clientes e a segunda falando sobre uma ideia nova, uma empresa só minha, que eu queria abrir naquele ano. Falei de nome, de logotipo, de sala comercial. Ele ouvia, com as duas mãos no volante, olhando a estrada.</w:t>
+      </w:r>
+    </w:p>
+    <w:p>
+      <w:pPr>
+        <w:ind w:firstLine="0"/>
+      </w:pPr>
+      <w:r>
+        <w:t xml:space="preserve">— E aí? — perguntei. — O que você acha?</w:t>
+      </w:r>
+    </w:p>
+    <w:p>
+      <w:pPr>
+        <w:ind w:firstLine="0"/>
+      </w:pPr>
+      <w:r>
+        <w:t xml:space="preserve">Ele demorou.</w:t>
+      </w:r>
+    </w:p>
+    <w:p>
+      <w:pPr>
+        <w:ind w:firstLine="0"/>
+      </w:pPr>
+      <w:r>
+        <w:t xml:space="preserve">— Acho que você já decidiu.</w:t>
+      </w:r>
+    </w:p>
+    <w:p>
+      <w:r>
+        <w:t xml:space="preserve">Ele disse sem raiva, do jeito que dizia o saldo da última linha da planilha. Eu olhei pela janela os campos passando, cinzentos de geada, e não disse mais nada até o campo de pouso.</w:t>
       </w:r>
     </w:p>
     <w:p>
@@ -7372,42 +7429,27 @@
     </w:p>
     <w:p>
       <w:r>
-        <w:t xml:space="preserve">Ela tinha visto o pai montando. O Kousuke tinha comprado um cubo para ele mesmo, sem motivo, numa loja de conveniência, e aprendido sozinho em poucos dias, com vídeos, anotando os movimentos num caderninho com a letra pequena de quem faz planilha. A Mity ficou olhando por cima do ombro dele, na mesa da sala, e no dia seguinte pediu um cubo também.</w:t>
-      </w:r>
-    </w:p>
-    <w:p>
-      <w:r>
-        <w:t xml:space="preserve">Ela tentava depois da escola, no sofá, com a língua de fora no canto da boca. Girava, girava, conseguia uma face, às vezes duas, e na terceira tudo desmontava. Ela bufava. Jogava o cubo nas almofadas. Pegava de novo. No fim da terceira semana, jogou o cubo na parede, e o cubo quicou e rolou para baixo da televisão, e ela foi para o quarto e fechou a porta.</w:t>
-      </w:r>
-    </w:p>
-    <w:p>
-      <w:r>
-        <w:t xml:space="preserve">Naquela noite, eu acordei às três da manhã para ir ao banheiro e vi a luz da sala acesa.</w:t>
-      </w:r>
-    </w:p>
-    <w:p>
-      <w:r>
-        <w:t xml:space="preserve">O Kousuke estava sentado no chão, de pijama, com o notebook aberto num vídeo, sem som, e o cubo da Mity nas mãos. Tinha resgatado o cubo de baixo da televisão. Estava montando. Não o dele; o dela, o que ela tinha jogado na parede. Girava devagar, conferia no vídeo, girava de novo. Eu fiquei na porta. Ele não me viu.</w:t>
-      </w:r>
-    </w:p>
-    <w:p>
-      <w:r>
-        <w:t xml:space="preserve">Quando terminou, pôs o cubo montado em cima da mesa da sala, no lugar exato onde a Mity sentava para tomar café, e foi dormir sem dizer nada.</w:t>
-      </w:r>
-    </w:p>
-    <w:p>
-      <w:r>
-        <w:t xml:space="preserve">De manhã, a Mity viu o cubo. Olhou para ele um tempo. Olhou para o pai, que estava na cozinha fingindo que procurava o açúcar. Não disse nada. Desmontou o cubo inteiro, girando com força, e começou de novo.</w:t>
-      </w:r>
-    </w:p>
-    <w:p>
-      <w:r>
-        <w:t xml:space="preserve">Em menos de uma semana, ela montava em um minuto. Depois em menos. A Ayumi, vendo a irmã, quis aprender também, e aprendeu, depois de muito brigar com o cubo. A Tiemi, vendo as duas, pediu um. Ela tinha dois anos e montava no nível mais fácil de todos, o de criança pequena, uma cor por vez, e cada vez que terminava levantava o cubo acima da cabeça e gritava, como quem ganhou uma copa do mundo.</w:t>
-      </w:r>
-    </w:p>
-    <w:p>
-      <w:r>
-        <w:t xml:space="preserve">Eu assisti a tudo isso da porta. Era a única coisa da casa que eu assistia inteira naquele ano.</w:t>
+        <w:t xml:space="preserve">Ela tinha visto o pai montando. O Kousuke tinha comprado um cubo para ele mesmo, sem motivo, numa loja de conveniência, e aprendido sozinho em poucos dias, com vídeos, anotando os movimentos num caderninho com a letra pequena de quem faz planilha. A Mity ficou olhando por cima do ombro dele e, no dia seguinte, pediu um cubo também. Tentava depois da escola, no sofá, com a língua no canto da boca. Conseguia uma face, às vezes duas, e na terceira tudo desmontava. No fim da terceira semana, jogou o cubo na parede. O cubo quicou, rolou para baixo da televisão, e ela foi para o quarto e fechou a porta.</w:t>
+      </w:r>
+    </w:p>
+    <w:p>
+      <w:r>
+        <w:t xml:space="preserve">Naquela noite, eu acordei às três da manhã e vi a luz da sala acesa.</w:t>
+      </w:r>
+    </w:p>
+    <w:p>
+      <w:r>
+        <w:t xml:space="preserve">O Kousuke estava sentado no chão, de pijama, com o notebook aberto num vídeo sem som e o cubo da Mity nas mãos. Tinha resgatado o cubo de baixo da televisão. Girava devagar, conferia no vídeo, girava de novo. Eu fiquei na porta. Ele não me viu. Quando terminou, pôs o cubo montado em cima da mesa, no lugar exato onde a Mity sentava para tomar café, e foi dormir sem dizer nada.</w:t>
+      </w:r>
+    </w:p>
+    <w:p>
+      <w:r>
+        <w:t xml:space="preserve">De manhã, a Mity viu o cubo. Olhou para o pai, que fingia procurar o açúcar. Não disse nada. Desmontou o cubo inteiro, girando com força, e começou de novo. Em menos de uma semana, montava em um minuto. A Ayumi aprendeu depois, brigando com o cubo. A Tiemi, com dois anos, pediu um e montava no nível mais fácil, uma cor por vez, e levantava o cubo acima da cabeça gritando como quem ganhou uma copa do mundo.</w:t>
+      </w:r>
+    </w:p>
+    <w:p>
+      <w:r>
+        <w:t xml:space="preserve">Eu assisti a tudo da porta. Foi a única coisa daquela casa que eu assisti inteira naquele ano.</w:t>
       </w:r>
     </w:p>
     <w:p>
@@ -7430,12 +7472,17 @@
     </w:p>
     <w:p>
       <w:r>
-        <w:t xml:space="preserve">Oito países. Cursos, imersões, eventos, gente nova, cidades que eu nunca tinha imaginado conhecer. O começo de uma empresa nova. Metas tomando forma, sonhos ganhando corpo, fotos bonitas em todos os lugares. E, por trás das fotos, uma casa em que o Kousuke e eu tínhamos voltado a ser sócios, só que agora sócios cansados, que não tinham mais nem assunto de trabalho para conversar no jantar, porque o assunto era tanto que já estava tudo combinado por mensagem.</w:t>
-      </w:r>
-    </w:p>
-    <w:p>
-      <w:r>
-        <w:t xml:space="preserve">Não houve uma briga grande. Houve muitas pequenas, feitas daquela matéria que eu conhecia desde o recado da estatística. Eu tinha razão. Eu sempre tinha razão. Eu sabia exatamente o que ele devia fazer, como devia fazer, quando. Quando ele discordava, eu não ouvia; esperava ele terminar para dizer de novo o que eu já tinha dito. Eu, que tinha passado a terapia inteira descobrindo o quanto eu carregava todo mundo, ainda não tinha descoberto o quanto eu pesava em cima de quem estava do meu lado.</w:t>
+        <w:t xml:space="preserve">Oito países. Cursos, imersões, eventos, fotos bonitas em todos os lugares. E uma empresa nova, só minha, que eu comecei a montar no meio do ano, sem pedir licença a ninguém, com a mesma certeza com que tinha comprado o curso de oito mil reais às duas da manhã. Quando eu quero, eu quero. E agora.</w:t>
+      </w:r>
+    </w:p>
+    <w:p>
+      <w:r>
+        <w:t xml:space="preserve">Em outubro, eu assinei o contrato de aluguel de uma sala comercial para essa empresa. Uma sala pequena, clara, no segundo andar de um prédio perto da estação. Assinei numa terça-feira, com o carimbo que eu tinha finalmente aprendido a usar, e deixei a cópia do contrato no porta-luvas do carro, porque ia contar ao Kousuke no fim de semana, quando tivesse tempo.</w:t>
+      </w:r>
+    </w:p>
+    <w:p>
+      <w:r>
+        <w:t xml:space="preserve">Ele achou o contrato na quinta, procurando o recibo do pedágio.</w:t>
       </w:r>
     </w:p>
     <w:p>
@@ -7453,22 +7500,242 @@
         <w:ind w:firstLine="0"/>
       </w:pPr>
       <w:r>
-        <w:t xml:space="preserve">Em novembro, eu fui ao Brasil para um curso, sozinha.</w:t>
-      </w:r>
-    </w:p>
-    <w:p>
-      <w:r>
-        <w:t xml:space="preserve">Uma amiga da igreja, a Lê, ficou com as meninas. O Kousuke disse que tudo bem, com a mesma voz com que dizia "tudo bem" no tempo do "então escolhe". Eu embarquei com a sensação de quem sai de casa brigada e finge que não.</w:t>
-      </w:r>
-    </w:p>
-    <w:p>
-      <w:r>
-        <w:t xml:space="preserve">No último fim de semana, eu fui para a casa da minha mãe.</w:t>
-      </w:r>
-    </w:p>
-    <w:p>
-      <w:r>
-        <w:t xml:space="preserve">Ela estava na cozinha, de avental, fazendo nishime numa panela grande, e o Marcos estava sentado à mesa, tomando café, com a mesma cara de quando era menino e esperava o pudim. Eu cheguei falando. Falei do curso, das coisas que eu tinha aprendido, das coisas que eu ia mudar, do que o Kousuke devia entender, do que o Kousuke não entendia, do que eu tinha feito e ele não. Falei por uns vinte minutos, sem parar, enquanto minha mãe mexia a panela e o Marcos mexia o café.</w:t>
+        <w:t xml:space="preserve">Eu estava na cozinha quando ele entrou com o papel na mão. As meninas dormiam. A louça do jantar estava na pia, esperando. Ele pôs o contrato em cima da mesa, alisou a dobra com a palma da mão, e ficou de pé, olhando para ele.</w:t>
+      </w:r>
+    </w:p>
+    <w:p>
+      <w:pPr>
+        <w:ind w:firstLine="0"/>
+      </w:pPr>
+      <w:r>
+        <w:t xml:space="preserve">— Quando você ia me contar?</w:t>
+      </w:r>
+    </w:p>
+    <w:p>
+      <w:pPr>
+        <w:ind w:firstLine="0"/>
+      </w:pPr>
+      <w:r>
+        <w:t xml:space="preserve">— No sábado.</w:t>
+      </w:r>
+    </w:p>
+    <w:p>
+      <w:pPr>
+        <w:ind w:firstLine="0"/>
+      </w:pPr>
+      <w:r>
+        <w:t xml:space="preserve">— Você assinou na terça.</w:t>
+      </w:r>
+    </w:p>
+    <w:p>
+      <w:pPr>
+        <w:ind w:firstLine="0"/>
+      </w:pPr>
+      <w:r>
+        <w:t xml:space="preserve">— Eu estava sem tempo, Kousuke. Você sabe como foi a semana.</w:t>
+      </w:r>
+    </w:p>
+    <w:p>
+      <w:pPr>
+        <w:ind w:firstLine="0"/>
+      </w:pPr>
+      <w:r>
+        <w:t xml:space="preserve">— Eu sei como foi a semana. Eu estava nela.</w:t>
+      </w:r>
+    </w:p>
+    <w:p>
+      <w:r>
+        <w:t xml:space="preserve">Eu comecei a explicar. Tinha a explicação pronta, como sempre: o preço bom, a localização, o prazo curto, a oportunidade que não ia esperar, a planilha que eu mesma tinha feito e que fechava. Falei sem parar, com a voz subindo, do jeito que eu falava no tempo do recado de estatística. Ele deixou eu falar. Sempre deixava.</w:t>
+      </w:r>
+    </w:p>
+    <w:p>
+      <w:pPr>
+        <w:ind w:firstLine="0"/>
+      </w:pPr>
+      <w:r>
+        <w:t xml:space="preserve">Quando eu parei, ele não respondeu nada sobre a sala.</w:t>
+      </w:r>
+    </w:p>
+    <w:p>
+      <w:pPr>
+        <w:ind w:firstLine="0"/>
+      </w:pPr>
+      <w:r>
+        <w:t xml:space="preserve">— Sabe o que eu fiz a vida inteira, Lu?</w:t>
+      </w:r>
+    </w:p>
+    <w:p>
+      <w:pPr>
+        <w:ind w:firstLine="0"/>
+      </w:pPr>
+      <w:r>
+        <w:t xml:space="preserve">Eu não respondi.</w:t>
+      </w:r>
+    </w:p>
+    <w:p>
+      <w:pPr>
+        <w:ind w:firstLine="0"/>
+      </w:pPr>
+      <w:r>
+        <w:t xml:space="preserve">— Andei dez passos atrás de você. — Ele disse devagar, sem levantar a voz. — Desde a praça da matriz. Você ia na frente, sozinha, e eu ia atrás, para você não andar sozinha. E eu achava bonito. Eu achava que era isso que eu tinha que fazer.</w:t>
+      </w:r>
+    </w:p>
+    <w:p>
+      <w:pPr>
+        <w:ind w:firstLine="0"/>
+      </w:pPr>
+      <w:r>
+        <w:t xml:space="preserve">— E não era?</w:t>
+      </w:r>
+    </w:p>
+    <w:p>
+      <w:pPr>
+        <w:ind w:firstLine="0"/>
+      </w:pPr>
+      <w:r>
+        <w:t xml:space="preserve">— Eu cansei, Lu. — Ele pôs as duas mãos na mesa, dos dois lados do contrato. — Eu cansei de andar atrás. Eu queria andar do lado. Você não deixa. Você nunca deixou ninguém fazer nada por você. Nem eu.</w:t>
+      </w:r>
+    </w:p>
+    <w:p>
+      <w:r>
+        <w:t xml:space="preserve">Eu abri a boca e a resposta que saiu foi a errada. Saiu a lista. O que eu tinha feito, por quem, quando. O pai, a mãe, as meninas, a fábrica, a empresa, os clientes às duas da manhã. Eu listei tudo, com os dedos, como quem apresenta prova num tribunal.</w:t>
+      </w:r>
+    </w:p>
+    <w:p>
+      <w:r>
+        <w:t xml:space="preserve">Ele ouviu até o fim. Depois pegou um travesseiro no quarto e foi dormir no sofá.</w:t>
+      </w:r>
+    </w:p>
+    <w:p>
+      <w:r>
+        <w:t xml:space="preserve">Nas semanas seguintes, a gente continuou trabalhando junto. Continuou respondendo cliente, levando as meninas na escola, jantando na mesma mesa. Mas falava só o necessário, pelo celular, mesmo estando na mesma casa. Em novembro, eu comprei uma passagem para o Brasil, para um curso de uma semana em São Paulo. Contei a ele depois de comprar. Ele disse "tudo bem", com a mesma voz com que tinha dito "tudo bem" no tempo do "então escolhe". Uma amiga da igreja, a Lê, ficou com as meninas.</w:t>
+      </w:r>
+    </w:p>
+    <w:p>
+      <w:r>
+        <w:t xml:space="preserve">Eu embarquei com a sensação de quem sai de casa brigada e finge que está só viajando. Não pensei, na hora, que já tinha feito aquilo uma vez, no estacionamento de um supermercado, com duas meninas dormindo no banco de trás.</w:t>
+      </w:r>
+    </w:p>
+    <w:p>
+      <w:pPr>
+        <w:spacing w:before="240" w:after="240"/>
+        <w:ind w:firstLine="0"/>
+        <w:jc w:val="center"/>
+      </w:pPr>
+      <w:r>
+        <w:t xml:space="preserve">*</w:t>
+      </w:r>
+    </w:p>
+    <w:p>
+      <w:pPr>
+        <w:ind w:firstLine="0"/>
+      </w:pPr>
+      <w:r>
+        <w:t xml:space="preserve">No sábado depois do curso, fui ver meu pai.</w:t>
+      </w:r>
+    </w:p>
+    <w:p>
+      <w:r>
+        <w:t xml:space="preserve">Ele morava sozinho num apartamento pequeno, no térreo, com uma janela que dava para uma árvore e não para a parede de outro prédio. Tinha setenta e poucos anos, o cabelo todo branco, ainda penteado de lado, os óculos de sempre, a camisa com um botão a mais aberto. Abriu a porta e ficou me olhando, como no dia em que acordou na UTI, como quem confere se aquilo é mesmo quem ele acha que é.</w:t>
+      </w:r>
+    </w:p>
+    <w:p>
+      <w:r>
+        <w:t xml:space="preserve">Na estante da sala, entre uns porta-retratos e um rádio de pilha, estava a caneca branca de asa colada.</w:t>
+      </w:r>
+    </w:p>
+    <w:p>
+      <w:pPr>
+        <w:ind w:firstLine="0"/>
+      </w:pPr>
+      <w:r>
+        <w:t xml:space="preserve">— O senhor ainda tem isso?</w:t>
+      </w:r>
+    </w:p>
+    <w:p>
+      <w:pPr>
+        <w:ind w:firstLine="0"/>
+      </w:pPr>
+      <w:r>
+        <w:t xml:space="preserve">— Colei de novo umas duas vezes. — Ele pegou a caneca e virou, mostrando as marcas amarelas da cola na asa. — Sua mãe queria jogar fora. Eu não deixei.</w:t>
+      </w:r>
+    </w:p>
+    <w:p>
+      <w:r>
+        <w:t xml:space="preserve">Ele fez café e me serviu na caneca. Depois pegou o celular, pôs os óculos na ponta do nariz e, com o dedo indicador, devagar, procurou alguma coisa. Me mostrou. Era o vídeo do bungee de Gifu, que eu tinha postado dois anos antes: eu de macacão vermelho, caindo e gritando.</w:t>
+      </w:r>
+    </w:p>
+    <w:p>
+      <w:pPr>
+        <w:ind w:firstLine="0"/>
+      </w:pPr>
+      <w:r>
+        <w:t xml:space="preserve">— Eu vejo isso de vez em quando — disse ele. — Você grita o tempo inteiro.</w:t>
+      </w:r>
+    </w:p>
+    <w:p>
+      <w:pPr>
+        <w:ind w:firstLine="0"/>
+      </w:pPr>
+      <w:r>
+        <w:t xml:space="preserve">— Grito.</w:t>
+      </w:r>
+    </w:p>
+    <w:p>
+      <w:pPr>
+        <w:ind w:firstLine="0"/>
+      </w:pPr>
+      <w:r>
+        <w:t xml:space="preserve">— Puxou a minha mãe. — Ele riu com os ombros, sem som, do jeito de sempre. — Ela também não parava de gritar quando ficava brava.</w:t>
+      </w:r>
+    </w:p>
+    <w:p>
+      <w:r>
+        <w:t xml:space="preserve">Eu ri também. Depois ele perguntou do Kousuke, e eu disse que estava tudo ótimo. Ele ficou me olhando por cima dos óculos um tempo, com a caneca na mão.</w:t>
+      </w:r>
+    </w:p>
+    <w:p>
+      <w:pPr>
+        <w:ind w:firstLine="0"/>
+      </w:pPr>
+      <w:r>
+        <w:t xml:space="preserve">— Filha. Eu passei trinta dias num monte. — Pôs a caneca na mesinha. — Lá ninguém dizia que estava tudo ótimo.</w:t>
+      </w:r>
+    </w:p>
+    <w:p>
+      <w:r>
+        <w:t xml:space="preserve">Eu não respondi. Ele também não disse mais nada sobre isso. Na saída, na porta, me deu um abraço curto, meio de lado, e disse para eu passar na casa da minha mãe antes de voltar.</w:t>
+      </w:r>
+    </w:p>
+    <w:p>
+      <w:pPr>
+        <w:ind w:firstLine="0"/>
+      </w:pPr>
+      <w:r>
+        <w:t xml:space="preserve">— E deixa ela falar — disse. — Você nunca deixa ninguém falar.</w:t>
+      </w:r>
+    </w:p>
+    <w:p>
+      <w:pPr>
+        <w:spacing w:before="240" w:after="240"/>
+        <w:ind w:firstLine="0"/>
+        <w:jc w:val="center"/>
+      </w:pPr>
+      <w:r>
+        <w:t xml:space="preserve">*</w:t>
+      </w:r>
+    </w:p>
+    <w:p>
+      <w:pPr>
+        <w:ind w:firstLine="0"/>
+      </w:pPr>
+      <w:r>
+        <w:t xml:space="preserve">Minha mãe estava na cozinha, de avental, fazendo nishime numa panela grande. O Marcos estava sentado à mesa, tomando café, com a mesma cara de quando era menino e esperava o pudim.</w:t>
+      </w:r>
+    </w:p>
+    <w:p>
+      <w:r>
+        <w:t xml:space="preserve">Eu cheguei falando. Falei do curso, das coisas que eu ia mudar, do que o Kousuke devia entender, do que o Kousuke não entendia, da sala, do contrato, do travesseiro no sofá. Falei vinte minutos sem parar, enquanto minha mãe mexia a panela e o Marcos mexia o café.</w:t>
       </w:r>
     </w:p>
     <w:p>
@@ -7489,14 +7756,6 @@
         <w:ind w:firstLine="0"/>
       </w:pPr>
       <w:r>
-        <w:t xml:space="preserve">Eu ri.</w:t>
-      </w:r>
-    </w:p>
-    <w:p>
-      <w:pPr>
-        <w:ind w:firstLine="0"/>
-      </w:pPr>
-      <w:r>
         <w:t xml:space="preserve">— Eu erro. Todo mundo erra.</w:t>
       </w:r>
     </w:p>
@@ -7505,51 +7764,104 @@
         <w:ind w:firstLine="0"/>
       </w:pPr>
       <w:r>
-        <w:t xml:space="preserve">— Não. Estou falando sério. — Ele não estava rindo. — Você fala do Kousuke há vinte minutos. Você não falou uma vez de você.</w:t>
-      </w:r>
-    </w:p>
-    <w:p>
-      <w:r>
-        <w:t xml:space="preserve">Eu olhei para a minha mãe, esperando que ela me defendesse. Ela continuou mexendo a panela. Depois tirou a colher de pau, bateu duas vezes na borda, tampou a panela e se virou para mim, enxugando as mãos no avental, com a mesma cara com que olhava um número errado numa ficha.</w:t>
-      </w:r>
-    </w:p>
-    <w:p>
-      <w:pPr>
-        <w:ind w:firstLine="0"/>
-      </w:pPr>
-      <w:r>
-        <w:t xml:space="preserve">— Filha. Você é orgulhosa.</w:t>
-      </w:r>
-    </w:p>
-    <w:p>
-      <w:pPr>
-        <w:ind w:firstLine="0"/>
-      </w:pPr>
-      <w:r>
-        <w:t xml:space="preserve">— Mãe…</w:t>
-      </w:r>
-    </w:p>
-    <w:p>
-      <w:pPr>
-        <w:ind w:firstLine="0"/>
-      </w:pPr>
-      <w:r>
-        <w:t xml:space="preserve">— Você é igualzinha a mim. — Ela disse sem raiva, quase com carinho. — Eu também sou. Seu pai também é. Pessoa orgulhosa acha que está se protegendo, e só está se escondendo.</w:t>
-      </w:r>
-    </w:p>
-    <w:p>
-      <w:r>
-        <w:t xml:space="preserve">Eu quis responder. Tinha a resposta pronta, como sempre. Abri a boca, e o que saiu não foi a resposta.</w:t>
-      </w:r>
-    </w:p>
-    <w:p>
-      <w:r>
-        <w:t xml:space="preserve">Foi um choro. O choro que eu não tinha tido na sala do infarto, no corredor do hospital, no banheiro do tablet, no estacionamento do aeroporto. Veio de uma vez, sentada na cozinha da minha mãe, com o cheiro do nishime, na frente do meu irmão, que não sabia o que fazer com as mãos e acabou pondo uma delas no meu ombro, desajeitado, como o Kousuke tinha feito no futon do primeiro Japão.</w:t>
-      </w:r>
-    </w:p>
-    <w:p>
-      <w:r>
-        <w:t xml:space="preserve">Minha mãe não me abraçou. Pôs uma xícara de café na minha frente, com açúcar, do jeito que eu tomava aos quinze anos, e sentou do outro lado da mesa.</w:t>
+        <w:t xml:space="preserve">— Você falou do Kousuke vinte minutos. Não falou uma vez de você.</w:t>
+      </w:r>
+    </w:p>
+    <w:p>
+      <w:r>
+        <w:t xml:space="preserve">Eu olhei para a minha mãe, esperando que ela me defendesse. Ela tampou a panela, bateu a colher de pau duas vezes na borda, enxugou as mãos no avental e sentou do outro lado da mesa.</w:t>
+      </w:r>
+    </w:p>
+    <w:p>
+      <w:pPr>
+        <w:ind w:firstLine="0"/>
+      </w:pPr>
+      <w:r>
+        <w:t xml:space="preserve">— Filha. Lembra do hospital, lá no Japão? Do dia da cirurgia?</w:t>
+      </w:r>
+    </w:p>
+    <w:p>
+      <w:pPr>
+        <w:ind w:firstLine="0"/>
+      </w:pPr>
+      <w:r>
+        <w:t xml:space="preserve">— Lembro.</w:t>
+      </w:r>
+    </w:p>
+    <w:p>
+      <w:pPr>
+        <w:ind w:firstLine="0"/>
+      </w:pPr>
+      <w:r>
+        <w:t xml:space="preserve">— Você me disse que tinha sido tudo ótimo.</w:t>
+      </w:r>
+    </w:p>
+    <w:p>
+      <w:r>
+        <w:t xml:space="preserve">Eu senti o chão da cozinha inclinar, como o pátio do pré.</w:t>
+      </w:r>
+    </w:p>
+    <w:p>
+      <w:pPr>
+        <w:ind w:firstLine="0"/>
+      </w:pPr>
+      <w:r>
+        <w:t xml:space="preserve">— A senhora lembra disso?</w:t>
+      </w:r>
+    </w:p>
+    <w:p>
+      <w:pPr>
+        <w:ind w:firstLine="0"/>
+      </w:pPr>
+      <w:r>
+        <w:t xml:space="preserve">— Naquela noite, o médico passou no quarto e falou com a enfermeira do lado da minha cama, achando que eu estava dormindo. — Ela disse sem mágoa, arrumando a toalha da mesa com a mão, como quem alisa um lençol. — Japonês eu entendo mais do que vocês pensam. Cresci ouvindo minha mãe brigar com meu pai nessa língua.</w:t>
+      </w:r>
+    </w:p>
+    <w:p>
+      <w:pPr>
+        <w:ind w:firstLine="0"/>
+      </w:pPr>
+      <w:r>
+        <w:t xml:space="preserve">— A senhora sabia?</w:t>
+      </w:r>
+    </w:p>
+    <w:p>
+      <w:pPr>
+        <w:ind w:firstLine="0"/>
+      </w:pPr>
+      <w:r>
+        <w:t xml:space="preserve">— Mãe sabe.</w:t>
+      </w:r>
+    </w:p>
+    <w:p>
+      <w:pPr>
+        <w:ind w:firstLine="0"/>
+      </w:pPr>
+      <w:r>
+        <w:t xml:space="preserve">— E por que a senhora não disse nada?</w:t>
+      </w:r>
+    </w:p>
+    <w:p>
+      <w:pPr>
+        <w:ind w:firstLine="0"/>
+      </w:pPr>
+      <w:r>
+        <w:t xml:space="preserve">— Porque você precisava que tivesse sido ótimo. E eu também. — Ela deu de ombros. — Você é orgulhosa, filha. Igualzinha a mim. Pessoa orgulhosa acha que está se protegendo, e só está se escondendo.</w:t>
+      </w:r>
+    </w:p>
+    <w:p>
+      <w:r>
+        <w:t xml:space="preserve">Eu quis responder. Tinha a resposta pronta. Abri a boca e o que saiu foi o choro.</w:t>
+      </w:r>
+    </w:p>
+    <w:p>
+      <w:r>
+        <w:t xml:space="preserve">O choro que eu não tinha tido na sala do infarto, no corredor do pronto-socorro, no banheiro do hospital japonês, no estacionamento do aeroporto. Veio de uma vez, sentada na cozinha da minha mãe, com o cheiro do nishime, na frente do meu irmão, que não sabia o que fazer com as mãos e acabou pondo uma delas no meu ombro, desajeitado, pesada, do jeito que o Kousuke punha a mão nas minhas costas no futon do primeiro Japão.</w:t>
+      </w:r>
+    </w:p>
+    <w:p>
+      <w:r>
+        <w:t xml:space="preserve">Minha mãe não me abraçou. Pôs uma xícara de café na minha frente, com açúcar, do jeito que eu tomava aos quinze anos, e ficou sentada do outro lado da mesa, olhando para mim com aquela cara do hospital.</w:t>
       </w:r>
     </w:p>
     <w:p>
@@ -7567,27 +7879,22 @@
         <w:ind w:firstLine="0"/>
       </w:pPr>
       <w:r>
-        <w:t xml:space="preserve">Eu voltei para o Japão na semana do Natal.</w:t>
-      </w:r>
-    </w:p>
-    <w:p>
-      <w:r>
-        <w:t xml:space="preserve">No avião, não dormi. Fiquei olhando o mapa na telinha, o aviãozinho branco atravessando o oceano devagar, e pensando no que eu ia dizer. Tinha feito isso a vida inteira: ensaiar. Ensaiar a primeira frase para a porta automática. Ensaiar a briga na véspera do carregador. Ensaiar o que dizer ao médico. Dessa vez, eu ensaiava e desmontava, como a Mity com o cubo, e começava de novo.</w:t>
-      </w:r>
-    </w:p>
-    <w:p>
-      <w:r>
-        <w:t xml:space="preserve">No saguão de desembarque do aeroporto de Chūbu, tinha uma árvore de Natal enorme, com luzes brancas e bolas douradas, e um coral de crianças japonesas cantando uma música natalina em inglês.</w:t>
-      </w:r>
-    </w:p>
-    <w:p>
-      <w:r>
-        <w:t xml:space="preserve">Eles estavam do lado da árvore. O Kousuke, com a Tiemi no colo, a franja nos olhos. A Mity e a Ayumi, de casaco, cada uma com um papel na mão escrito "MAMÃE", com canetinha, cada letra de uma cor.</w:t>
-      </w:r>
-    </w:p>
-    <w:p>
-      <w:r>
-        <w:t xml:space="preserve">Eu empurrei o carrinho da mala até eles, e parei na frente do Kousuke, e todo o ensaio foi embora.</w:t>
+        <w:t xml:space="preserve">Voltei para o Japão na semana do Natal.</w:t>
+      </w:r>
+    </w:p>
+    <w:p>
+      <w:r>
+        <w:t xml:space="preserve">No avião, não dormi. Fiquei olhando o aviãozinho branco atravessar o oceano na telinha e ensaiando o que ia dizer. Ensaiava e desmontava, como a Mity com o cubo, e começava de novo.</w:t>
+      </w:r>
+    </w:p>
+    <w:p>
+      <w:r>
+        <w:t xml:space="preserve">No saguão de desembarque do aeroporto de Chūbu tinha uma árvore de Natal enorme, com luzes brancas, e um coral de crianças japonesas cantando uma música natalina em inglês. Eles estavam do lado da árvore. O Kousuke, com a Tiemi no colo, a franja nos olhos. A Mity e a Ayumi, de casaco, cada uma com um papel escrito MAMÃE, cada letra de uma cor.</w:t>
+      </w:r>
+    </w:p>
+    <w:p>
+      <w:r>
+        <w:t xml:space="preserve">Eu empurrei o carrinho da mala até ele e parei. Todo o ensaio foi embora.</w:t>
       </w:r>
     </w:p>
     <w:p>
@@ -7611,17 +7918,30 @@
         <w:ind w:firstLine="0"/>
       </w:pPr>
       <w:r>
-        <w:t xml:space="preserve">— Eu errei, Momo. Não tem desculpa. Não foi o cansaço, não foi você, não foi o trabalho. Eu errei.</w:t>
-      </w:r>
-    </w:p>
-    <w:p>
-      <w:r>
-        <w:t xml:space="preserve">Ele não disse nada. Pôs a Tiemi no chão, com cuidado, e ela correu para as irmãs. Depois estendeu a mão para mim, a mão aberta, a mesma que tinha segurado o guarda-chuva na praça da matriz e o braço da poltrona do avião em Paris.</w:t>
-      </w:r>
-    </w:p>
-    <w:p>
-      <w:r>
-        <w:t xml:space="preserve">Eu segurei. E, pela primeira vez em muito tempo, não apertei para conferir se estava lá.</w:t>
+        <w:t xml:space="preserve">— Eu errei, Momo. Não tem desculpa. Não foi o cansaço, não foi o trabalho. Eu errei.</w:t>
+      </w:r>
+    </w:p>
+    <w:p>
+      <w:r>
+        <w:t xml:space="preserve">Ele pôs a Tiemi no chão, com cuidado, e ela correu para as irmãs. Ficou um tempo quieto, com as mãos vazias.</w:t>
+      </w:r>
+    </w:p>
+    <w:p>
+      <w:pPr>
+        <w:ind w:firstLine="0"/>
+      </w:pPr>
+      <w:r>
+        <w:t xml:space="preserve">— Eu também — disse ele. — Eu fiquei quieto tempo demais. Eu achei que ficar quieto era ficar.</w:t>
+      </w:r>
+    </w:p>
+    <w:p>
+      <w:r>
+        <w:t xml:space="preserve">Depois estendeu a mão aberta, a mesma do guarda-chuva na praça da matriz e do braço da poltrona do avião em Paris. Eu segurei. Não apertei para conferir se estava lá.</w:t>
+      </w:r>
+    </w:p>
+    <w:p>
+      <w:r>
+        <w:t xml:space="preserve">As meninas foram na frente, correndo, com os papéis na mão. A gente foi atrás delas, empurrando o carrinho da mala, os dois no mesmo passo, e a porta automática do saguão abriu para nós dois ao mesmo tempo.</w:t>
       </w:r>
     </w:p>
     <w:p>
@@ -7770,12 +8090,25 @@
     </w:p>
     <w:p>
       <w:r>
-        <w:t xml:space="preserve">Quando os homens entraram, sujos, cansados, de barba por fazer, com as mochilas nas costas, o salão inteiro levantou. Eu vi o Kousuke procurar alguma coisa com os olhos, por cima das cabeças. Viu o cartaz. Viu as três. E, por cima delas, me viu, lá atrás, encostada na parede. Não acenou. Ficou me olhando um segundo a mais, do jeito que ele olhava na praça da matriz, embaixo do toldo da farmácia, com o guarda-chuva aberto.</w:t>
-      </w:r>
-    </w:p>
-    <w:p>
-      <w:r>
-        <w:t xml:space="preserve">Eu tinha passado anos esperando que ele fosse embora, para confirmar alguma coisa sobre mim. Naquele salão, com os braços cheios de garrafinhas de água, levantei uma delas no ar, como quem levanta um copo num almoço de família, e ele riu de longe.</w:t>
+        <w:t xml:space="preserve">Quando os homens entraram, sujos, cansados, de barba por fazer, com as mochilas nas costas, o salão inteiro levantou. Eu vi o Kousuke procurar alguma coisa com os olhos, por cima das cabeças. Viu o cartaz. Viu as três. E, por cima delas, me viu, lá atrás, encostada na parede, com os braços cheios de garrafinhas de água.</w:t>
+      </w:r>
+    </w:p>
+    <w:p>
+      <w:r>
+        <w:t xml:space="preserve">Ele não foi até as meninas primeiro. Atravessou o salão, desviando das cadeiras, dos balões, das outras famílias, com a mochila ainda nas costas, e parou na minha frente. Cheirava a mato e a quatro dias sem banho. Tirou duas garrafinhas dos meus braços, depois mais uma, até eu ficar com as mãos livres.</w:t>
+      </w:r>
+    </w:p>
+    <w:p>
+      <w:pPr>
+        <w:ind w:firstLine="0"/>
+      </w:pPr>
+      <w:r>
+        <w:t xml:space="preserve">— Vem pra frente — disse.</w:t>
+      </w:r>
+    </w:p>
+    <w:p>
+      <w:r>
+        <w:t xml:space="preserve">Eu fui. A gente atravessou o salão de volta, os dois lado a lado, e parou atrás das meninas, que ainda seguravam o cartaz no alto, com os braços tremendo de cansaço. A Ayumi olhou para trás, viu nós dois juntos, e levantou o cartaz um pouco mais.</w:t>
       </w:r>
     </w:p>
     <w:p>
@@ -7897,7 +8230,25 @@
         <w:ind w:firstLine="0"/>
       </w:pPr>
       <w:r>
-        <w:t xml:space="preserve">— Tá bom — eu disse. — Vem cá.</w:t>
+        <w:t xml:space="preserve">— Já vou — eu disse. — Espera um pouquinho.</w:t>
+      </w:r>
+    </w:p>
+    <w:p>
+      <w:r>
+        <w:t xml:space="preserve">Fui até o quarto. A Ayumi estava sentada no banco do teclado, de costas para a porta, com o cabelo preso num rabo torto e os pés descalços enroscados nas pernas do banco. Não parou de tocar quando eu entrei. Eu não disse nada. Não perguntei da escola, não corrigi a nota, não pedi para ela ir dormir. Sentei na ponta do banco, do lado dela, e fiquei.</w:t>
+      </w:r>
+    </w:p>
+    <w:p>
+      <w:r>
+        <w:t xml:space="preserve">Ela errou a nota de novo. Olhou para mim de lado, esperando alguma coisa. Eu continuei quieta. Ela voltou do começo e, dessa vez, tocou a música inteira sem errar, com o ombro encostado no meu braço. Quando terminou, ficou com as mãos paradas em cima das teclas.</w:t>
+      </w:r>
+    </w:p>
+    <w:p>
+      <w:pPr>
+        <w:ind w:firstLine="0"/>
+      </w:pPr>
+      <w:r>
+        <w:t xml:space="preserve">— Pode ir cortar a franja dela — disse. — Senão ela vai chorar.</w:t>
       </w:r>
     </w:p>
     <w:p>
@@ -7915,7 +8266,7 @@
         <w:ind w:firstLine="0"/>
       </w:pPr>
       <w:r>
-        <w:t xml:space="preserve">Pus um banquinho em cima da cadeira. Enrolei uma toalha de banho no pescoço dela e prendi com um pregador de roupa, que ela achou muito engraçado. Peguei a tesoura na gaveta. Não era tesoura de cabelo; era a da cozinha, a de abrir pacote de arroz. Tesoura de cabelo era coisa de salão.</w:t>
+        <w:t xml:space="preserve">Na cozinha, pus um banquinho em cima da cadeira. Enrolei uma toalha de banho no pescoço dela e prendi com um pregador de roupa, que ela achou muito engraçado. Peguei a tesoura na gaveta. Não era tesoura de cabelo; era a da cozinha, a de abrir pacote de arroz. Tesoura de cabelo era coisa de salão.</w:t>
       </w:r>
     </w:p>
     <w:p>
@@ -7959,8 +8310,16 @@
       </w:r>
     </w:p>
     <w:p>
-      <w:r>
-        <w:t xml:space="preserve">Eu não sabia explicar. Encaixei a tigela na cabeça da Tiemi, que desapareceu da testa para cima e começou a rir por baixo dela, um riso abafado de dentro de uma panela.</w:t>
+      <w:pPr>
+        <w:ind w:firstLine="0"/>
+      </w:pPr>
+      <w:r>
+        <w:t xml:space="preserve">— Porque a sua avó fazia assim comigo.</w:t>
+      </w:r>
+    </w:p>
+    <w:p>
+      <w:r>
+        <w:t xml:space="preserve">E contei, enquanto procurava o jeito certo de segurar a tigela: a tesoura de destrinchar frango, o vestido bufante da costureira da rua de trás, o meu pai rindo com os ombros na porta da cozinha. A Mity fechou o livro com o dedo marcando a página, para ouvir. Encaixei a tigela na cabeça da Tiemi, que desapareceu da testa para cima e começou a rir por baixo dela, um riso abafado de dentro de uma panela.</w:t>
       </w:r>
     </w:p>
     <w:p>

</xml_diff>

<commit_message>
A Menina Elefante: cap. 28, quem monta o cubo às 3h é a Luciana
Correção do autor: a mãe aprende e monta o cubo de madrugada para incentivar
a Mity; o Kousuke compra o curso depois.

Co-Authored-By: Claude Opus 5.5 <noreply@anthropic.com>
Claude-Session: https://claude.ai/code/session_011ZTeK22H8KBNtWenzEUTZE
</commit_message>
<xml_diff>
--- a/menina_elefante/saidas/A_Menina_Elefante_V2.docx
+++ b/menina_elefante/saidas/A_Menina_Elefante_V2.docx
@@ -7429,27 +7429,77 @@
     </w:p>
     <w:p>
       <w:r>
-        <w:t xml:space="preserve">Ela tinha visto o pai montando. O Kousuke tinha comprado um cubo para ele mesmo, sem motivo, numa loja de conveniência, e aprendido sozinho em poucos dias, com vídeos, anotando os movimentos num caderninho com a letra pequena de quem faz planilha. A Mity ficou olhando por cima do ombro dele e, no dia seguinte, pediu um cubo também. Tentava depois da escola, no sofá, com a língua no canto da boca. Conseguia uma face, às vezes duas, e na terceira tudo desmontava. No fim da terceira semana, jogou o cubo na parede. O cubo quicou, rolou para baixo da televisão, e ela foi para o quarto e fechou a porta.</w:t>
-      </w:r>
-    </w:p>
-    <w:p>
-      <w:r>
-        <w:t xml:space="preserve">Naquela noite, eu acordei às três da manhã e vi a luz da sala acesa.</w:t>
-      </w:r>
-    </w:p>
-    <w:p>
-      <w:r>
-        <w:t xml:space="preserve">O Kousuke estava sentado no chão, de pijama, com o notebook aberto num vídeo sem som e o cubo da Mity nas mãos. Tinha resgatado o cubo de baixo da televisão. Girava devagar, conferia no vídeo, girava de novo. Eu fiquei na porta. Ele não me viu. Quando terminou, pôs o cubo montado em cima da mesa, no lugar exato onde a Mity sentava para tomar café, e foi dormir sem dizer nada.</w:t>
-      </w:r>
-    </w:p>
-    <w:p>
-      <w:r>
-        <w:t xml:space="preserve">De manhã, a Mity viu o cubo. Olhou para o pai, que fingia procurar o açúcar. Não disse nada. Desmontou o cubo inteiro, girando com força, e começou de novo. Em menos de uma semana, montava em um minuto. A Ayumi aprendeu depois, brigando com o cubo. A Tiemi, com dois anos, pediu um e montava no nível mais fácil, uma cor por vez, e levantava o cubo acima da cabeça gritando como quem ganhou uma copa do mundo.</w:t>
-      </w:r>
-    </w:p>
-    <w:p>
-      <w:r>
-        <w:t xml:space="preserve">Eu assisti a tudo da porta. Foi a única coisa daquela casa que eu assisti inteira naquele ano.</w:t>
+        <w:t xml:space="preserve">Ela tinha visto o pai montando. O Kousuke tinha comprado um cubo para ele mesmo, sem motivo, numa loja de conveniência, e aprendido em poucos dias, com vídeos, anotando os movimentos num caderninho com a letra pequena de quem faz planilha. A Mity ficou olhando por cima do ombro dele e, no dia seguinte, pediu um cubo também. Tentava depois da escola, no sofá, com a língua no canto da boca. Conseguia uma face, às vezes duas, e na terceira tudo desmontava. O pai explicava de novo, com paciência, e ela bufava. No fim da terceira semana, jogou o cubo nas almofadas e disse que aquilo era impossível, que só o pai conseguia, que ela nunca ia conseguir.</w:t>
+      </w:r>
+    </w:p>
+    <w:p>
+      <w:pPr>
+        <w:ind w:firstLine="0"/>
+      </w:pPr>
+      <w:r>
+        <w:t xml:space="preserve">— Eu também vou aprender — eu disse.</w:t>
+      </w:r>
+    </w:p>
+    <w:p>
+      <w:r>
+        <w:t xml:space="preserve">Ela me olhou de lado, com aquela cara de pré-adolescente que eu tinha aprendido a temer.</w:t>
+      </w:r>
+    </w:p>
+    <w:p>
+      <w:pPr>
+        <w:ind w:firstLine="0"/>
+      </w:pPr>
+      <w:r>
+        <w:t xml:space="preserve">— Você, mãe?</w:t>
+      </w:r>
+    </w:p>
+    <w:p>
+      <w:pPr>
+        <w:ind w:firstLine="0"/>
+      </w:pPr>
+      <w:r>
+        <w:t xml:space="preserve">— Eu.</w:t>
+      </w:r>
+    </w:p>
+    <w:p>
+      <w:r>
+        <w:t xml:space="preserve">Eu não sabia montar nem uma face. Nunca tinha tido paciência para aquilo. Mas naquela noite, depois que as três dormiram, eu peguei o cubo dela nas almofadas, sentei no chão da sala com o celular apoiado na perna e abri um vídeo. Girei, errei, voltei o vídeo, girei de novo. Uma face. Desmontou. Uma face de novo. Duas. Desmontou tudo. O Kousuke passou para beber água à uma da manhã, olhou para mim sentada no chão com o cubo na mão, não disse nada e voltou para a cama.</w:t>
+      </w:r>
+    </w:p>
+    <w:p>
+      <w:r>
+        <w:t xml:space="preserve">Às três da manhã, a última peça encaixou. Seis faces, cada uma de uma cor. Eu fiquei olhando para aquilo nas minhas mãos como tinha olhado o carimbo do zeimusho de Kariya, sem acreditar. Não acordei ninguém. Pus o cubo montado em cima da mesa, no lugar exato onde a Mity sentava para tomar café, e fui dormir.</w:t>
+      </w:r>
+    </w:p>
+    <w:p>
+      <w:r>
+        <w:t xml:space="preserve">De manhã, a Mity viu o cubo. Olhou para ele um tempo. Depois olhou para mim, que fingia procurar o açúcar.</w:t>
+      </w:r>
+    </w:p>
+    <w:p>
+      <w:pPr>
+        <w:ind w:firstLine="0"/>
+      </w:pPr>
+      <w:r>
+        <w:t xml:space="preserve">— Foi você?</w:t>
+      </w:r>
+    </w:p>
+    <w:p>
+      <w:pPr>
+        <w:ind w:firstLine="0"/>
+      </w:pPr>
+      <w:r>
+        <w:t xml:space="preserve">— Às três da manhã.</w:t>
+      </w:r>
+    </w:p>
+    <w:p>
+      <w:r>
+        <w:t xml:space="preserve">Ela não disse nada. Desmontou o cubo inteiro, girando com força, e começou de novo. Naquela mesma semana, o Kousuke comprou para ela um curso de cubo mágico pela internet, e em menos de uma semana ela montava em um minuto. Depois em menos. A Ayumi, vendo a irmã, quis aprender também, e aprendeu, depois de muito brigar com o cubo. A Tiemi, vendo as duas, pediu um. Ela tinha dois anos e montava no nível mais fácil de todos, uma cor por vez, e cada vez que terminava levantava o cubo acima da cabeça e gritava, como quem ganhou uma copa do mundo.</w:t>
+      </w:r>
+    </w:p>
+    <w:p>
+      <w:r>
+        <w:t xml:space="preserve">Foi a única coisa daquele ano em que eu não estava correndo para outro lugar.</w:t>
       </w:r>
     </w:p>
     <w:p>

</xml_diff>

<commit_message>
A Menina Elefante: páginas de destaque e cubo mágico no cap. 29
- 23 frases do próprio texto ganham página inteira de fundo escuro, letra
  grande (Bebas Neue embutida, OFL) e ornamento gerado em Python puro
  (tools/ornamentos.py); lista em manuscrito/destaques.json.
- O cubo mágico sai do cap. 28 e abre o cap. 29, na volta do Brasil.
- Docs e .docx atualizados.

Co-Authored-By: Claude Opus 5.5 <noreply@anthropic.com>
Claude-Session: https://claude.ai/code/session_011ZTeK22H8KBNtWenzEUTZE
</commit_message>
<xml_diff>
--- a/menina_elefante/saidas/A_Menina_Elefante_V2.docx
+++ b/menina_elefante/saidas/A_Menina_Elefante_V2.docx
@@ -247,6 +247,115 @@
     </w:p>
     <w:p>
       <w:pPr>
+        <w:pageBreakBefore/>
+        <w:spacing w:before="0" w:after="0"/>
+        <w:ind w:firstLine="0"/>
+      </w:pPr>
+      <w:r>
+        <w:drawing>
+          <wp:anchor distT="0" distB="0" distL="0" distR="0" simplePos="0" relativeHeight="0" behindDoc="1" locked="1" layoutInCell="1" allowOverlap="1">
+            <wp:simplePos x="0" y="0"/>
+            <wp:positionH relativeFrom="page">
+              <wp:posOffset>0</wp:posOffset>
+            </wp:positionH>
+            <wp:positionV relativeFrom="page">
+              <wp:posOffset>0</wp:posOffset>
+            </wp:positionV>
+            <wp:extent cx="5029200" cy="7772400"/>
+            <wp:effectExtent l="0" t="0" r="0" b="0"/>
+            <wp:wrapNone/>
+            <wp:docPr id="1001" name="Destaque 1001"/>
+            <wp:cNvGraphicFramePr/>
+            <a:graphic xmlns:a="http://schemas.openxmlformats.org/drawingml/2006/main">
+              <a:graphicData uri="http://schemas.openxmlformats.org/drawingml/2006/picture">
+                <pic:pic xmlns:pic="http://schemas.openxmlformats.org/drawingml/2006/picture">
+                  <pic:nvPicPr>
+                    <pic:cNvPr id="1001" name="destaque_relogio_esq.png"/>
+                    <pic:cNvPicPr/>
+                  </pic:nvPicPr>
+                  <pic:blipFill>
+                    <a:blip r:embed="rIdImg1"/>
+                    <a:stretch>
+                      <a:fillRect/>
+                    </a:stretch>
+                  </pic:blipFill>
+                  <pic:spPr>
+                    <a:xfrm>
+                      <a:off x="0" y="0"/>
+                      <a:ext cx="5029200" cy="7772400"/>
+                    </a:xfrm>
+                    <a:prstGeom prst="rect">
+                      <a:avLst/>
+                    </a:prstGeom>
+                  </pic:spPr>
+                </pic:pic>
+              </a:graphicData>
+            </a:graphic>
+          </wp:anchor>
+        </w:drawing>
+      </w:r>
+    </w:p>
+    <w:p>
+      <w:pPr>
+        <w:spacing w:before="900" w:after="0" w:line="1183" w:lineRule="exact"/>
+        <w:ind w:firstLine="0"/>
+        <w:jc w:val="right"/>
+      </w:pPr>
+      <w:r>
+        <w:rPr>
+          <w:rFonts w:ascii="Bebas Neue" w:hAnsi="Bebas Neue" w:cs="Bebas Neue"/>
+          <w:caps/>
+          <w:color w:val="A9A9A4"/>
+          <w:sz w:val="116"/>
+          <w:szCs w:val="116"/>
+        </w:rPr>
+        <w:t xml:space="preserve">VOCÊ ESTÁ COM </w:t>
+      </w:r>
+      <w:r>
+        <w:rPr>
+          <w:rFonts w:ascii="Bebas Neue" w:hAnsi="Bebas Neue" w:cs="Bebas Neue"/>
+          <w:caps/>
+          <w:color w:val="FFFFFF"/>
+          <w:sz w:val="116"/>
+          <w:szCs w:val="116"/>
+        </w:rPr>
+        <w:t xml:space="preserve">PRESSA</w:t>
+      </w:r>
+      <w:r>
+        <w:rPr>
+          <w:rFonts w:ascii="Bebas Neue" w:hAnsi="Bebas Neue" w:cs="Bebas Neue"/>
+          <w:caps/>
+          <w:color w:val="A9A9A4"/>
+          <w:sz w:val="116"/>
+          <w:szCs w:val="116"/>
+        </w:rPr>
+        <w:t xml:space="preserve">?</w:t>
+      </w:r>
+    </w:p>
+    <w:p>
+      <w:pPr>
+        <w:spacing w:before="240" w:after="0"/>
+        <w:ind w:firstLine="0"/>
+        <w:jc w:val="right"/>
+      </w:pPr>
+      <w:r>
+        <w:rPr>
+          <w:rFonts w:ascii="Bebas Neue" w:hAnsi="Bebas Neue"/>
+          <w:caps/>
+          <w:color w:val="A9A9A4"/>
+          <w:spacing w:val="30"/>
+          <w:sz w:val="26"/>
+        </w:rPr>
+        <w:t xml:space="preserve">— A TERAPEUTA</w:t>
+      </w:r>
+    </w:p>
+    <w:p>
+      <w:r>
+        <w:br w:type="page"/>
+      </w:r>
+    </w:p>
+    <w:p>
+      <w:pPr>
         <w:spacing w:before="240" w:after="240"/>
         <w:ind w:firstLine="0"/>
         <w:jc w:val="center"/>
@@ -575,6 +684,115 @@
     </w:p>
     <w:p>
       <w:pPr>
+        <w:pageBreakBefore/>
+        <w:spacing w:before="0" w:after="0"/>
+        <w:ind w:firstLine="0"/>
+      </w:pPr>
+      <w:r>
+        <w:drawing>
+          <wp:anchor distT="0" distB="0" distL="0" distR="0" simplePos="0" relativeHeight="0" behindDoc="1" locked="1" layoutInCell="1" allowOverlap="1">
+            <wp:simplePos x="0" y="0"/>
+            <wp:positionH relativeFrom="page">
+              <wp:posOffset>0</wp:posOffset>
+            </wp:positionH>
+            <wp:positionV relativeFrom="page">
+              <wp:posOffset>0</wp:posOffset>
+            </wp:positionV>
+            <wp:extent cx="5029200" cy="7772400"/>
+            <wp:effectExtent l="0" t="0" r="0" b="0"/>
+            <wp:wrapNone/>
+            <wp:docPr id="1002" name="Destaque 1002"/>
+            <wp:cNvGraphicFramePr/>
+            <a:graphic xmlns:a="http://schemas.openxmlformats.org/drawingml/2006/main">
+              <a:graphicData uri="http://schemas.openxmlformats.org/drawingml/2006/picture">
+                <pic:pic xmlns:pic="http://schemas.openxmlformats.org/drawingml/2006/picture">
+                  <pic:nvPicPr>
+                    <pic:cNvPr id="1002" name="destaque_vinha_dir.png"/>
+                    <pic:cNvPicPr/>
+                  </pic:nvPicPr>
+                  <pic:blipFill>
+                    <a:blip r:embed="rIdImg2"/>
+                    <a:stretch>
+                      <a:fillRect/>
+                    </a:stretch>
+                  </pic:blipFill>
+                  <pic:spPr>
+                    <a:xfrm>
+                      <a:off x="0" y="0"/>
+                      <a:ext cx="5029200" cy="7772400"/>
+                    </a:xfrm>
+                    <a:prstGeom prst="rect">
+                      <a:avLst/>
+                    </a:prstGeom>
+                  </pic:spPr>
+                </pic:pic>
+              </a:graphicData>
+            </a:graphic>
+          </wp:anchor>
+        </w:drawing>
+      </w:r>
+    </w:p>
+    <w:p>
+      <w:pPr>
+        <w:spacing w:before="900" w:after="0" w:line="934" w:lineRule="exact"/>
+        <w:ind w:firstLine="0"/>
+        <w:jc w:val="left"/>
+      </w:pPr>
+      <w:r>
+        <w:rPr>
+          <w:rFonts w:ascii="Bebas Neue" w:hAnsi="Bebas Neue" w:cs="Bebas Neue"/>
+          <w:caps/>
+          <w:color w:val="A9A9A4"/>
+          <w:sz w:val="90"/>
+          <w:szCs w:val="90"/>
+        </w:rPr>
+        <w:t xml:space="preserve">FILHA, NINGUÉM VAI OLHAR PARA A </w:t>
+      </w:r>
+      <w:r>
+        <w:rPr>
+          <w:rFonts w:ascii="Bebas Neue" w:hAnsi="Bebas Neue" w:cs="Bebas Neue"/>
+          <w:caps/>
+          <w:color w:val="FFFFFF"/>
+          <w:sz w:val="90"/>
+          <w:szCs w:val="90"/>
+        </w:rPr>
+        <w:t xml:space="preserve">SUA FRANJA</w:t>
+      </w:r>
+      <w:r>
+        <w:rPr>
+          <w:rFonts w:ascii="Bebas Neue" w:hAnsi="Bebas Neue" w:cs="Bebas Neue"/>
+          <w:caps/>
+          <w:color w:val="A9A9A4"/>
+          <w:sz w:val="90"/>
+          <w:szCs w:val="90"/>
+        </w:rPr>
+        <w:t xml:space="preserve">. VÃO OLHAR PARA O VESTIDO.</w:t>
+      </w:r>
+    </w:p>
+    <w:p>
+      <w:pPr>
+        <w:spacing w:before="240" w:after="0"/>
+        <w:ind w:firstLine="0"/>
+        <w:jc w:val="left"/>
+      </w:pPr>
+      <w:r>
+        <w:rPr>
+          <w:rFonts w:ascii="Bebas Neue" w:hAnsi="Bebas Neue"/>
+          <w:caps/>
+          <w:color w:val="A9A9A4"/>
+          <w:spacing w:val="30"/>
+          <w:sz w:val="26"/>
+        </w:rPr>
+        <w:t xml:space="preserve">— MINHA MÃE</w:t>
+      </w:r>
+    </w:p>
+    <w:p>
+      <w:r>
+        <w:br w:type="page"/>
+      </w:r>
+    </w:p>
+    <w:p>
+      <w:pPr>
         <w:spacing w:before="240" w:after="240"/>
         <w:ind w:firstLine="0"/>
         <w:jc w:val="center"/>
@@ -1006,6 +1224,98 @@
     </w:p>
     <w:p>
       <w:pPr>
+        <w:pageBreakBefore/>
+        <w:spacing w:before="0" w:after="0"/>
+        <w:ind w:firstLine="0"/>
+      </w:pPr>
+      <w:r>
+        <w:drawing>
+          <wp:anchor distT="0" distB="0" distL="0" distR="0" simplePos="0" relativeHeight="0" behindDoc="1" locked="1" layoutInCell="1" allowOverlap="1">
+            <wp:simplePos x="0" y="0"/>
+            <wp:positionH relativeFrom="page">
+              <wp:posOffset>0</wp:posOffset>
+            </wp:positionH>
+            <wp:positionV relativeFrom="page">
+              <wp:posOffset>0</wp:posOffset>
+            </wp:positionV>
+            <wp:extent cx="5029200" cy="7772400"/>
+            <wp:effectExtent l="0" t="0" r="0" b="0"/>
+            <wp:wrapNone/>
+            <wp:docPr id="1003" name="Destaque 1003"/>
+            <wp:cNvGraphicFramePr/>
+            <a:graphic xmlns:a="http://schemas.openxmlformats.org/drawingml/2006/main">
+              <a:graphicData uri="http://schemas.openxmlformats.org/drawingml/2006/picture">
+                <pic:pic xmlns:pic="http://schemas.openxmlformats.org/drawingml/2006/picture">
+                  <pic:nvPicPr>
+                    <pic:cNvPr id="1003" name="destaque_ramo_esq.png"/>
+                    <pic:cNvPicPr/>
+                  </pic:nvPicPr>
+                  <pic:blipFill>
+                    <a:blip r:embed="rIdImg3"/>
+                    <a:stretch>
+                      <a:fillRect/>
+                    </a:stretch>
+                  </pic:blipFill>
+                  <pic:spPr>
+                    <a:xfrm>
+                      <a:off x="0" y="0"/>
+                      <a:ext cx="5029200" cy="7772400"/>
+                    </a:xfrm>
+                    <a:prstGeom prst="rect">
+                      <a:avLst/>
+                    </a:prstGeom>
+                  </pic:spPr>
+                </pic:pic>
+              </a:graphicData>
+            </a:graphic>
+          </wp:anchor>
+        </w:drawing>
+      </w:r>
+    </w:p>
+    <w:p>
+      <w:pPr>
+        <w:spacing w:before="900" w:after="0" w:line="927" w:lineRule="exact"/>
+        <w:ind w:firstLine="0"/>
+        <w:jc w:val="right"/>
+      </w:pPr>
+      <w:r>
+        <w:rPr>
+          <w:rFonts w:ascii="Bebas Neue" w:hAnsi="Bebas Neue" w:cs="Bebas Neue"/>
+          <w:caps/>
+          <w:color w:val="A9A9A4"/>
+          <w:sz w:val="90"/>
+          <w:szCs w:val="90"/>
+        </w:rPr>
+        <w:t xml:space="preserve">EM CADA LUGAR, EU ERA </w:t>
+      </w:r>
+      <w:r>
+        <w:rPr>
+          <w:rFonts w:ascii="Bebas Neue" w:hAnsi="Bebas Neue" w:cs="Bebas Neue"/>
+          <w:caps/>
+          <w:color w:val="FFFFFF"/>
+          <w:sz w:val="90"/>
+          <w:szCs w:val="90"/>
+        </w:rPr>
+        <w:t xml:space="preserve">UM POUCO OUTRA</w:t>
+      </w:r>
+      <w:r>
+        <w:rPr>
+          <w:rFonts w:ascii="Bebas Neue" w:hAnsi="Bebas Neue" w:cs="Bebas Neue"/>
+          <w:caps/>
+          <w:color w:val="A9A9A4"/>
+          <w:sz w:val="90"/>
+          <w:szCs w:val="90"/>
+        </w:rPr>
+        <w:t xml:space="preserve">. E EM CADA LUGAR GOSTAVAM DE MIM.</w:t>
+      </w:r>
+    </w:p>
+    <w:p>
+      <w:r>
+        <w:br w:type="page"/>
+      </w:r>
+    </w:p>
+    <w:p>
+      <w:pPr>
         <w:spacing w:before="240" w:after="240"/>
         <w:ind w:firstLine="0"/>
         <w:jc w:val="center"/>
@@ -1552,6 +1862,115 @@
     </w:p>
     <w:p>
       <w:pPr>
+        <w:pageBreakBefore/>
+        <w:spacing w:before="0" w:after="0"/>
+        <w:ind w:firstLine="0"/>
+      </w:pPr>
+      <w:r>
+        <w:drawing>
+          <wp:anchor distT="0" distB="0" distL="0" distR="0" simplePos="0" relativeHeight="0" behindDoc="1" locked="1" layoutInCell="1" allowOverlap="1">
+            <wp:simplePos x="0" y="0"/>
+            <wp:positionH relativeFrom="page">
+              <wp:posOffset>0</wp:posOffset>
+            </wp:positionH>
+            <wp:positionV relativeFrom="page">
+              <wp:posOffset>0</wp:posOffset>
+            </wp:positionV>
+            <wp:extent cx="5029200" cy="7772400"/>
+            <wp:effectExtent l="0" t="0" r="0" b="0"/>
+            <wp:wrapNone/>
+            <wp:docPr id="1004" name="Destaque 1004"/>
+            <wp:cNvGraphicFramePr/>
+            <a:graphic xmlns:a="http://schemas.openxmlformats.org/drawingml/2006/main">
+              <a:graphicData uri="http://schemas.openxmlformats.org/drawingml/2006/picture">
+                <pic:pic xmlns:pic="http://schemas.openxmlformats.org/drawingml/2006/picture">
+                  <pic:nvPicPr>
+                    <pic:cNvPr id="1004" name="destaque_relogio_dir.png"/>
+                    <pic:cNvPicPr/>
+                  </pic:nvPicPr>
+                  <pic:blipFill>
+                    <a:blip r:embed="rIdImg4"/>
+                    <a:stretch>
+                      <a:fillRect/>
+                    </a:stretch>
+                  </pic:blipFill>
+                  <pic:spPr>
+                    <a:xfrm>
+                      <a:off x="0" y="0"/>
+                      <a:ext cx="5029200" cy="7772400"/>
+                    </a:xfrm>
+                    <a:prstGeom prst="rect">
+                      <a:avLst/>
+                    </a:prstGeom>
+                  </pic:spPr>
+                </pic:pic>
+              </a:graphicData>
+            </a:graphic>
+          </wp:anchor>
+        </w:drawing>
+      </w:r>
+    </w:p>
+    <w:p>
+      <w:pPr>
+        <w:spacing w:before="900" w:after="0" w:line="1144" w:lineRule="exact"/>
+        <w:ind w:firstLine="0"/>
+        <w:jc w:val="left"/>
+      </w:pPr>
+      <w:r>
+        <w:rPr>
+          <w:rFonts w:ascii="Bebas Neue" w:hAnsi="Bebas Neue" w:cs="Bebas Neue"/>
+          <w:caps/>
+          <w:color w:val="A9A9A4"/>
+          <w:sz w:val="112"/>
+          <w:szCs w:val="112"/>
+        </w:rPr>
+        <w:t xml:space="preserve">EU SÓ QUERO DORMIR </w:t>
+      </w:r>
+      <w:r>
+        <w:rPr>
+          <w:rFonts w:ascii="Bebas Neue" w:hAnsi="Bebas Neue" w:cs="Bebas Neue"/>
+          <w:caps/>
+          <w:color w:val="FFFFFF"/>
+          <w:sz w:val="112"/>
+          <w:szCs w:val="112"/>
+        </w:rPr>
+        <w:t xml:space="preserve">SEM NINGUÉM PERGUNTAR NADA</w:t>
+      </w:r>
+      <w:r>
+        <w:rPr>
+          <w:rFonts w:ascii="Bebas Neue" w:hAnsi="Bebas Neue" w:cs="Bebas Neue"/>
+          <w:caps/>
+          <w:color w:val="A9A9A4"/>
+          <w:sz w:val="112"/>
+          <w:szCs w:val="112"/>
+        </w:rPr>
+        <w:t xml:space="preserve">.</w:t>
+      </w:r>
+    </w:p>
+    <w:p>
+      <w:pPr>
+        <w:spacing w:before="240" w:after="0"/>
+        <w:ind w:firstLine="0"/>
+        <w:jc w:val="left"/>
+      </w:pPr>
+      <w:r>
+        <w:rPr>
+          <w:rFonts w:ascii="Bebas Neue" w:hAnsi="Bebas Neue"/>
+          <w:caps/>
+          <w:color w:val="A9A9A4"/>
+          <w:spacing w:val="30"/>
+          <w:sz w:val="26"/>
+        </w:rPr>
+        <w:t xml:space="preserve">— CARLA</w:t>
+      </w:r>
+    </w:p>
+    <w:p>
+      <w:r>
+        <w:br w:type="page"/>
+      </w:r>
+    </w:p>
+    <w:p>
+      <w:pPr>
         <w:spacing w:before="240" w:after="240"/>
         <w:ind w:firstLine="0"/>
         <w:jc w:val="center"/>
@@ -1896,6 +2315,98 @@
     </w:p>
     <w:p>
       <w:pPr>
+        <w:pageBreakBefore/>
+        <w:spacing w:before="0" w:after="0"/>
+        <w:ind w:firstLine="0"/>
+      </w:pPr>
+      <w:r>
+        <w:drawing>
+          <wp:anchor distT="0" distB="0" distL="0" distR="0" simplePos="0" relativeHeight="0" behindDoc="1" locked="1" layoutInCell="1" allowOverlap="1">
+            <wp:simplePos x="0" y="0"/>
+            <wp:positionH relativeFrom="page">
+              <wp:posOffset>0</wp:posOffset>
+            </wp:positionH>
+            <wp:positionV relativeFrom="page">
+              <wp:posOffset>0</wp:posOffset>
+            </wp:positionV>
+            <wp:extent cx="5029200" cy="7772400"/>
+            <wp:effectExtent l="0" t="0" r="0" b="0"/>
+            <wp:wrapNone/>
+            <wp:docPr id="1005" name="Destaque 1005"/>
+            <wp:cNvGraphicFramePr/>
+            <a:graphic xmlns:a="http://schemas.openxmlformats.org/drawingml/2006/main">
+              <a:graphicData uri="http://schemas.openxmlformats.org/drawingml/2006/picture">
+                <pic:pic xmlns:pic="http://schemas.openxmlformats.org/drawingml/2006/picture">
+                  <pic:nvPicPr>
+                    <pic:cNvPr id="1005" name="destaque_vinha_esq.png"/>
+                    <pic:cNvPicPr/>
+                  </pic:nvPicPr>
+                  <pic:blipFill>
+                    <a:blip r:embed="rIdImg5"/>
+                    <a:stretch>
+                      <a:fillRect/>
+                    </a:stretch>
+                  </pic:blipFill>
+                  <pic:spPr>
+                    <a:xfrm>
+                      <a:off x="0" y="0"/>
+                      <a:ext cx="5029200" cy="7772400"/>
+                    </a:xfrm>
+                    <a:prstGeom prst="rect">
+                      <a:avLst/>
+                    </a:prstGeom>
+                  </pic:spPr>
+                </pic:pic>
+              </a:graphicData>
+            </a:graphic>
+          </wp:anchor>
+        </w:drawing>
+      </w:r>
+    </w:p>
+    <w:p>
+      <w:pPr>
+        <w:spacing w:before="900" w:after="0" w:line="813" w:lineRule="exact"/>
+        <w:ind w:firstLine="0"/>
+        <w:jc w:val="right"/>
+      </w:pPr>
+      <w:r>
+        <w:rPr>
+          <w:rFonts w:ascii="Bebas Neue" w:hAnsi="Bebas Neue" w:cs="Bebas Neue"/>
+          <w:caps/>
+          <w:color w:val="A9A9A4"/>
+          <w:sz w:val="78"/>
+          <w:szCs w:val="78"/>
+        </w:rPr>
+        <w:t xml:space="preserve">PRECISAVA DE ALGUMA COISA PEQUENA, </w:t>
+      </w:r>
+      <w:r>
+        <w:rPr>
+          <w:rFonts w:ascii="Bebas Neue" w:hAnsi="Bebas Neue" w:cs="Bebas Neue"/>
+          <w:caps/>
+          <w:color w:val="FFFFFF"/>
+          <w:sz w:val="78"/>
+          <w:szCs w:val="78"/>
+        </w:rPr>
+        <w:t xml:space="preserve">DO TAMANHO DE UMA TARDE COMUM</w:t>
+      </w:r>
+      <w:r>
+        <w:rPr>
+          <w:rFonts w:ascii="Bebas Neue" w:hAnsi="Bebas Neue" w:cs="Bebas Neue"/>
+          <w:caps/>
+          <w:color w:val="A9A9A4"/>
+          <w:sz w:val="78"/>
+          <w:szCs w:val="78"/>
+        </w:rPr>
+        <w:t xml:space="preserve">, ONDE EU PUDESSE PÔR O PÉ.</w:t>
+      </w:r>
+    </w:p>
+    <w:p>
+      <w:r>
+        <w:br w:type="page"/>
+      </w:r>
+    </w:p>
+    <w:p>
+      <w:pPr>
         <w:spacing w:before="240" w:after="240"/>
         <w:ind w:firstLine="0"/>
         <w:jc w:val="center"/>
@@ -2123,6 +2634,98 @@
     </w:p>
     <w:p>
       <w:pPr>
+        <w:pageBreakBefore/>
+        <w:spacing w:before="0" w:after="0"/>
+        <w:ind w:firstLine="0"/>
+      </w:pPr>
+      <w:r>
+        <w:drawing>
+          <wp:anchor distT="0" distB="0" distL="0" distR="0" simplePos="0" relativeHeight="0" behindDoc="1" locked="1" layoutInCell="1" allowOverlap="1">
+            <wp:simplePos x="0" y="0"/>
+            <wp:positionH relativeFrom="page">
+              <wp:posOffset>0</wp:posOffset>
+            </wp:positionH>
+            <wp:positionV relativeFrom="page">
+              <wp:posOffset>0</wp:posOffset>
+            </wp:positionV>
+            <wp:extent cx="5029200" cy="7772400"/>
+            <wp:effectExtent l="0" t="0" r="0" b="0"/>
+            <wp:wrapNone/>
+            <wp:docPr id="1006" name="Destaque 1006"/>
+            <wp:cNvGraphicFramePr/>
+            <a:graphic xmlns:a="http://schemas.openxmlformats.org/drawingml/2006/main">
+              <a:graphicData uri="http://schemas.openxmlformats.org/drawingml/2006/picture">
+                <pic:pic xmlns:pic="http://schemas.openxmlformats.org/drawingml/2006/picture">
+                  <pic:nvPicPr>
+                    <pic:cNvPr id="1006" name="destaque_ramo_dir.png"/>
+                    <pic:cNvPicPr/>
+                  </pic:nvPicPr>
+                  <pic:blipFill>
+                    <a:blip r:embed="rIdImg6"/>
+                    <a:stretch>
+                      <a:fillRect/>
+                    </a:stretch>
+                  </pic:blipFill>
+                  <pic:spPr>
+                    <a:xfrm>
+                      <a:off x="0" y="0"/>
+                      <a:ext cx="5029200" cy="7772400"/>
+                    </a:xfrm>
+                    <a:prstGeom prst="rect">
+                      <a:avLst/>
+                    </a:prstGeom>
+                  </pic:spPr>
+                </pic:pic>
+              </a:graphicData>
+            </a:graphic>
+          </wp:anchor>
+        </w:drawing>
+      </w:r>
+    </w:p>
+    <w:p>
+      <w:pPr>
+        <w:spacing w:before="900" w:after="0" w:line="1131" w:lineRule="exact"/>
+        <w:ind w:firstLine="0"/>
+        <w:jc w:val="left"/>
+      </w:pPr>
+      <w:r>
+        <w:rPr>
+          <w:rFonts w:ascii="Bebas Neue" w:hAnsi="Bebas Neue" w:cs="Bebas Neue"/>
+          <w:caps/>
+          <w:color w:val="A9A9A4"/>
+          <w:sz w:val="110"/>
+          <w:szCs w:val="110"/>
+        </w:rPr>
+        <w:t xml:space="preserve">DEIXA ELE ACORDAR E EU </w:t>
+      </w:r>
+      <w:r>
+        <w:rPr>
+          <w:rFonts w:ascii="Bebas Neue" w:hAnsi="Bebas Neue" w:cs="Bebas Neue"/>
+          <w:caps/>
+          <w:color w:val="FFFFFF"/>
+          <w:sz w:val="110"/>
+          <w:szCs w:val="110"/>
+        </w:rPr>
+        <w:t xml:space="preserve">NUNCA MAIS TE PEÇO NADA</w:t>
+      </w:r>
+      <w:r>
+        <w:rPr>
+          <w:rFonts w:ascii="Bebas Neue" w:hAnsi="Bebas Neue" w:cs="Bebas Neue"/>
+          <w:caps/>
+          <w:color w:val="A9A9A4"/>
+          <w:sz w:val="110"/>
+          <w:szCs w:val="110"/>
+        </w:rPr>
+        <w:t xml:space="preserve">.</w:t>
+      </w:r>
+    </w:p>
+    <w:p>
+      <w:r>
+        <w:br w:type="page"/>
+      </w:r>
+    </w:p>
+    <w:p>
+      <w:pPr>
         <w:spacing w:before="240" w:after="240"/>
         <w:ind w:firstLine="0"/>
         <w:jc w:val="center"/>
@@ -2496,6 +3099,90 @@
       </w:r>
     </w:p>
     <w:p>
+      <w:pPr>
+        <w:pageBreakBefore/>
+        <w:spacing w:before="0" w:after="0"/>
+        <w:ind w:firstLine="0"/>
+      </w:pPr>
+      <w:r>
+        <w:drawing>
+          <wp:anchor distT="0" distB="0" distL="0" distR="0" simplePos="0" relativeHeight="0" behindDoc="1" locked="1" layoutInCell="1" allowOverlap="1">
+            <wp:simplePos x="0" y="0"/>
+            <wp:positionH relativeFrom="page">
+              <wp:posOffset>0</wp:posOffset>
+            </wp:positionH>
+            <wp:positionV relativeFrom="page">
+              <wp:posOffset>0</wp:posOffset>
+            </wp:positionV>
+            <wp:extent cx="5029200" cy="7772400"/>
+            <wp:effectExtent l="0" t="0" r="0" b="0"/>
+            <wp:wrapNone/>
+            <wp:docPr id="1007" name="Destaque 1007"/>
+            <wp:cNvGraphicFramePr/>
+            <a:graphic xmlns:a="http://schemas.openxmlformats.org/drawingml/2006/main">
+              <a:graphicData uri="http://schemas.openxmlformats.org/drawingml/2006/picture">
+                <pic:pic xmlns:pic="http://schemas.openxmlformats.org/drawingml/2006/picture">
+                  <pic:nvPicPr>
+                    <pic:cNvPr id="1007" name="destaque_relogio_esq.png"/>
+                    <pic:cNvPicPr/>
+                  </pic:nvPicPr>
+                  <pic:blipFill>
+                    <a:blip r:embed="rIdImg1"/>
+                    <a:stretch>
+                      <a:fillRect/>
+                    </a:stretch>
+                  </pic:blipFill>
+                  <pic:spPr>
+                    <a:xfrm>
+                      <a:off x="0" y="0"/>
+                      <a:ext cx="5029200" cy="7772400"/>
+                    </a:xfrm>
+                    <a:prstGeom prst="rect">
+                      <a:avLst/>
+                    </a:prstGeom>
+                  </pic:spPr>
+                </pic:pic>
+              </a:graphicData>
+            </a:graphic>
+          </wp:anchor>
+        </w:drawing>
+      </w:r>
+    </w:p>
+    <w:p>
+      <w:pPr>
+        <w:spacing w:before="900" w:after="0" w:line="1183" w:lineRule="exact"/>
+        <w:ind w:firstLine="0"/>
+        <w:jc w:val="right"/>
+      </w:pPr>
+      <w:r>
+        <w:rPr>
+          <w:rFonts w:ascii="Bebas Neue" w:hAnsi="Bebas Neue" w:cs="Bebas Neue"/>
+          <w:caps/>
+          <w:color w:val="FFFFFF"/>
+          <w:sz w:val="116"/>
+          <w:szCs w:val="116"/>
+        </w:rPr>
+        <w:t xml:space="preserve">PODE ESCREVER QUATRO.</w:t>
+      </w:r>
+    </w:p>
+    <w:p>
+      <w:pPr>
+        <w:spacing w:before="240" w:after="0"/>
+        <w:ind w:firstLine="0"/>
+        <w:jc w:val="right"/>
+      </w:pPr>
+      <w:r>
+        <w:rPr>
+          <w:rFonts w:ascii="Bebas Neue" w:hAnsi="Bebas Neue"/>
+          <w:caps/>
+          <w:color w:val="A9A9A4"/>
+          <w:spacing w:val="30"/>
+          <w:sz w:val="26"/>
+        </w:rPr>
+        <w:t xml:space="preserve">— MINHA MÃE</w:t>
+      </w:r>
+    </w:p>
+    <w:p>
       <w:r>
         <w:br w:type="page"/>
       </w:r>
@@ -2763,6 +3450,98 @@
     </w:p>
     <w:p>
       <w:pPr>
+        <w:pageBreakBefore/>
+        <w:spacing w:before="0" w:after="0"/>
+        <w:ind w:firstLine="0"/>
+      </w:pPr>
+      <w:r>
+        <w:drawing>
+          <wp:anchor distT="0" distB="0" distL="0" distR="0" simplePos="0" relativeHeight="0" behindDoc="1" locked="1" layoutInCell="1" allowOverlap="1">
+            <wp:simplePos x="0" y="0"/>
+            <wp:positionH relativeFrom="page">
+              <wp:posOffset>0</wp:posOffset>
+            </wp:positionH>
+            <wp:positionV relativeFrom="page">
+              <wp:posOffset>0</wp:posOffset>
+            </wp:positionV>
+            <wp:extent cx="5029200" cy="7772400"/>
+            <wp:effectExtent l="0" t="0" r="0" b="0"/>
+            <wp:wrapNone/>
+            <wp:docPr id="1008" name="Destaque 1008"/>
+            <wp:cNvGraphicFramePr/>
+            <a:graphic xmlns:a="http://schemas.openxmlformats.org/drawingml/2006/main">
+              <a:graphicData uri="http://schemas.openxmlformats.org/drawingml/2006/picture">
+                <pic:pic xmlns:pic="http://schemas.openxmlformats.org/drawingml/2006/picture">
+                  <pic:nvPicPr>
+                    <pic:cNvPr id="1008" name="destaque_vinha_dir.png"/>
+                    <pic:cNvPicPr/>
+                  </pic:nvPicPr>
+                  <pic:blipFill>
+                    <a:blip r:embed="rIdImg2"/>
+                    <a:stretch>
+                      <a:fillRect/>
+                    </a:stretch>
+                  </pic:blipFill>
+                  <pic:spPr>
+                    <a:xfrm>
+                      <a:off x="0" y="0"/>
+                      <a:ext cx="5029200" cy="7772400"/>
+                    </a:xfrm>
+                    <a:prstGeom prst="rect">
+                      <a:avLst/>
+                    </a:prstGeom>
+                  </pic:spPr>
+                </pic:pic>
+              </a:graphicData>
+            </a:graphic>
+          </wp:anchor>
+        </w:drawing>
+      </w:r>
+    </w:p>
+    <w:p>
+      <w:pPr>
+        <w:spacing w:before="900" w:after="0" w:line="884" w:lineRule="exact"/>
+        <w:ind w:firstLine="0"/>
+        <w:jc w:val="left"/>
+      </w:pPr>
+      <w:r>
+        <w:rPr>
+          <w:rFonts w:ascii="Bebas Neue" w:hAnsi="Bebas Neue" w:cs="Bebas Neue"/>
+          <w:caps/>
+          <w:color w:val="A9A9A4"/>
+          <w:sz w:val="86"/>
+          <w:szCs w:val="86"/>
+        </w:rPr>
+        <w:t xml:space="preserve">EU QUERIA QUE </w:t>
+      </w:r>
+      <w:r>
+        <w:rPr>
+          <w:rFonts w:ascii="Bebas Neue" w:hAnsi="Bebas Neue" w:cs="Bebas Neue"/>
+          <w:caps/>
+          <w:color w:val="FFFFFF"/>
+          <w:sz w:val="86"/>
+          <w:szCs w:val="86"/>
+        </w:rPr>
+        <w:t xml:space="preserve">NENHUM DOS DOIS DESMONTASSE</w:t>
+      </w:r>
+      <w:r>
+        <w:rPr>
+          <w:rFonts w:ascii="Bebas Neue" w:hAnsi="Bebas Neue" w:cs="Bebas Neue"/>
+          <w:caps/>
+          <w:color w:val="A9A9A4"/>
+          <w:sz w:val="86"/>
+          <w:szCs w:val="86"/>
+        </w:rPr>
+        <w:t xml:space="preserve">, E ISSO NINGUÉM PEDIA A MIM TAMBÉM.</w:t>
+      </w:r>
+    </w:p>
+    <w:p>
+      <w:r>
+        <w:br w:type="page"/>
+      </w:r>
+    </w:p>
+    <w:p>
+      <w:pPr>
         <w:spacing w:before="240" w:after="240"/>
         <w:ind w:firstLine="0"/>
         <w:jc w:val="center"/>
@@ -3313,6 +4092,115 @@
     </w:p>
     <w:p>
       <w:pPr>
+        <w:pageBreakBefore/>
+        <w:spacing w:before="0" w:after="0"/>
+        <w:ind w:firstLine="0"/>
+      </w:pPr>
+      <w:r>
+        <w:drawing>
+          <wp:anchor distT="0" distB="0" distL="0" distR="0" simplePos="0" relativeHeight="0" behindDoc="1" locked="1" layoutInCell="1" allowOverlap="1">
+            <wp:simplePos x="0" y="0"/>
+            <wp:positionH relativeFrom="page">
+              <wp:posOffset>0</wp:posOffset>
+            </wp:positionH>
+            <wp:positionV relativeFrom="page">
+              <wp:posOffset>0</wp:posOffset>
+            </wp:positionV>
+            <wp:extent cx="5029200" cy="7772400"/>
+            <wp:effectExtent l="0" t="0" r="0" b="0"/>
+            <wp:wrapNone/>
+            <wp:docPr id="1009" name="Destaque 1009"/>
+            <wp:cNvGraphicFramePr/>
+            <a:graphic xmlns:a="http://schemas.openxmlformats.org/drawingml/2006/main">
+              <a:graphicData uri="http://schemas.openxmlformats.org/drawingml/2006/picture">
+                <pic:pic xmlns:pic="http://schemas.openxmlformats.org/drawingml/2006/picture">
+                  <pic:nvPicPr>
+                    <pic:cNvPr id="1009" name="destaque_ramo_esq.png"/>
+                    <pic:cNvPicPr/>
+                  </pic:nvPicPr>
+                  <pic:blipFill>
+                    <a:blip r:embed="rIdImg3"/>
+                    <a:stretch>
+                      <a:fillRect/>
+                    </a:stretch>
+                  </pic:blipFill>
+                  <pic:spPr>
+                    <a:xfrm>
+                      <a:off x="0" y="0"/>
+                      <a:ext cx="5029200" cy="7772400"/>
+                    </a:xfrm>
+                    <a:prstGeom prst="rect">
+                      <a:avLst/>
+                    </a:prstGeom>
+                  </pic:spPr>
+                </pic:pic>
+              </a:graphicData>
+            </a:graphic>
+          </wp:anchor>
+        </w:drawing>
+      </w:r>
+    </w:p>
+    <w:p>
+      <w:pPr>
+        <w:spacing w:before="900" w:after="0" w:line="1119" w:lineRule="exact"/>
+        <w:ind w:firstLine="0"/>
+        <w:jc w:val="right"/>
+      </w:pPr>
+      <w:r>
+        <w:rPr>
+          <w:rFonts w:ascii="Bebas Neue" w:hAnsi="Bebas Neue" w:cs="Bebas Neue"/>
+          <w:caps/>
+          <w:color w:val="A9A9A4"/>
+          <w:sz w:val="108"/>
+          <w:szCs w:val="108"/>
+        </w:rPr>
+        <w:t xml:space="preserve">PORQUE É MEIA-NOITE E VOCÊ ESTÁ </w:t>
+      </w:r>
+      <w:r>
+        <w:rPr>
+          <w:rFonts w:ascii="Bebas Neue" w:hAnsi="Bebas Neue" w:cs="Bebas Neue"/>
+          <w:caps/>
+          <w:color w:val="FFFFFF"/>
+          <w:sz w:val="108"/>
+          <w:szCs w:val="108"/>
+        </w:rPr>
+        <w:t xml:space="preserve">ANDANDO SOZINHA</w:t>
+      </w:r>
+      <w:r>
+        <w:rPr>
+          <w:rFonts w:ascii="Bebas Neue" w:hAnsi="Bebas Neue" w:cs="Bebas Neue"/>
+          <w:caps/>
+          <w:color w:val="A9A9A4"/>
+          <w:sz w:val="108"/>
+          <w:szCs w:val="108"/>
+        </w:rPr>
+        <w:t xml:space="preserve">.</w:t>
+      </w:r>
+    </w:p>
+    <w:p>
+      <w:pPr>
+        <w:spacing w:before="240" w:after="0"/>
+        <w:ind w:firstLine="0"/>
+        <w:jc w:val="right"/>
+      </w:pPr>
+      <w:r>
+        <w:rPr>
+          <w:rFonts w:ascii="Bebas Neue" w:hAnsi="Bebas Neue"/>
+          <w:caps/>
+          <w:color w:val="A9A9A4"/>
+          <w:spacing w:val="30"/>
+          <w:sz w:val="26"/>
+        </w:rPr>
+        <w:t xml:space="preserve">— KOUSUKE</w:t>
+      </w:r>
+    </w:p>
+    <w:p>
+      <w:r>
+        <w:br w:type="page"/>
+      </w:r>
+    </w:p>
+    <w:p>
+      <w:pPr>
         <w:spacing w:before="240" w:after="240"/>
         <w:ind w:firstLine="0"/>
         <w:jc w:val="center"/>
@@ -4114,6 +5002,83 @@
       </w:r>
     </w:p>
     <w:p>
+      <w:pPr>
+        <w:pageBreakBefore/>
+        <w:spacing w:before="0" w:after="0"/>
+        <w:ind w:firstLine="0"/>
+      </w:pPr>
+      <w:r>
+        <w:drawing>
+          <wp:anchor distT="0" distB="0" distL="0" distR="0" simplePos="0" relativeHeight="0" behindDoc="1" locked="1" layoutInCell="1" allowOverlap="1">
+            <wp:simplePos x="0" y="0"/>
+            <wp:positionH relativeFrom="page">
+              <wp:posOffset>0</wp:posOffset>
+            </wp:positionH>
+            <wp:positionV relativeFrom="page">
+              <wp:posOffset>0</wp:posOffset>
+            </wp:positionV>
+            <wp:extent cx="5029200" cy="7772400"/>
+            <wp:effectExtent l="0" t="0" r="0" b="0"/>
+            <wp:wrapNone/>
+            <wp:docPr id="1010" name="Destaque 1010"/>
+            <wp:cNvGraphicFramePr/>
+            <a:graphic xmlns:a="http://schemas.openxmlformats.org/drawingml/2006/main">
+              <a:graphicData uri="http://schemas.openxmlformats.org/drawingml/2006/picture">
+                <pic:pic xmlns:pic="http://schemas.openxmlformats.org/drawingml/2006/picture">
+                  <pic:nvPicPr>
+                    <pic:cNvPr id="1010" name="destaque_relogio_dir.png"/>
+                    <pic:cNvPicPr/>
+                  </pic:nvPicPr>
+                  <pic:blipFill>
+                    <a:blip r:embed="rIdImg4"/>
+                    <a:stretch>
+                      <a:fillRect/>
+                    </a:stretch>
+                  </pic:blipFill>
+                  <pic:spPr>
+                    <a:xfrm>
+                      <a:off x="0" y="0"/>
+                      <a:ext cx="5029200" cy="7772400"/>
+                    </a:xfrm>
+                    <a:prstGeom prst="rect">
+                      <a:avLst/>
+                    </a:prstGeom>
+                  </pic:spPr>
+                </pic:pic>
+              </a:graphicData>
+            </a:graphic>
+          </wp:anchor>
+        </w:drawing>
+      </w:r>
+    </w:p>
+    <w:p>
+      <w:pPr>
+        <w:spacing w:before="900" w:after="0" w:line="934" w:lineRule="exact"/>
+        <w:ind w:firstLine="0"/>
+        <w:jc w:val="left"/>
+      </w:pPr>
+      <w:r>
+        <w:rPr>
+          <w:rFonts w:ascii="Bebas Neue" w:hAnsi="Bebas Neue" w:cs="Bebas Neue"/>
+          <w:caps/>
+          <w:color w:val="FFFFFF"/>
+          <w:sz w:val="90"/>
+          <w:szCs w:val="90"/>
+        </w:rPr>
+        <w:t xml:space="preserve">NINGUÉM TINHA ME PEDIDO PARA PULAR.</w:t>
+      </w:r>
+      <w:r>
+        <w:rPr>
+          <w:rFonts w:ascii="Bebas Neue" w:hAnsi="Bebas Neue" w:cs="Bebas Neue"/>
+          <w:caps/>
+          <w:color w:val="A9A9A4"/>
+          <w:sz w:val="90"/>
+          <w:szCs w:val="90"/>
+        </w:rPr>
+        <w:t xml:space="preserve"> NINGUÉM PRECISAVA QUE EU PULASSE.</w:t>
+      </w:r>
+    </w:p>
+    <w:p>
       <w:r>
         <w:br w:type="page"/>
       </w:r>
@@ -4257,6 +5222,98 @@
     </w:p>
     <w:p>
       <w:pPr>
+        <w:pageBreakBefore/>
+        <w:spacing w:before="0" w:after="0"/>
+        <w:ind w:firstLine="0"/>
+      </w:pPr>
+      <w:r>
+        <w:drawing>
+          <wp:anchor distT="0" distB="0" distL="0" distR="0" simplePos="0" relativeHeight="0" behindDoc="1" locked="1" layoutInCell="1" allowOverlap="1">
+            <wp:simplePos x="0" y="0"/>
+            <wp:positionH relativeFrom="page">
+              <wp:posOffset>0</wp:posOffset>
+            </wp:positionH>
+            <wp:positionV relativeFrom="page">
+              <wp:posOffset>0</wp:posOffset>
+            </wp:positionV>
+            <wp:extent cx="5029200" cy="7772400"/>
+            <wp:effectExtent l="0" t="0" r="0" b="0"/>
+            <wp:wrapNone/>
+            <wp:docPr id="1011" name="Destaque 1011"/>
+            <wp:cNvGraphicFramePr/>
+            <a:graphic xmlns:a="http://schemas.openxmlformats.org/drawingml/2006/main">
+              <a:graphicData uri="http://schemas.openxmlformats.org/drawingml/2006/picture">
+                <pic:pic xmlns:pic="http://schemas.openxmlformats.org/drawingml/2006/picture">
+                  <pic:nvPicPr>
+                    <pic:cNvPr id="1011" name="destaque_vinha_esq.png"/>
+                    <pic:cNvPicPr/>
+                  </pic:nvPicPr>
+                  <pic:blipFill>
+                    <a:blip r:embed="rIdImg5"/>
+                    <a:stretch>
+                      <a:fillRect/>
+                    </a:stretch>
+                  </pic:blipFill>
+                  <pic:spPr>
+                    <a:xfrm>
+                      <a:off x="0" y="0"/>
+                      <a:ext cx="5029200" cy="7772400"/>
+                    </a:xfrm>
+                    <a:prstGeom prst="rect">
+                      <a:avLst/>
+                    </a:prstGeom>
+                  </pic:spPr>
+                </pic:pic>
+              </a:graphicData>
+            </a:graphic>
+          </wp:anchor>
+        </w:drawing>
+      </w:r>
+    </w:p>
+    <w:p>
+      <w:pPr>
+        <w:spacing w:before="900" w:after="0" w:line="993" w:lineRule="exact"/>
+        <w:ind w:firstLine="0"/>
+        <w:jc w:val="right"/>
+      </w:pPr>
+      <w:r>
+        <w:rPr>
+          <w:rFonts w:ascii="Bebas Neue" w:hAnsi="Bebas Neue" w:cs="Bebas Neue"/>
+          <w:caps/>
+          <w:color w:val="A9A9A4"/>
+          <w:sz w:val="96"/>
+          <w:szCs w:val="96"/>
+        </w:rPr>
+        <w:t xml:space="preserve">NUNCA TINHA ESTADO NUM LUGAR EM QUE </w:t>
+      </w:r>
+      <w:r>
+        <w:rPr>
+          <w:rFonts w:ascii="Bebas Neue" w:hAnsi="Bebas Neue" w:cs="Bebas Neue"/>
+          <w:caps/>
+          <w:color w:val="FFFFFF"/>
+          <w:sz w:val="96"/>
+          <w:szCs w:val="96"/>
+        </w:rPr>
+        <w:t xml:space="preserve">NINGUÉM PRECISAVA DE MIM</w:t>
+      </w:r>
+      <w:r>
+        <w:rPr>
+          <w:rFonts w:ascii="Bebas Neue" w:hAnsi="Bebas Neue" w:cs="Bebas Neue"/>
+          <w:caps/>
+          <w:color w:val="A9A9A4"/>
+          <w:sz w:val="96"/>
+          <w:szCs w:val="96"/>
+        </w:rPr>
+        <w:t xml:space="preserve">.</w:t>
+      </w:r>
+    </w:p>
+    <w:p>
+      <w:r>
+        <w:br w:type="page"/>
+      </w:r>
+    </w:p>
+    <w:p>
+      <w:pPr>
         <w:spacing w:before="240" w:after="240"/>
         <w:ind w:firstLine="0"/>
         <w:jc w:val="center"/>
@@ -4723,6 +5780,98 @@
     </w:p>
     <w:p>
       <w:pPr>
+        <w:pageBreakBefore/>
+        <w:spacing w:before="0" w:after="0"/>
+        <w:ind w:firstLine="0"/>
+      </w:pPr>
+      <w:r>
+        <w:drawing>
+          <wp:anchor distT="0" distB="0" distL="0" distR="0" simplePos="0" relativeHeight="0" behindDoc="1" locked="1" layoutInCell="1" allowOverlap="1">
+            <wp:simplePos x="0" y="0"/>
+            <wp:positionH relativeFrom="page">
+              <wp:posOffset>0</wp:posOffset>
+            </wp:positionH>
+            <wp:positionV relativeFrom="page">
+              <wp:posOffset>0</wp:posOffset>
+            </wp:positionV>
+            <wp:extent cx="5029200" cy="7772400"/>
+            <wp:effectExtent l="0" t="0" r="0" b="0"/>
+            <wp:wrapNone/>
+            <wp:docPr id="1012" name="Destaque 1012"/>
+            <wp:cNvGraphicFramePr/>
+            <a:graphic xmlns:a="http://schemas.openxmlformats.org/drawingml/2006/main">
+              <a:graphicData uri="http://schemas.openxmlformats.org/drawingml/2006/picture">
+                <pic:pic xmlns:pic="http://schemas.openxmlformats.org/drawingml/2006/picture">
+                  <pic:nvPicPr>
+                    <pic:cNvPr id="1012" name="destaque_ramo_dir.png"/>
+                    <pic:cNvPicPr/>
+                  </pic:nvPicPr>
+                  <pic:blipFill>
+                    <a:blip r:embed="rIdImg6"/>
+                    <a:stretch>
+                      <a:fillRect/>
+                    </a:stretch>
+                  </pic:blipFill>
+                  <pic:spPr>
+                    <a:xfrm>
+                      <a:off x="0" y="0"/>
+                      <a:ext cx="5029200" cy="7772400"/>
+                    </a:xfrm>
+                    <a:prstGeom prst="rect">
+                      <a:avLst/>
+                    </a:prstGeom>
+                  </pic:spPr>
+                </pic:pic>
+              </a:graphicData>
+            </a:graphic>
+          </wp:anchor>
+        </w:drawing>
+      </w:r>
+    </w:p>
+    <w:p>
+      <w:pPr>
+        <w:spacing w:before="900" w:after="0" w:line="1065" w:lineRule="exact"/>
+        <w:ind w:firstLine="0"/>
+        <w:jc w:val="left"/>
+      </w:pPr>
+      <w:r>
+        <w:rPr>
+          <w:rFonts w:ascii="Bebas Neue" w:hAnsi="Bebas Neue" w:cs="Bebas Neue"/>
+          <w:caps/>
+          <w:color w:val="A9A9A4"/>
+          <w:sz w:val="104"/>
+          <w:szCs w:val="104"/>
+        </w:rPr>
+        <w:t xml:space="preserve">NINGUÉM DIZIA QUE O KOUSUKE </w:t>
+      </w:r>
+      <w:r>
+        <w:rPr>
+          <w:rFonts w:ascii="Bebas Neue" w:hAnsi="Bebas Neue" w:cs="Bebas Neue"/>
+          <w:caps/>
+          <w:color w:val="FFFFFF"/>
+          <w:sz w:val="104"/>
+          <w:szCs w:val="104"/>
+        </w:rPr>
+        <w:t xml:space="preserve">TINHA SORTE DE TER A MIM</w:t>
+      </w:r>
+      <w:r>
+        <w:rPr>
+          <w:rFonts w:ascii="Bebas Neue" w:hAnsi="Bebas Neue" w:cs="Bebas Neue"/>
+          <w:caps/>
+          <w:color w:val="A9A9A4"/>
+          <w:sz w:val="104"/>
+          <w:szCs w:val="104"/>
+        </w:rPr>
+        <w:t xml:space="preserve">.</w:t>
+      </w:r>
+    </w:p>
+    <w:p>
+      <w:r>
+        <w:br w:type="page"/>
+      </w:r>
+    </w:p>
+    <w:p>
+      <w:pPr>
         <w:spacing w:before="240" w:after="240"/>
         <w:ind w:firstLine="0"/>
         <w:jc w:val="center"/>
@@ -4902,6 +6051,115 @@
     </w:p>
     <w:p>
       <w:pPr>
+        <w:pageBreakBefore/>
+        <w:spacing w:before="0" w:after="0"/>
+        <w:ind w:firstLine="0"/>
+      </w:pPr>
+      <w:r>
+        <w:drawing>
+          <wp:anchor distT="0" distB="0" distL="0" distR="0" simplePos="0" relativeHeight="0" behindDoc="1" locked="1" layoutInCell="1" allowOverlap="1">
+            <wp:simplePos x="0" y="0"/>
+            <wp:positionH relativeFrom="page">
+              <wp:posOffset>0</wp:posOffset>
+            </wp:positionH>
+            <wp:positionV relativeFrom="page">
+              <wp:posOffset>0</wp:posOffset>
+            </wp:positionV>
+            <wp:extent cx="5029200" cy="7772400"/>
+            <wp:effectExtent l="0" t="0" r="0" b="0"/>
+            <wp:wrapNone/>
+            <wp:docPr id="1013" name="Destaque 1013"/>
+            <wp:cNvGraphicFramePr/>
+            <a:graphic xmlns:a="http://schemas.openxmlformats.org/drawingml/2006/main">
+              <a:graphicData uri="http://schemas.openxmlformats.org/drawingml/2006/picture">
+                <pic:pic xmlns:pic="http://schemas.openxmlformats.org/drawingml/2006/picture">
+                  <pic:nvPicPr>
+                    <pic:cNvPr id="1013" name="destaque_relogio_esq.png"/>
+                    <pic:cNvPicPr/>
+                  </pic:nvPicPr>
+                  <pic:blipFill>
+                    <a:blip r:embed="rIdImg1"/>
+                    <a:stretch>
+                      <a:fillRect/>
+                    </a:stretch>
+                  </pic:blipFill>
+                  <pic:spPr>
+                    <a:xfrm>
+                      <a:off x="0" y="0"/>
+                      <a:ext cx="5029200" cy="7772400"/>
+                    </a:xfrm>
+                    <a:prstGeom prst="rect">
+                      <a:avLst/>
+                    </a:prstGeom>
+                  </pic:spPr>
+                </pic:pic>
+              </a:graphicData>
+            </a:graphic>
+          </wp:anchor>
+        </w:drawing>
+      </w:r>
+    </w:p>
+    <w:p>
+      <w:pPr>
+        <w:spacing w:before="900" w:after="0" w:line="1183" w:lineRule="exact"/>
+        <w:ind w:firstLine="0"/>
+        <w:jc w:val="right"/>
+      </w:pPr>
+      <w:r>
+        <w:rPr>
+          <w:rFonts w:ascii="Bebas Neue" w:hAnsi="Bebas Neue" w:cs="Bebas Neue"/>
+          <w:caps/>
+          <w:color w:val="A9A9A4"/>
+          <w:sz w:val="116"/>
+          <w:szCs w:val="116"/>
+        </w:rPr>
+        <w:t xml:space="preserve">VOCÊ TEM CERTEZA, OU VOCÊ ESTÁ </w:t>
+      </w:r>
+      <w:r>
+        <w:rPr>
+          <w:rFonts w:ascii="Bebas Neue" w:hAnsi="Bebas Neue" w:cs="Bebas Neue"/>
+          <w:caps/>
+          <w:color w:val="FFFFFF"/>
+          <w:sz w:val="116"/>
+          <w:szCs w:val="116"/>
+        </w:rPr>
+        <w:t xml:space="preserve">CANSADA</w:t>
+      </w:r>
+      <w:r>
+        <w:rPr>
+          <w:rFonts w:ascii="Bebas Neue" w:hAnsi="Bebas Neue" w:cs="Bebas Neue"/>
+          <w:caps/>
+          <w:color w:val="A9A9A4"/>
+          <w:sz w:val="116"/>
+          <w:szCs w:val="116"/>
+        </w:rPr>
+        <w:t xml:space="preserve">?</w:t>
+      </w:r>
+    </w:p>
+    <w:p>
+      <w:pPr>
+        <w:spacing w:before="240" w:after="0"/>
+        <w:ind w:firstLine="0"/>
+        <w:jc w:val="right"/>
+      </w:pPr>
+      <w:r>
+        <w:rPr>
+          <w:rFonts w:ascii="Bebas Neue" w:hAnsi="Bebas Neue"/>
+          <w:caps/>
+          <w:color w:val="A9A9A4"/>
+          <w:spacing w:val="30"/>
+          <w:sz w:val="26"/>
+        </w:rPr>
+        <w:t xml:space="preserve">— KOUSUKE</w:t>
+      </w:r>
+    </w:p>
+    <w:p>
+      <w:r>
+        <w:br w:type="page"/>
+      </w:r>
+    </w:p>
+    <w:p>
+      <w:pPr>
         <w:spacing w:before="240" w:after="240"/>
         <w:ind w:firstLine="0"/>
         <w:jc w:val="center"/>
@@ -5320,6 +6578,83 @@
       </w:r>
     </w:p>
     <w:p>
+      <w:pPr>
+        <w:pageBreakBefore/>
+        <w:spacing w:before="0" w:after="0"/>
+        <w:ind w:firstLine="0"/>
+      </w:pPr>
+      <w:r>
+        <w:drawing>
+          <wp:anchor distT="0" distB="0" distL="0" distR="0" simplePos="0" relativeHeight="0" behindDoc="1" locked="1" layoutInCell="1" allowOverlap="1">
+            <wp:simplePos x="0" y="0"/>
+            <wp:positionH relativeFrom="page">
+              <wp:posOffset>0</wp:posOffset>
+            </wp:positionH>
+            <wp:positionV relativeFrom="page">
+              <wp:posOffset>0</wp:posOffset>
+            </wp:positionV>
+            <wp:extent cx="5029200" cy="7772400"/>
+            <wp:effectExtent l="0" t="0" r="0" b="0"/>
+            <wp:wrapNone/>
+            <wp:docPr id="1014" name="Destaque 1014"/>
+            <wp:cNvGraphicFramePr/>
+            <a:graphic xmlns:a="http://schemas.openxmlformats.org/drawingml/2006/main">
+              <a:graphicData uri="http://schemas.openxmlformats.org/drawingml/2006/picture">
+                <pic:pic xmlns:pic="http://schemas.openxmlformats.org/drawingml/2006/picture">
+                  <pic:nvPicPr>
+                    <pic:cNvPr id="1014" name="destaque_vinha_dir.png"/>
+                    <pic:cNvPicPr/>
+                  </pic:nvPicPr>
+                  <pic:blipFill>
+                    <a:blip r:embed="rIdImg2"/>
+                    <a:stretch>
+                      <a:fillRect/>
+                    </a:stretch>
+                  </pic:blipFill>
+                  <pic:spPr>
+                    <a:xfrm>
+                      <a:off x="0" y="0"/>
+                      <a:ext cx="5029200" cy="7772400"/>
+                    </a:xfrm>
+                    <a:prstGeom prst="rect">
+                      <a:avLst/>
+                    </a:prstGeom>
+                  </pic:spPr>
+                </pic:pic>
+              </a:graphicData>
+            </a:graphic>
+          </wp:anchor>
+        </w:drawing>
+      </w:r>
+    </w:p>
+    <w:p>
+      <w:pPr>
+        <w:spacing w:before="900" w:after="0" w:line="1183" w:lineRule="exact"/>
+        <w:ind w:firstLine="0"/>
+        <w:jc w:val="left"/>
+      </w:pPr>
+      <w:r>
+        <w:rPr>
+          <w:rFonts w:ascii="Bebas Neue" w:hAnsi="Bebas Neue" w:cs="Bebas Neue"/>
+          <w:caps/>
+          <w:color w:val="FFFFFF"/>
+          <w:sz w:val="116"/>
+          <w:szCs w:val="116"/>
+        </w:rPr>
+        <w:t xml:space="preserve">FOI TUDO ÓTIMO</w:t>
+      </w:r>
+      <w:r>
+        <w:rPr>
+          <w:rFonts w:ascii="Bebas Neue" w:hAnsi="Bebas Neue" w:cs="Bebas Neue"/>
+          <w:caps/>
+          <w:color w:val="A9A9A4"/>
+          <w:sz w:val="116"/>
+          <w:szCs w:val="116"/>
+        </w:rPr>
+        <w:t xml:space="preserve">, MÃE.</w:t>
+      </w:r>
+    </w:p>
+    <w:p>
       <w:r>
         <w:br w:type="page"/>
       </w:r>
@@ -5511,6 +6846,115 @@
     </w:p>
     <w:p>
       <w:pPr>
+        <w:pageBreakBefore/>
+        <w:spacing w:before="0" w:after="0"/>
+        <w:ind w:firstLine="0"/>
+      </w:pPr>
+      <w:r>
+        <w:drawing>
+          <wp:anchor distT="0" distB="0" distL="0" distR="0" simplePos="0" relativeHeight="0" behindDoc="1" locked="1" layoutInCell="1" allowOverlap="1">
+            <wp:simplePos x="0" y="0"/>
+            <wp:positionH relativeFrom="page">
+              <wp:posOffset>0</wp:posOffset>
+            </wp:positionH>
+            <wp:positionV relativeFrom="page">
+              <wp:posOffset>0</wp:posOffset>
+            </wp:positionV>
+            <wp:extent cx="5029200" cy="7772400"/>
+            <wp:effectExtent l="0" t="0" r="0" b="0"/>
+            <wp:wrapNone/>
+            <wp:docPr id="1015" name="Destaque 1015"/>
+            <wp:cNvGraphicFramePr/>
+            <a:graphic xmlns:a="http://schemas.openxmlformats.org/drawingml/2006/main">
+              <a:graphicData uri="http://schemas.openxmlformats.org/drawingml/2006/picture">
+                <pic:pic xmlns:pic="http://schemas.openxmlformats.org/drawingml/2006/picture">
+                  <pic:nvPicPr>
+                    <pic:cNvPr id="1015" name="destaque_ramo_esq.png"/>
+                    <pic:cNvPicPr/>
+                  </pic:nvPicPr>
+                  <pic:blipFill>
+                    <a:blip r:embed="rIdImg3"/>
+                    <a:stretch>
+                      <a:fillRect/>
+                    </a:stretch>
+                  </pic:blipFill>
+                  <pic:spPr>
+                    <a:xfrm>
+                      <a:off x="0" y="0"/>
+                      <a:ext cx="5029200" cy="7772400"/>
+                    </a:xfrm>
+                    <a:prstGeom prst="rect">
+                      <a:avLst/>
+                    </a:prstGeom>
+                  </pic:spPr>
+                </pic:pic>
+              </a:graphicData>
+            </a:graphic>
+          </wp:anchor>
+        </w:drawing>
+      </w:r>
+    </w:p>
+    <w:p>
+      <w:pPr>
+        <w:spacing w:before="900" w:after="0" w:line="1183" w:lineRule="exact"/>
+        <w:ind w:firstLine="0"/>
+        <w:jc w:val="right"/>
+      </w:pPr>
+      <w:r>
+        <w:rPr>
+          <w:rFonts w:ascii="Bebas Neue" w:hAnsi="Bebas Neue" w:cs="Bebas Neue"/>
+          <w:caps/>
+          <w:color w:val="A9A9A4"/>
+          <w:sz w:val="116"/>
+          <w:szCs w:val="116"/>
+        </w:rPr>
+        <w:t xml:space="preserve">NÃO POSSO </w:t>
+      </w:r>
+      <w:r>
+        <w:rPr>
+          <w:rFonts w:ascii="Bebas Neue" w:hAnsi="Bebas Neue" w:cs="Bebas Neue"/>
+          <w:caps/>
+          <w:color w:val="FFFFFF"/>
+          <w:sz w:val="116"/>
+          <w:szCs w:val="116"/>
+        </w:rPr>
+        <w:t xml:space="preserve">OLHAR MINHA FILHA</w:t>
+      </w:r>
+      <w:r>
+        <w:rPr>
+          <w:rFonts w:ascii="Bebas Neue" w:hAnsi="Bebas Neue" w:cs="Bebas Neue"/>
+          <w:caps/>
+          <w:color w:val="A9A9A4"/>
+          <w:sz w:val="116"/>
+          <w:szCs w:val="116"/>
+        </w:rPr>
+        <w:t xml:space="preserve">?</w:t>
+      </w:r>
+    </w:p>
+    <w:p>
+      <w:pPr>
+        <w:spacing w:before="240" w:after="0"/>
+        <w:ind w:firstLine="0"/>
+        <w:jc w:val="right"/>
+      </w:pPr>
+      <w:r>
+        <w:rPr>
+          <w:rFonts w:ascii="Bebas Neue" w:hAnsi="Bebas Neue"/>
+          <w:caps/>
+          <w:color w:val="A9A9A4"/>
+          <w:spacing w:val="30"/>
+          <w:sz w:val="26"/>
+        </w:rPr>
+        <w:t xml:space="preserve">— MINHA MÃE</w:t>
+      </w:r>
+    </w:p>
+    <w:p>
+      <w:r>
+        <w:br w:type="page"/>
+      </w:r>
+    </w:p>
+    <w:p>
+      <w:pPr>
         <w:spacing w:before="240" w:after="240"/>
         <w:ind w:firstLine="0"/>
         <w:jc w:val="center"/>
@@ -5784,6 +7228,115 @@
     </w:p>
     <w:p>
       <w:pPr>
+        <w:pageBreakBefore/>
+        <w:spacing w:before="0" w:after="0"/>
+        <w:ind w:firstLine="0"/>
+      </w:pPr>
+      <w:r>
+        <w:drawing>
+          <wp:anchor distT="0" distB="0" distL="0" distR="0" simplePos="0" relativeHeight="0" behindDoc="1" locked="1" layoutInCell="1" allowOverlap="1">
+            <wp:simplePos x="0" y="0"/>
+            <wp:positionH relativeFrom="page">
+              <wp:posOffset>0</wp:posOffset>
+            </wp:positionH>
+            <wp:positionV relativeFrom="page">
+              <wp:posOffset>0</wp:posOffset>
+            </wp:positionV>
+            <wp:extent cx="5029200" cy="7772400"/>
+            <wp:effectExtent l="0" t="0" r="0" b="0"/>
+            <wp:wrapNone/>
+            <wp:docPr id="1016" name="Destaque 1016"/>
+            <wp:cNvGraphicFramePr/>
+            <a:graphic xmlns:a="http://schemas.openxmlformats.org/drawingml/2006/main">
+              <a:graphicData uri="http://schemas.openxmlformats.org/drawingml/2006/picture">
+                <pic:pic xmlns:pic="http://schemas.openxmlformats.org/drawingml/2006/picture">
+                  <pic:nvPicPr>
+                    <pic:cNvPr id="1016" name="destaque_relogio_dir.png"/>
+                    <pic:cNvPicPr/>
+                  </pic:nvPicPr>
+                  <pic:blipFill>
+                    <a:blip r:embed="rIdImg4"/>
+                    <a:stretch>
+                      <a:fillRect/>
+                    </a:stretch>
+                  </pic:blipFill>
+                  <pic:spPr>
+                    <a:xfrm>
+                      <a:off x="0" y="0"/>
+                      <a:ext cx="5029200" cy="7772400"/>
+                    </a:xfrm>
+                    <a:prstGeom prst="rect">
+                      <a:avLst/>
+                    </a:prstGeom>
+                  </pic:spPr>
+                </pic:pic>
+              </a:graphicData>
+            </a:graphic>
+          </wp:anchor>
+        </w:drawing>
+      </w:r>
+    </w:p>
+    <w:p>
+      <w:pPr>
+        <w:spacing w:before="900" w:after="0" w:line="927" w:lineRule="exact"/>
+        <w:ind w:firstLine="0"/>
+        <w:jc w:val="left"/>
+      </w:pPr>
+      <w:r>
+        <w:rPr>
+          <w:rFonts w:ascii="Bebas Neue" w:hAnsi="Bebas Neue" w:cs="Bebas Neue"/>
+          <w:caps/>
+          <w:color w:val="A9A9A4"/>
+          <w:sz w:val="90"/>
+          <w:szCs w:val="90"/>
+        </w:rPr>
+        <w:t xml:space="preserve">SE VOCÊ CONSEGUIR ENSINAR PARA MIM, </w:t>
+      </w:r>
+      <w:r>
+        <w:rPr>
+          <w:rFonts w:ascii="Bebas Neue" w:hAnsi="Bebas Neue" w:cs="Bebas Neue"/>
+          <w:caps/>
+          <w:color w:val="FFFFFF"/>
+          <w:sz w:val="90"/>
+          <w:szCs w:val="90"/>
+        </w:rPr>
+        <w:t xml:space="preserve">CONSEGUE ENSINAR PARA QUALQUER UM</w:t>
+      </w:r>
+      <w:r>
+        <w:rPr>
+          <w:rFonts w:ascii="Bebas Neue" w:hAnsi="Bebas Neue" w:cs="Bebas Neue"/>
+          <w:caps/>
+          <w:color w:val="A9A9A4"/>
+          <w:sz w:val="90"/>
+          <w:szCs w:val="90"/>
+        </w:rPr>
+        <w:t xml:space="preserve">.</w:t>
+      </w:r>
+    </w:p>
+    <w:p>
+      <w:pPr>
+        <w:spacing w:before="240" w:after="0"/>
+        <w:ind w:firstLine="0"/>
+        <w:jc w:val="left"/>
+      </w:pPr>
+      <w:r>
+        <w:rPr>
+          <w:rFonts w:ascii="Bebas Neue" w:hAnsi="Bebas Neue"/>
+          <w:caps/>
+          <w:color w:val="A9A9A4"/>
+          <w:spacing w:val="30"/>
+          <w:sz w:val="26"/>
+        </w:rPr>
+        <w:t xml:space="preserve">— KOUSUKE</w:t>
+      </w:r>
+    </w:p>
+    <w:p>
+      <w:r>
+        <w:br w:type="page"/>
+      </w:r>
+    </w:p>
+    <w:p>
+      <w:pPr>
         <w:spacing w:before="240" w:after="240"/>
         <w:ind w:firstLine="0"/>
         <w:jc w:val="center"/>
@@ -6129,6 +7682,110 @@
       </w:r>
     </w:p>
     <w:p>
+      <w:pPr>
+        <w:pageBreakBefore/>
+        <w:spacing w:before="0" w:after="0"/>
+        <w:ind w:firstLine="0"/>
+      </w:pPr>
+      <w:r>
+        <w:drawing>
+          <wp:anchor distT="0" distB="0" distL="0" distR="0" simplePos="0" relativeHeight="0" behindDoc="1" locked="1" layoutInCell="1" allowOverlap="1">
+            <wp:simplePos x="0" y="0"/>
+            <wp:positionH relativeFrom="page">
+              <wp:posOffset>0</wp:posOffset>
+            </wp:positionH>
+            <wp:positionV relativeFrom="page">
+              <wp:posOffset>0</wp:posOffset>
+            </wp:positionV>
+            <wp:extent cx="5029200" cy="7772400"/>
+            <wp:effectExtent l="0" t="0" r="0" b="0"/>
+            <wp:wrapNone/>
+            <wp:docPr id="1017" name="Destaque 1017"/>
+            <wp:cNvGraphicFramePr/>
+            <a:graphic xmlns:a="http://schemas.openxmlformats.org/drawingml/2006/main">
+              <a:graphicData uri="http://schemas.openxmlformats.org/drawingml/2006/picture">
+                <pic:pic xmlns:pic="http://schemas.openxmlformats.org/drawingml/2006/picture">
+                  <pic:nvPicPr>
+                    <pic:cNvPr id="1017" name="destaque_vinha_esq.png"/>
+                    <pic:cNvPicPr/>
+                  </pic:nvPicPr>
+                  <pic:blipFill>
+                    <a:blip r:embed="rIdImg5"/>
+                    <a:stretch>
+                      <a:fillRect/>
+                    </a:stretch>
+                  </pic:blipFill>
+                  <pic:spPr>
+                    <a:xfrm>
+                      <a:off x="0" y="0"/>
+                      <a:ext cx="5029200" cy="7772400"/>
+                    </a:xfrm>
+                    <a:prstGeom prst="rect">
+                      <a:avLst/>
+                    </a:prstGeom>
+                  </pic:spPr>
+                </pic:pic>
+              </a:graphicData>
+            </a:graphic>
+          </wp:anchor>
+        </w:drawing>
+      </w:r>
+    </w:p>
+    <w:p>
+      <w:pPr>
+        <w:spacing w:before="900" w:after="0" w:line="1183" w:lineRule="exact"/>
+        <w:ind w:firstLine="0"/>
+        <w:jc w:val="right"/>
+      </w:pPr>
+      <w:r>
+        <w:rPr>
+          <w:rFonts w:ascii="Bebas Neue" w:hAnsi="Bebas Neue" w:cs="Bebas Neue"/>
+          <w:caps/>
+          <w:color w:val="A9A9A4"/>
+          <w:sz w:val="116"/>
+          <w:szCs w:val="116"/>
+        </w:rPr>
+        <w:t xml:space="preserve">PARA ELA </w:t>
+      </w:r>
+      <w:r>
+        <w:rPr>
+          <w:rFonts w:ascii="Bebas Neue" w:hAnsi="Bebas Neue" w:cs="Bebas Neue"/>
+          <w:caps/>
+          <w:color w:val="FFFFFF"/>
+          <w:sz w:val="116"/>
+          <w:szCs w:val="116"/>
+        </w:rPr>
+        <w:t xml:space="preserve">NÃO IR EMBORA</w:t>
+      </w:r>
+      <w:r>
+        <w:rPr>
+          <w:rFonts w:ascii="Bebas Neue" w:hAnsi="Bebas Neue" w:cs="Bebas Neue"/>
+          <w:caps/>
+          <w:color w:val="A9A9A4"/>
+          <w:sz w:val="116"/>
+          <w:szCs w:val="116"/>
+        </w:rPr>
+        <w:t xml:space="preserve">.</w:t>
+      </w:r>
+    </w:p>
+    <w:p>
+      <w:pPr>
+        <w:spacing w:before="240" w:after="0"/>
+        <w:ind w:firstLine="0"/>
+        <w:jc w:val="right"/>
+      </w:pPr>
+      <w:r>
+        <w:rPr>
+          <w:rFonts w:ascii="Bebas Neue" w:hAnsi="Bebas Neue"/>
+          <w:caps/>
+          <w:color w:val="A9A9A4"/>
+          <w:spacing w:val="30"/>
+          <w:sz w:val="26"/>
+        </w:rPr>
+        <w:t xml:space="preserve">— A MITY</w:t>
+      </w:r>
+    </w:p>
+    <w:p>
       <w:r>
         <w:br w:type="page"/>
       </w:r>
@@ -6341,6 +7998,98 @@
     </w:p>
     <w:p>
       <w:pPr>
+        <w:pageBreakBefore/>
+        <w:spacing w:before="0" w:after="0"/>
+        <w:ind w:firstLine="0"/>
+      </w:pPr>
+      <w:r>
+        <w:drawing>
+          <wp:anchor distT="0" distB="0" distL="0" distR="0" simplePos="0" relativeHeight="0" behindDoc="1" locked="1" layoutInCell="1" allowOverlap="1">
+            <wp:simplePos x="0" y="0"/>
+            <wp:positionH relativeFrom="page">
+              <wp:posOffset>0</wp:posOffset>
+            </wp:positionH>
+            <wp:positionV relativeFrom="page">
+              <wp:posOffset>0</wp:posOffset>
+            </wp:positionV>
+            <wp:extent cx="5029200" cy="7772400"/>
+            <wp:effectExtent l="0" t="0" r="0" b="0"/>
+            <wp:wrapNone/>
+            <wp:docPr id="1018" name="Destaque 1018"/>
+            <wp:cNvGraphicFramePr/>
+            <a:graphic xmlns:a="http://schemas.openxmlformats.org/drawingml/2006/main">
+              <a:graphicData uri="http://schemas.openxmlformats.org/drawingml/2006/picture">
+                <pic:pic xmlns:pic="http://schemas.openxmlformats.org/drawingml/2006/picture">
+                  <pic:nvPicPr>
+                    <pic:cNvPr id="1018" name="destaque_ramo_dir.png"/>
+                    <pic:cNvPicPr/>
+                  </pic:nvPicPr>
+                  <pic:blipFill>
+                    <a:blip r:embed="rIdImg6"/>
+                    <a:stretch>
+                      <a:fillRect/>
+                    </a:stretch>
+                  </pic:blipFill>
+                  <pic:spPr>
+                    <a:xfrm>
+                      <a:off x="0" y="0"/>
+                      <a:ext cx="5029200" cy="7772400"/>
+                    </a:xfrm>
+                    <a:prstGeom prst="rect">
+                      <a:avLst/>
+                    </a:prstGeom>
+                  </pic:spPr>
+                </pic:pic>
+              </a:graphicData>
+            </a:graphic>
+          </wp:anchor>
+        </w:drawing>
+      </w:r>
+    </w:p>
+    <w:p>
+      <w:pPr>
+        <w:spacing w:before="900" w:after="0" w:line="846" w:lineRule="exact"/>
+        <w:ind w:firstLine="0"/>
+        <w:jc w:val="left"/>
+      </w:pPr>
+      <w:r>
+        <w:rPr>
+          <w:rFonts w:ascii="Bebas Neue" w:hAnsi="Bebas Neue" w:cs="Bebas Neue"/>
+          <w:caps/>
+          <w:color w:val="A9A9A4"/>
+          <w:sz w:val="82"/>
+          <w:szCs w:val="82"/>
+        </w:rPr>
+        <w:t xml:space="preserve">ERA UM MISTO DE </w:t>
+      </w:r>
+      <w:r>
+        <w:rPr>
+          <w:rFonts w:ascii="Bebas Neue" w:hAnsi="Bebas Neue" w:cs="Bebas Neue"/>
+          <w:caps/>
+          <w:color w:val="FFFFFF"/>
+          <w:sz w:val="82"/>
+          <w:szCs w:val="82"/>
+        </w:rPr>
+        <w:t xml:space="preserve">PAZ COM MEDO</w:t>
+      </w:r>
+      <w:r>
+        <w:rPr>
+          <w:rFonts w:ascii="Bebas Neue" w:hAnsi="Bebas Neue" w:cs="Bebas Neue"/>
+          <w:caps/>
+          <w:color w:val="A9A9A4"/>
+          <w:sz w:val="82"/>
+          <w:szCs w:val="82"/>
+        </w:rPr>
+        <w:t xml:space="preserve">. AS DUAS COISAS AO MESMO TEMPO, SEM UMA APAGAR A OUTRA.</w:t>
+      </w:r>
+    </w:p>
+    <w:p>
+      <w:r>
+        <w:br w:type="page"/>
+      </w:r>
+    </w:p>
+    <w:p>
+      <w:pPr>
         <w:spacing w:before="240" w:after="240"/>
         <w:ind w:firstLine="0"/>
         <w:jc w:val="center"/>
@@ -7147,6 +8896,93 @@
       </w:r>
     </w:p>
     <w:p>
+      <w:pPr>
+        <w:pageBreakBefore/>
+        <w:spacing w:before="0" w:after="0"/>
+        <w:ind w:firstLine="0"/>
+      </w:pPr>
+      <w:r>
+        <w:drawing>
+          <wp:anchor distT="0" distB="0" distL="0" distR="0" simplePos="0" relativeHeight="0" behindDoc="1" locked="1" layoutInCell="1" allowOverlap="1">
+            <wp:simplePos x="0" y="0"/>
+            <wp:positionH relativeFrom="page">
+              <wp:posOffset>0</wp:posOffset>
+            </wp:positionH>
+            <wp:positionV relativeFrom="page">
+              <wp:posOffset>0</wp:posOffset>
+            </wp:positionV>
+            <wp:extent cx="5029200" cy="7772400"/>
+            <wp:effectExtent l="0" t="0" r="0" b="0"/>
+            <wp:wrapNone/>
+            <wp:docPr id="1019" name="Destaque 1019"/>
+            <wp:cNvGraphicFramePr/>
+            <a:graphic xmlns:a="http://schemas.openxmlformats.org/drawingml/2006/main">
+              <a:graphicData uri="http://schemas.openxmlformats.org/drawingml/2006/picture">
+                <pic:pic xmlns:pic="http://schemas.openxmlformats.org/drawingml/2006/picture">
+                  <pic:nvPicPr>
+                    <pic:cNvPr id="1019" name="destaque_relogio_esq.png"/>
+                    <pic:cNvPicPr/>
+                  </pic:nvPicPr>
+                  <pic:blipFill>
+                    <a:blip r:embed="rIdImg1"/>
+                    <a:stretch>
+                      <a:fillRect/>
+                    </a:stretch>
+                  </pic:blipFill>
+                  <pic:spPr>
+                    <a:xfrm>
+                      <a:off x="0" y="0"/>
+                      <a:ext cx="5029200" cy="7772400"/>
+                    </a:xfrm>
+                    <a:prstGeom prst="rect">
+                      <a:avLst/>
+                    </a:prstGeom>
+                  </pic:spPr>
+                </pic:pic>
+              </a:graphicData>
+            </a:graphic>
+          </wp:anchor>
+        </w:drawing>
+      </w:r>
+    </w:p>
+    <w:p>
+      <w:pPr>
+        <w:spacing w:before="900" w:after="0" w:line="1183" w:lineRule="exact"/>
+        <w:ind w:firstLine="0"/>
+        <w:jc w:val="right"/>
+      </w:pPr>
+      <w:r>
+        <w:rPr>
+          <w:rFonts w:ascii="Bebas Neue" w:hAnsi="Bebas Neue" w:cs="Bebas Neue"/>
+          <w:caps/>
+          <w:color w:val="A9A9A4"/>
+          <w:sz w:val="116"/>
+          <w:szCs w:val="116"/>
+        </w:rPr>
+        <w:t xml:space="preserve">EU POSSO SER </w:t>
+      </w:r>
+      <w:r>
+        <w:rPr>
+          <w:rFonts w:ascii="Bebas Neue" w:hAnsi="Bebas Neue" w:cs="Bebas Neue"/>
+          <w:caps/>
+          <w:color w:val="FFFFFF"/>
+          <w:sz w:val="116"/>
+          <w:szCs w:val="116"/>
+        </w:rPr>
+        <w:t xml:space="preserve">FORTE E EXISTIR</w:t>
+      </w:r>
+      <w:r>
+        <w:rPr>
+          <w:rFonts w:ascii="Bebas Neue" w:hAnsi="Bebas Neue" w:cs="Bebas Neue"/>
+          <w:caps/>
+          <w:color w:val="A9A9A4"/>
+          <w:sz w:val="116"/>
+          <w:szCs w:val="116"/>
+        </w:rPr>
+        <w:t xml:space="preserve"> TAMBÉM?</w:t>
+      </w:r>
+    </w:p>
+    <w:p>
       <w:r>
         <w:br w:type="page"/>
       </w:r>
@@ -7409,6 +9245,93 @@
       </w:r>
     </w:p>
     <w:p>
+      <w:pPr>
+        <w:pageBreakBefore/>
+        <w:spacing w:before="0" w:after="0"/>
+        <w:ind w:firstLine="0"/>
+      </w:pPr>
+      <w:r>
+        <w:drawing>
+          <wp:anchor distT="0" distB="0" distL="0" distR="0" simplePos="0" relativeHeight="0" behindDoc="1" locked="1" layoutInCell="1" allowOverlap="1">
+            <wp:simplePos x="0" y="0"/>
+            <wp:positionH relativeFrom="page">
+              <wp:posOffset>0</wp:posOffset>
+            </wp:positionH>
+            <wp:positionV relativeFrom="page">
+              <wp:posOffset>0</wp:posOffset>
+            </wp:positionV>
+            <wp:extent cx="5029200" cy="7772400"/>
+            <wp:effectExtent l="0" t="0" r="0" b="0"/>
+            <wp:wrapNone/>
+            <wp:docPr id="1020" name="Destaque 1020"/>
+            <wp:cNvGraphicFramePr/>
+            <a:graphic xmlns:a="http://schemas.openxmlformats.org/drawingml/2006/main">
+              <a:graphicData uri="http://schemas.openxmlformats.org/drawingml/2006/picture">
+                <pic:pic xmlns:pic="http://schemas.openxmlformats.org/drawingml/2006/picture">
+                  <pic:nvPicPr>
+                    <pic:cNvPr id="1020" name="destaque_vinha_dir.png"/>
+                    <pic:cNvPicPr/>
+                  </pic:nvPicPr>
+                  <pic:blipFill>
+                    <a:blip r:embed="rIdImg2"/>
+                    <a:stretch>
+                      <a:fillRect/>
+                    </a:stretch>
+                  </pic:blipFill>
+                  <pic:spPr>
+                    <a:xfrm>
+                      <a:off x="0" y="0"/>
+                      <a:ext cx="5029200" cy="7772400"/>
+                    </a:xfrm>
+                    <a:prstGeom prst="rect">
+                      <a:avLst/>
+                    </a:prstGeom>
+                  </pic:spPr>
+                </pic:pic>
+              </a:graphicData>
+            </a:graphic>
+          </wp:anchor>
+        </w:drawing>
+      </w:r>
+    </w:p>
+    <w:p>
+      <w:pPr>
+        <w:spacing w:before="900" w:after="0" w:line="962" w:lineRule="exact"/>
+        <w:ind w:firstLine="0"/>
+        <w:jc w:val="left"/>
+      </w:pPr>
+      <w:r>
+        <w:rPr>
+          <w:rFonts w:ascii="Bebas Neue" w:hAnsi="Bebas Neue" w:cs="Bebas Neue"/>
+          <w:caps/>
+          <w:color w:val="A9A9A4"/>
+          <w:sz w:val="94"/>
+          <w:szCs w:val="94"/>
+        </w:rPr>
+        <w:t xml:space="preserve">EU SENTI O MEDO INTEIRO, </w:t>
+      </w:r>
+      <w:r>
+        <w:rPr>
+          <w:rFonts w:ascii="Bebas Neue" w:hAnsi="Bebas Neue" w:cs="Bebas Neue"/>
+          <w:caps/>
+          <w:color w:val="FFFFFF"/>
+          <w:sz w:val="94"/>
+          <w:szCs w:val="94"/>
+        </w:rPr>
+        <w:t xml:space="preserve">DO TAMANHO DO MEU CORPO</w:t>
+      </w:r>
+      <w:r>
+        <w:rPr>
+          <w:rFonts w:ascii="Bebas Neue" w:hAnsi="Bebas Neue" w:cs="Bebas Neue"/>
+          <w:caps/>
+          <w:color w:val="A9A9A4"/>
+          <w:sz w:val="94"/>
+          <w:szCs w:val="94"/>
+        </w:rPr>
+        <w:t xml:space="preserve">, SEM TIRAR NADA.</w:t>
+      </w:r>
+    </w:p>
+    <w:p>
       <w:r>
         <w:br w:type="page"/>
       </w:r>
@@ -7423,83 +9346,26 @@
       </w:r>
     </w:p>
     <w:p>
-      <w:r>
-        <w:t xml:space="preserve">A Mity tentou montar o cubo mágico durante três semanas, e durante três semanas o cubo voltou para a caixa desmontado.</w:t>
-      </w:r>
-    </w:p>
-    <w:p>
-      <w:r>
-        <w:t xml:space="preserve">Ela tinha visto o pai montando. O Kousuke tinha comprado um cubo para ele mesmo, sem motivo, numa loja de conveniência, e aprendido em poucos dias, com vídeos, anotando os movimentos num caderninho com a letra pequena de quem faz planilha. A Mity ficou olhando por cima do ombro dele e, no dia seguinte, pediu um cubo também. Tentava depois da escola, no sofá, com a língua no canto da boca. Conseguia uma face, às vezes duas, e na terceira tudo desmontava. O pai explicava de novo, com paciência, e ela bufava. No fim da terceira semana, jogou o cubo nas almofadas e disse que aquilo era impossível, que só o pai conseguia, que ela nunca ia conseguir.</w:t>
-      </w:r>
-    </w:p>
-    <w:p>
-      <w:pPr>
-        <w:ind w:firstLine="0"/>
-      </w:pPr>
-      <w:r>
-        <w:t xml:space="preserve">— Eu também vou aprender — eu disse.</w:t>
-      </w:r>
-    </w:p>
-    <w:p>
-      <w:r>
-        <w:t xml:space="preserve">Ela me olhou de lado, com aquela cara de pré-adolescente que eu tinha aprendido a temer.</w:t>
-      </w:r>
-    </w:p>
-    <w:p>
-      <w:pPr>
-        <w:ind w:firstLine="0"/>
-      </w:pPr>
-      <w:r>
-        <w:t xml:space="preserve">— Você, mãe?</w:t>
-      </w:r>
-    </w:p>
-    <w:p>
-      <w:pPr>
-        <w:ind w:firstLine="0"/>
-      </w:pPr>
-      <w:r>
-        <w:t xml:space="preserve">— Eu.</w:t>
-      </w:r>
-    </w:p>
-    <w:p>
-      <w:r>
-        <w:t xml:space="preserve">Eu não sabia montar nem uma face. Nunca tinha tido paciência para aquilo. Mas naquela noite, depois que as três dormiram, eu peguei o cubo dela nas almofadas, sentei no chão da sala com o celular apoiado na perna e abri um vídeo. Girei, errei, voltei o vídeo, girei de novo. Uma face. Desmontou. Uma face de novo. Duas. Desmontou tudo. O Kousuke passou para beber água à uma da manhã, olhou para mim sentada no chão com o cubo na mão, não disse nada e voltou para a cama.</w:t>
-      </w:r>
-    </w:p>
-    <w:p>
-      <w:r>
-        <w:t xml:space="preserve">Às três da manhã, a última peça encaixou. Seis faces, cada uma de uma cor. Eu fiquei olhando para aquilo nas minhas mãos como tinha olhado o carimbo do zeimusho de Kariya, sem acreditar. Não acordei ninguém. Pus o cubo montado em cima da mesa, no lugar exato onde a Mity sentava para tomar café, e fui dormir.</w:t>
-      </w:r>
-    </w:p>
-    <w:p>
-      <w:r>
-        <w:t xml:space="preserve">De manhã, a Mity viu o cubo. Olhou para ele um tempo. Depois olhou para mim, que fingia procurar o açúcar.</w:t>
-      </w:r>
-    </w:p>
-    <w:p>
-      <w:pPr>
-        <w:ind w:firstLine="0"/>
-      </w:pPr>
-      <w:r>
-        <w:t xml:space="preserve">— Foi você?</w:t>
-      </w:r>
-    </w:p>
-    <w:p>
-      <w:pPr>
-        <w:ind w:firstLine="0"/>
-      </w:pPr>
-      <w:r>
-        <w:t xml:space="preserve">— Às três da manhã.</w:t>
-      </w:r>
-    </w:p>
-    <w:p>
-      <w:r>
-        <w:t xml:space="preserve">Ela não disse nada. Desmontou o cubo inteiro, girando com força, e começou de novo. Naquela mesma semana, o Kousuke comprou para ela um curso de cubo mágico pela internet, e em menos de uma semana ela montava em um minuto. Depois em menos. A Ayumi, vendo a irmã, quis aprender também, e aprendeu, depois de muito brigar com o cubo. A Tiemi, vendo as duas, pediu um. Ela tinha dois anos e montava no nível mais fácil de todos, uma cor por vez, e cada vez que terminava levantava o cubo acima da cabeça e gritava, como quem ganhou uma copa do mundo.</w:t>
-      </w:r>
-    </w:p>
-    <w:p>
-      <w:r>
-        <w:t xml:space="preserve">Foi a única coisa daquele ano em que eu não estava correndo para outro lugar.</w:t>
+      <w:pPr>
+        <w:ind w:firstLine="0"/>
+      </w:pPr>
+      <w:r>
+        <w:t xml:space="preserve">Dois mil e vinte e cinco foi um ano de dez anos.</w:t>
+      </w:r>
+    </w:p>
+    <w:p>
+      <w:r>
+        <w:t xml:space="preserve">Oito países. Cursos, imersões, eventos, fotos bonitas em todos os lugares. E uma empresa nova, só minha, que eu comecei a montar no meio do ano, sem pedir licença a ninguém, com a mesma certeza com que tinha comprado o curso de oito mil reais às duas da manhã. Quando eu quero, eu quero. E agora.</w:t>
+      </w:r>
+    </w:p>
+    <w:p>
+      <w:r>
+        <w:t xml:space="preserve">Em outubro, eu assinei o contrato de aluguel de uma sala comercial para essa empresa. Uma sala pequena, clara, no segundo andar de um prédio perto da estação. Assinei numa terça-feira, com o carimbo que eu tinha finalmente aprendido a usar, e deixei a cópia do contrato no porta-luvas do carro, porque ia contar ao Kousuke no fim de semana, quando tivesse tempo.</w:t>
+      </w:r>
+    </w:p>
+    <w:p>
+      <w:r>
+        <w:t xml:space="preserve">Ele achou o contrato na quinta, procurando o recibo do pedágio.</w:t>
       </w:r>
     </w:p>
     <w:p>
@@ -7517,22 +9383,219 @@
         <w:ind w:firstLine="0"/>
       </w:pPr>
       <w:r>
-        <w:t xml:space="preserve">Dois mil e vinte e cinco foi um ano de dez anos.</w:t>
-      </w:r>
-    </w:p>
-    <w:p>
-      <w:r>
-        <w:t xml:space="preserve">Oito países. Cursos, imersões, eventos, fotos bonitas em todos os lugares. E uma empresa nova, só minha, que eu comecei a montar no meio do ano, sem pedir licença a ninguém, com a mesma certeza com que tinha comprado o curso de oito mil reais às duas da manhã. Quando eu quero, eu quero. E agora.</w:t>
-      </w:r>
-    </w:p>
-    <w:p>
-      <w:r>
-        <w:t xml:space="preserve">Em outubro, eu assinei o contrato de aluguel de uma sala comercial para essa empresa. Uma sala pequena, clara, no segundo andar de um prédio perto da estação. Assinei numa terça-feira, com o carimbo que eu tinha finalmente aprendido a usar, e deixei a cópia do contrato no porta-luvas do carro, porque ia contar ao Kousuke no fim de semana, quando tivesse tempo.</w:t>
-      </w:r>
-    </w:p>
-    <w:p>
-      <w:r>
-        <w:t xml:space="preserve">Ele achou o contrato na quinta, procurando o recibo do pedágio.</w:t>
+        <w:t xml:space="preserve">Eu estava na cozinha quando ele entrou com o papel na mão. As meninas dormiam. A louça do jantar estava na pia, esperando. Ele pôs o contrato em cima da mesa, alisou a dobra com a palma da mão, e ficou de pé, olhando para ele.</w:t>
+      </w:r>
+    </w:p>
+    <w:p>
+      <w:pPr>
+        <w:ind w:firstLine="0"/>
+      </w:pPr>
+      <w:r>
+        <w:t xml:space="preserve">— Quando você ia me contar?</w:t>
+      </w:r>
+    </w:p>
+    <w:p>
+      <w:pPr>
+        <w:ind w:firstLine="0"/>
+      </w:pPr>
+      <w:r>
+        <w:t xml:space="preserve">— No sábado.</w:t>
+      </w:r>
+    </w:p>
+    <w:p>
+      <w:pPr>
+        <w:ind w:firstLine="0"/>
+      </w:pPr>
+      <w:r>
+        <w:t xml:space="preserve">— Você assinou na terça.</w:t>
+      </w:r>
+    </w:p>
+    <w:p>
+      <w:pPr>
+        <w:ind w:firstLine="0"/>
+      </w:pPr>
+      <w:r>
+        <w:t xml:space="preserve">— Eu estava sem tempo, Kousuke. Você sabe como foi a semana.</w:t>
+      </w:r>
+    </w:p>
+    <w:p>
+      <w:pPr>
+        <w:ind w:firstLine="0"/>
+      </w:pPr>
+      <w:r>
+        <w:t xml:space="preserve">— Eu sei como foi a semana. Eu estava nela.</w:t>
+      </w:r>
+    </w:p>
+    <w:p>
+      <w:r>
+        <w:t xml:space="preserve">Eu comecei a explicar. Tinha a explicação pronta, como sempre: o preço bom, a localização, o prazo curto, a oportunidade que não ia esperar, a planilha que eu mesma tinha feito e que fechava. Falei sem parar, com a voz subindo, do jeito que eu falava no tempo do recado de estatística. Ele deixou eu falar. Sempre deixava.</w:t>
+      </w:r>
+    </w:p>
+    <w:p>
+      <w:pPr>
+        <w:ind w:firstLine="0"/>
+      </w:pPr>
+      <w:r>
+        <w:t xml:space="preserve">Quando eu parei, ele não respondeu nada sobre a sala.</w:t>
+      </w:r>
+    </w:p>
+    <w:p>
+      <w:pPr>
+        <w:ind w:firstLine="0"/>
+      </w:pPr>
+      <w:r>
+        <w:t xml:space="preserve">— Sabe o que eu fiz a vida inteira, Lu?</w:t>
+      </w:r>
+    </w:p>
+    <w:p>
+      <w:pPr>
+        <w:ind w:firstLine="0"/>
+      </w:pPr>
+      <w:r>
+        <w:t xml:space="preserve">Eu não respondi.</w:t>
+      </w:r>
+    </w:p>
+    <w:p>
+      <w:pPr>
+        <w:ind w:firstLine="0"/>
+      </w:pPr>
+      <w:r>
+        <w:t xml:space="preserve">— Andei dez passos atrás de você. — Ele disse devagar, sem levantar a voz. — Desde a praça da matriz. Você ia na frente, sozinha, e eu ia atrás, para você não andar sozinha. E eu achava bonito. Eu achava que era isso que eu tinha que fazer.</w:t>
+      </w:r>
+    </w:p>
+    <w:p>
+      <w:pPr>
+        <w:ind w:firstLine="0"/>
+      </w:pPr>
+      <w:r>
+        <w:t xml:space="preserve">— E não era?</w:t>
+      </w:r>
+    </w:p>
+    <w:p>
+      <w:pPr>
+        <w:ind w:firstLine="0"/>
+      </w:pPr>
+      <w:r>
+        <w:t xml:space="preserve">— Eu cansei, Lu. — Ele pôs as duas mãos na mesa, dos dois lados do contrato. — Eu cansei de andar atrás. Eu queria andar do lado. Você não deixa. Você nunca deixou ninguém fazer nada por você. Nem eu.</w:t>
+      </w:r>
+    </w:p>
+    <w:p>
+      <w:r>
+        <w:t xml:space="preserve">Eu abri a boca e a resposta que saiu foi a errada. Saiu a lista. O que eu tinha feito, por quem, quando. O pai, a mãe, as meninas, a fábrica, a empresa, os clientes às duas da manhã. Eu listei tudo, com os dedos, como quem apresenta prova num tribunal.</w:t>
+      </w:r>
+    </w:p>
+    <w:p>
+      <w:r>
+        <w:t xml:space="preserve">Ele ouviu até o fim. Depois pegou um travesseiro no quarto e foi dormir no sofá.</w:t>
+      </w:r>
+    </w:p>
+    <w:p>
+      <w:r>
+        <w:t xml:space="preserve">Nas semanas seguintes, a gente continuou trabalhando junto. Continuou respondendo cliente, levando as meninas na escola, jantando na mesma mesa. Mas falava só o necessário, pelo celular, mesmo estando na mesma casa. Em novembro, eu comprei uma passagem para o Brasil, para um curso de uma semana em São Paulo. Contei a ele depois de comprar. Ele disse "tudo bem", com a mesma voz com que tinha dito "tudo bem" no tempo do "então escolhe". Uma amiga da igreja, a Lê, ficou com as meninas.</w:t>
+      </w:r>
+    </w:p>
+    <w:p>
+      <w:r>
+        <w:t xml:space="preserve">Eu embarquei com a sensação de quem sai de casa brigada e finge que está só viajando. Não pensei, na hora, que já tinha feito aquilo uma vez, no estacionamento de um supermercado, com duas meninas dormindo no banco de trás.</w:t>
+      </w:r>
+    </w:p>
+    <w:p>
+      <w:pPr>
+        <w:pageBreakBefore/>
+        <w:spacing w:before="0" w:after="0"/>
+        <w:ind w:firstLine="0"/>
+      </w:pPr>
+      <w:r>
+        <w:drawing>
+          <wp:anchor distT="0" distB="0" distL="0" distR="0" simplePos="0" relativeHeight="0" behindDoc="1" locked="1" layoutInCell="1" allowOverlap="1">
+            <wp:simplePos x="0" y="0"/>
+            <wp:positionH relativeFrom="page">
+              <wp:posOffset>0</wp:posOffset>
+            </wp:positionH>
+            <wp:positionV relativeFrom="page">
+              <wp:posOffset>0</wp:posOffset>
+            </wp:positionV>
+            <wp:extent cx="5029200" cy="7772400"/>
+            <wp:effectExtent l="0" t="0" r="0" b="0"/>
+            <wp:wrapNone/>
+            <wp:docPr id="1021" name="Destaque 1021"/>
+            <wp:cNvGraphicFramePr/>
+            <a:graphic xmlns:a="http://schemas.openxmlformats.org/drawingml/2006/main">
+              <a:graphicData uri="http://schemas.openxmlformats.org/drawingml/2006/picture">
+                <pic:pic xmlns:pic="http://schemas.openxmlformats.org/drawingml/2006/picture">
+                  <pic:nvPicPr>
+                    <pic:cNvPr id="1021" name="destaque_ramo_esq.png"/>
+                    <pic:cNvPicPr/>
+                  </pic:nvPicPr>
+                  <pic:blipFill>
+                    <a:blip r:embed="rIdImg3"/>
+                    <a:stretch>
+                      <a:fillRect/>
+                    </a:stretch>
+                  </pic:blipFill>
+                  <pic:spPr>
+                    <a:xfrm>
+                      <a:off x="0" y="0"/>
+                      <a:ext cx="5029200" cy="7772400"/>
+                    </a:xfrm>
+                    <a:prstGeom prst="rect">
+                      <a:avLst/>
+                    </a:prstGeom>
+                  </pic:spPr>
+                </pic:pic>
+              </a:graphicData>
+            </a:graphic>
+          </wp:anchor>
+        </w:drawing>
+      </w:r>
+    </w:p>
+    <w:p>
+      <w:pPr>
+        <w:spacing w:before="900" w:after="0" w:line="1097" w:lineRule="exact"/>
+        <w:ind w:firstLine="0"/>
+        <w:jc w:val="right"/>
+      </w:pPr>
+      <w:r>
+        <w:rPr>
+          <w:rFonts w:ascii="Bebas Neue" w:hAnsi="Bebas Neue" w:cs="Bebas Neue"/>
+          <w:caps/>
+          <w:color w:val="A9A9A4"/>
+          <w:sz w:val="106"/>
+          <w:szCs w:val="106"/>
+        </w:rPr>
+        <w:t xml:space="preserve">EU CANSEI DE ANDAR ATRÁS. </w:t>
+      </w:r>
+      <w:r>
+        <w:rPr>
+          <w:rFonts w:ascii="Bebas Neue" w:hAnsi="Bebas Neue" w:cs="Bebas Neue"/>
+          <w:caps/>
+          <w:color w:val="FFFFFF"/>
+          <w:sz w:val="106"/>
+          <w:szCs w:val="106"/>
+        </w:rPr>
+        <w:t xml:space="preserve">EU QUERIA ANDAR DO LADO.</w:t>
+      </w:r>
+    </w:p>
+    <w:p>
+      <w:pPr>
+        <w:spacing w:before="240" w:after="0"/>
+        <w:ind w:firstLine="0"/>
+        <w:jc w:val="right"/>
+      </w:pPr>
+      <w:r>
+        <w:rPr>
+          <w:rFonts w:ascii="Bebas Neue" w:hAnsi="Bebas Neue"/>
+          <w:caps/>
+          <w:color w:val="A9A9A4"/>
+          <w:spacing w:val="30"/>
+          <w:sz w:val="26"/>
+        </w:rPr>
+        <w:t xml:space="preserve">— KOUSUKE</w:t>
+      </w:r>
+    </w:p>
+    <w:p>
+      <w:r>
+        <w:br w:type="page"/>
       </w:r>
     </w:p>
     <w:p>
@@ -7550,120 +9613,88 @@
         <w:ind w:firstLine="0"/>
       </w:pPr>
       <w:r>
-        <w:t xml:space="preserve">Eu estava na cozinha quando ele entrou com o papel na mão. As meninas dormiam. A louça do jantar estava na pia, esperando. Ele pôs o contrato em cima da mesa, alisou a dobra com a palma da mão, e ficou de pé, olhando para ele.</w:t>
-      </w:r>
-    </w:p>
-    <w:p>
-      <w:pPr>
-        <w:ind w:firstLine="0"/>
-      </w:pPr>
-      <w:r>
-        <w:t xml:space="preserve">— Quando você ia me contar?</w:t>
-      </w:r>
-    </w:p>
-    <w:p>
-      <w:pPr>
-        <w:ind w:firstLine="0"/>
-      </w:pPr>
-      <w:r>
-        <w:t xml:space="preserve">— No sábado.</w:t>
-      </w:r>
-    </w:p>
-    <w:p>
-      <w:pPr>
-        <w:ind w:firstLine="0"/>
-      </w:pPr>
-      <w:r>
-        <w:t xml:space="preserve">— Você assinou na terça.</w:t>
-      </w:r>
-    </w:p>
-    <w:p>
-      <w:pPr>
-        <w:ind w:firstLine="0"/>
-      </w:pPr>
-      <w:r>
-        <w:t xml:space="preserve">— Eu estava sem tempo, Kousuke. Você sabe como foi a semana.</w:t>
-      </w:r>
-    </w:p>
-    <w:p>
-      <w:pPr>
-        <w:ind w:firstLine="0"/>
-      </w:pPr>
-      <w:r>
-        <w:t xml:space="preserve">— Eu sei como foi a semana. Eu estava nela.</w:t>
-      </w:r>
-    </w:p>
-    <w:p>
-      <w:r>
-        <w:t xml:space="preserve">Eu comecei a explicar. Tinha a explicação pronta, como sempre: o preço bom, a localização, o prazo curto, a oportunidade que não ia esperar, a planilha que eu mesma tinha feito e que fechava. Falei sem parar, com a voz subindo, do jeito que eu falava no tempo do recado de estatística. Ele deixou eu falar. Sempre deixava.</w:t>
-      </w:r>
-    </w:p>
-    <w:p>
-      <w:pPr>
-        <w:ind w:firstLine="0"/>
-      </w:pPr>
-      <w:r>
-        <w:t xml:space="preserve">Quando eu parei, ele não respondeu nada sobre a sala.</w:t>
-      </w:r>
-    </w:p>
-    <w:p>
-      <w:pPr>
-        <w:ind w:firstLine="0"/>
-      </w:pPr>
-      <w:r>
-        <w:t xml:space="preserve">— Sabe o que eu fiz a vida inteira, Lu?</w:t>
-      </w:r>
-    </w:p>
-    <w:p>
-      <w:pPr>
-        <w:ind w:firstLine="0"/>
-      </w:pPr>
-      <w:r>
-        <w:t xml:space="preserve">Eu não respondi.</w:t>
-      </w:r>
-    </w:p>
-    <w:p>
-      <w:pPr>
-        <w:ind w:firstLine="0"/>
-      </w:pPr>
-      <w:r>
-        <w:t xml:space="preserve">— Andei dez passos atrás de você. — Ele disse devagar, sem levantar a voz. — Desde a praça da matriz. Você ia na frente, sozinha, e eu ia atrás, para você não andar sozinha. E eu achava bonito. Eu achava que era isso que eu tinha que fazer.</w:t>
-      </w:r>
-    </w:p>
-    <w:p>
-      <w:pPr>
-        <w:ind w:firstLine="0"/>
-      </w:pPr>
-      <w:r>
-        <w:t xml:space="preserve">— E não era?</w:t>
-      </w:r>
-    </w:p>
-    <w:p>
-      <w:pPr>
-        <w:ind w:firstLine="0"/>
-      </w:pPr>
-      <w:r>
-        <w:t xml:space="preserve">— Eu cansei, Lu. — Ele pôs as duas mãos na mesa, dos dois lados do contrato. — Eu cansei de andar atrás. Eu queria andar do lado. Você não deixa. Você nunca deixou ninguém fazer nada por você. Nem eu.</w:t>
-      </w:r>
-    </w:p>
-    <w:p>
-      <w:r>
-        <w:t xml:space="preserve">Eu abri a boca e a resposta que saiu foi a errada. Saiu a lista. O que eu tinha feito, por quem, quando. O pai, a mãe, as meninas, a fábrica, a empresa, os clientes às duas da manhã. Eu listei tudo, com os dedos, como quem apresenta prova num tribunal.</w:t>
-      </w:r>
-    </w:p>
-    <w:p>
-      <w:r>
-        <w:t xml:space="preserve">Ele ouviu até o fim. Depois pegou um travesseiro no quarto e foi dormir no sofá.</w:t>
-      </w:r>
-    </w:p>
-    <w:p>
-      <w:r>
-        <w:t xml:space="preserve">Nas semanas seguintes, a gente continuou trabalhando junto. Continuou respondendo cliente, levando as meninas na escola, jantando na mesma mesa. Mas falava só o necessário, pelo celular, mesmo estando na mesma casa. Em novembro, eu comprei uma passagem para o Brasil, para um curso de uma semana em São Paulo. Contei a ele depois de comprar. Ele disse "tudo bem", com a mesma voz com que tinha dito "tudo bem" no tempo do "então escolhe". Uma amiga da igreja, a Lê, ficou com as meninas.</w:t>
-      </w:r>
-    </w:p>
-    <w:p>
-      <w:r>
-        <w:t xml:space="preserve">Eu embarquei com a sensação de quem sai de casa brigada e finge que está só viajando. Não pensei, na hora, que já tinha feito aquilo uma vez, no estacionamento de um supermercado, com duas meninas dormindo no banco de trás.</w:t>
+        <w:t xml:space="preserve">No sábado depois do curso, fui ver meu pai.</w:t>
+      </w:r>
+    </w:p>
+    <w:p>
+      <w:r>
+        <w:t xml:space="preserve">Ele morava sozinho num apartamento pequeno, no térreo, com uma janela que dava para uma árvore e não para a parede de outro prédio. Tinha setenta e poucos anos, o cabelo todo branco, ainda penteado de lado, os óculos de sempre, a camisa com um botão a mais aberto. Abriu a porta e ficou me olhando, como no dia em que acordou na UTI, como quem confere se aquilo é mesmo quem ele acha que é.</w:t>
+      </w:r>
+    </w:p>
+    <w:p>
+      <w:r>
+        <w:t xml:space="preserve">Na estante da sala, entre uns porta-retratos e um rádio de pilha, estava a caneca branca de asa colada.</w:t>
+      </w:r>
+    </w:p>
+    <w:p>
+      <w:pPr>
+        <w:ind w:firstLine="0"/>
+      </w:pPr>
+      <w:r>
+        <w:t xml:space="preserve">— O senhor ainda tem isso?</w:t>
+      </w:r>
+    </w:p>
+    <w:p>
+      <w:pPr>
+        <w:ind w:firstLine="0"/>
+      </w:pPr>
+      <w:r>
+        <w:t xml:space="preserve">— Colei de novo umas duas vezes. — Ele pegou a caneca e virou, mostrando as marcas amarelas da cola na asa. — Sua mãe queria jogar fora. Eu não deixei.</w:t>
+      </w:r>
+    </w:p>
+    <w:p>
+      <w:r>
+        <w:t xml:space="preserve">Ele fez café e me serviu na caneca. Depois pegou o celular, pôs os óculos na ponta do nariz e, com o dedo indicador, devagar, procurou alguma coisa. Me mostrou. Era o vídeo do bungee de Gifu, que eu tinha postado dois anos antes: eu de macacão vermelho, caindo e gritando.</w:t>
+      </w:r>
+    </w:p>
+    <w:p>
+      <w:pPr>
+        <w:ind w:firstLine="0"/>
+      </w:pPr>
+      <w:r>
+        <w:t xml:space="preserve">— Eu vejo isso de vez em quando — disse ele. — Você grita o tempo inteiro.</w:t>
+      </w:r>
+    </w:p>
+    <w:p>
+      <w:pPr>
+        <w:ind w:firstLine="0"/>
+      </w:pPr>
+      <w:r>
+        <w:t xml:space="preserve">— Grito.</w:t>
+      </w:r>
+    </w:p>
+    <w:p>
+      <w:pPr>
+        <w:ind w:firstLine="0"/>
+      </w:pPr>
+      <w:r>
+        <w:t xml:space="preserve">— Puxou a minha mãe. — Ele riu com os ombros, sem som, do jeito de sempre. — Ela também não parava de gritar quando ficava brava.</w:t>
+      </w:r>
+    </w:p>
+    <w:p>
+      <w:r>
+        <w:t xml:space="preserve">Eu ri também. Depois ele perguntou do Kousuke, e eu disse que estava tudo ótimo. Ele ficou me olhando por cima dos óculos um tempo, com a caneca na mão.</w:t>
+      </w:r>
+    </w:p>
+    <w:p>
+      <w:pPr>
+        <w:ind w:firstLine="0"/>
+      </w:pPr>
+      <w:r>
+        <w:t xml:space="preserve">— Filha. Eu passei trinta dias num monte. — Pôs a caneca na mesinha. — Lá ninguém dizia que estava tudo ótimo.</w:t>
+      </w:r>
+    </w:p>
+    <w:p>
+      <w:r>
+        <w:t xml:space="preserve">Eu não respondi. Ele também não disse mais nada sobre isso. Na saída, na porta, me deu um abraço curto, meio de lado, e disse para eu passar na casa da minha mãe antes de voltar.</w:t>
+      </w:r>
+    </w:p>
+    <w:p>
+      <w:pPr>
+        <w:ind w:firstLine="0"/>
+      </w:pPr>
+      <w:r>
+        <w:t xml:space="preserve">— E deixa ela falar — disse. — Você nunca deixa ninguém falar.</w:t>
       </w:r>
     </w:p>
     <w:p>
@@ -7681,88 +9712,247 @@
         <w:ind w:firstLine="0"/>
       </w:pPr>
       <w:r>
-        <w:t xml:space="preserve">No sábado depois do curso, fui ver meu pai.</w:t>
-      </w:r>
-    </w:p>
-    <w:p>
-      <w:r>
-        <w:t xml:space="preserve">Ele morava sozinho num apartamento pequeno, no térreo, com uma janela que dava para uma árvore e não para a parede de outro prédio. Tinha setenta e poucos anos, o cabelo todo branco, ainda penteado de lado, os óculos de sempre, a camisa com um botão a mais aberto. Abriu a porta e ficou me olhando, como no dia em que acordou na UTI, como quem confere se aquilo é mesmo quem ele acha que é.</w:t>
-      </w:r>
-    </w:p>
-    <w:p>
-      <w:r>
-        <w:t xml:space="preserve">Na estante da sala, entre uns porta-retratos e um rádio de pilha, estava a caneca branca de asa colada.</w:t>
-      </w:r>
-    </w:p>
-    <w:p>
-      <w:pPr>
-        <w:ind w:firstLine="0"/>
-      </w:pPr>
-      <w:r>
-        <w:t xml:space="preserve">— O senhor ainda tem isso?</w:t>
-      </w:r>
-    </w:p>
-    <w:p>
-      <w:pPr>
-        <w:ind w:firstLine="0"/>
-      </w:pPr>
-      <w:r>
-        <w:t xml:space="preserve">— Colei de novo umas duas vezes. — Ele pegou a caneca e virou, mostrando as marcas amarelas da cola na asa. — Sua mãe queria jogar fora. Eu não deixei.</w:t>
-      </w:r>
-    </w:p>
-    <w:p>
-      <w:r>
-        <w:t xml:space="preserve">Ele fez café e me serviu na caneca. Depois pegou o celular, pôs os óculos na ponta do nariz e, com o dedo indicador, devagar, procurou alguma coisa. Me mostrou. Era o vídeo do bungee de Gifu, que eu tinha postado dois anos antes: eu de macacão vermelho, caindo e gritando.</w:t>
-      </w:r>
-    </w:p>
-    <w:p>
-      <w:pPr>
-        <w:ind w:firstLine="0"/>
-      </w:pPr>
-      <w:r>
-        <w:t xml:space="preserve">— Eu vejo isso de vez em quando — disse ele. — Você grita o tempo inteiro.</w:t>
-      </w:r>
-    </w:p>
-    <w:p>
-      <w:pPr>
-        <w:ind w:firstLine="0"/>
-      </w:pPr>
-      <w:r>
-        <w:t xml:space="preserve">— Grito.</w:t>
-      </w:r>
-    </w:p>
-    <w:p>
-      <w:pPr>
-        <w:ind w:firstLine="0"/>
-      </w:pPr>
-      <w:r>
-        <w:t xml:space="preserve">— Puxou a minha mãe. — Ele riu com os ombros, sem som, do jeito de sempre. — Ela também não parava de gritar quando ficava brava.</w:t>
-      </w:r>
-    </w:p>
-    <w:p>
-      <w:r>
-        <w:t xml:space="preserve">Eu ri também. Depois ele perguntou do Kousuke, e eu disse que estava tudo ótimo. Ele ficou me olhando por cima dos óculos um tempo, com a caneca na mão.</w:t>
-      </w:r>
-    </w:p>
-    <w:p>
-      <w:pPr>
-        <w:ind w:firstLine="0"/>
-      </w:pPr>
-      <w:r>
-        <w:t xml:space="preserve">— Filha. Eu passei trinta dias num monte. — Pôs a caneca na mesinha. — Lá ninguém dizia que estava tudo ótimo.</w:t>
-      </w:r>
-    </w:p>
-    <w:p>
-      <w:r>
-        <w:t xml:space="preserve">Eu não respondi. Ele também não disse mais nada sobre isso. Na saída, na porta, me deu um abraço curto, meio de lado, e disse para eu passar na casa da minha mãe antes de voltar.</w:t>
-      </w:r>
-    </w:p>
-    <w:p>
-      <w:pPr>
-        <w:ind w:firstLine="0"/>
-      </w:pPr>
-      <w:r>
-        <w:t xml:space="preserve">— E deixa ela falar — disse. — Você nunca deixa ninguém falar.</w:t>
+        <w:t xml:space="preserve">Minha mãe estava na cozinha, de avental, fazendo nishime numa panela grande. O Marcos estava sentado à mesa, tomando café, com a mesma cara de quando era menino e esperava o pudim.</w:t>
+      </w:r>
+    </w:p>
+    <w:p>
+      <w:r>
+        <w:t xml:space="preserve">Eu cheguei falando. Falei do curso, das coisas que eu ia mudar, do que o Kousuke devia entender, do que o Kousuke não entendia, da sala, do contrato, do travesseiro no sofá. Falei vinte minutos sem parar, enquanto minha mãe mexia a panela e o Marcos mexia o café.</w:t>
+      </w:r>
+    </w:p>
+    <w:p>
+      <w:r>
+        <w:t xml:space="preserve">Quando eu parei para respirar, o Marcos pôs a xícara na mesa.</w:t>
+      </w:r>
+    </w:p>
+    <w:p>
+      <w:pPr>
+        <w:ind w:firstLine="0"/>
+      </w:pPr>
+      <w:r>
+        <w:t xml:space="preserve">— Lu. Você já parou para pensar que você também erra?</w:t>
+      </w:r>
+    </w:p>
+    <w:p>
+      <w:pPr>
+        <w:ind w:firstLine="0"/>
+      </w:pPr>
+      <w:r>
+        <w:t xml:space="preserve">— Eu erro. Todo mundo erra.</w:t>
+      </w:r>
+    </w:p>
+    <w:p>
+      <w:pPr>
+        <w:ind w:firstLine="0"/>
+      </w:pPr>
+      <w:r>
+        <w:t xml:space="preserve">— Você falou do Kousuke vinte minutos. Não falou uma vez de você.</w:t>
+      </w:r>
+    </w:p>
+    <w:p>
+      <w:r>
+        <w:t xml:space="preserve">Eu olhei para a minha mãe, esperando que ela me defendesse. Ela tampou a panela, bateu a colher de pau duas vezes na borda, enxugou as mãos no avental e sentou do outro lado da mesa.</w:t>
+      </w:r>
+    </w:p>
+    <w:p>
+      <w:pPr>
+        <w:ind w:firstLine="0"/>
+      </w:pPr>
+      <w:r>
+        <w:t xml:space="preserve">— Filha. Lembra do hospital, lá no Japão? Do dia da cirurgia?</w:t>
+      </w:r>
+    </w:p>
+    <w:p>
+      <w:pPr>
+        <w:ind w:firstLine="0"/>
+      </w:pPr>
+      <w:r>
+        <w:t xml:space="preserve">— Lembro.</w:t>
+      </w:r>
+    </w:p>
+    <w:p>
+      <w:pPr>
+        <w:ind w:firstLine="0"/>
+      </w:pPr>
+      <w:r>
+        <w:t xml:space="preserve">— Você me disse que tinha sido tudo ótimo.</w:t>
+      </w:r>
+    </w:p>
+    <w:p>
+      <w:r>
+        <w:t xml:space="preserve">Eu senti o chão da cozinha inclinar, como o pátio do pré.</w:t>
+      </w:r>
+    </w:p>
+    <w:p>
+      <w:pPr>
+        <w:ind w:firstLine="0"/>
+      </w:pPr>
+      <w:r>
+        <w:t xml:space="preserve">— A senhora lembra disso?</w:t>
+      </w:r>
+    </w:p>
+    <w:p>
+      <w:pPr>
+        <w:ind w:firstLine="0"/>
+      </w:pPr>
+      <w:r>
+        <w:t xml:space="preserve">— Naquela noite, o médico passou no quarto e falou com a enfermeira do lado da minha cama, achando que eu estava dormindo. — Ela disse sem mágoa, arrumando a toalha da mesa com a mão, como quem alisa um lençol. — Japonês eu entendo mais do que vocês pensam. Cresci ouvindo minha mãe brigar com meu pai nessa língua.</w:t>
+      </w:r>
+    </w:p>
+    <w:p>
+      <w:pPr>
+        <w:ind w:firstLine="0"/>
+      </w:pPr>
+      <w:r>
+        <w:t xml:space="preserve">— A senhora sabia?</w:t>
+      </w:r>
+    </w:p>
+    <w:p>
+      <w:pPr>
+        <w:ind w:firstLine="0"/>
+      </w:pPr>
+      <w:r>
+        <w:t xml:space="preserve">— Mãe sabe.</w:t>
+      </w:r>
+    </w:p>
+    <w:p>
+      <w:pPr>
+        <w:ind w:firstLine="0"/>
+      </w:pPr>
+      <w:r>
+        <w:t xml:space="preserve">— E por que a senhora não disse nada?</w:t>
+      </w:r>
+    </w:p>
+    <w:p>
+      <w:pPr>
+        <w:ind w:firstLine="0"/>
+      </w:pPr>
+      <w:r>
+        <w:t xml:space="preserve">— Porque você precisava que tivesse sido ótimo. E eu também. — Ela deu de ombros. — Você é orgulhosa, filha. Igualzinha a mim. Pessoa orgulhosa acha que está se protegendo, e só está se escondendo.</w:t>
+      </w:r>
+    </w:p>
+    <w:p>
+      <w:r>
+        <w:t xml:space="preserve">Eu quis responder. Tinha a resposta pronta. Abri a boca e o que saiu foi o choro.</w:t>
+      </w:r>
+    </w:p>
+    <w:p>
+      <w:r>
+        <w:t xml:space="preserve">O choro que eu não tinha tido na sala do infarto, no corredor do pronto-socorro, no banheiro do hospital japonês, no estacionamento do aeroporto. Veio de uma vez, sentada na cozinha da minha mãe, com o cheiro do nishime, na frente do meu irmão, que não sabia o que fazer com as mãos e acabou pondo uma delas no meu ombro, desajeitado, pesada, do jeito que o Kousuke punha a mão nas minhas costas no futon do primeiro Japão.</w:t>
+      </w:r>
+    </w:p>
+    <w:p>
+      <w:r>
+        <w:t xml:space="preserve">Minha mãe não me abraçou. Pôs uma xícara de café na minha frente, com açúcar, do jeito que eu tomava aos quinze anos, e ficou sentada do outro lado da mesa, olhando para mim com aquela cara do hospital.</w:t>
+      </w:r>
+    </w:p>
+    <w:p>
+      <w:pPr>
+        <w:pageBreakBefore/>
+        <w:spacing w:before="0" w:after="0"/>
+        <w:ind w:firstLine="0"/>
+      </w:pPr>
+      <w:r>
+        <w:drawing>
+          <wp:anchor distT="0" distB="0" distL="0" distR="0" simplePos="0" relativeHeight="0" behindDoc="1" locked="1" layoutInCell="1" allowOverlap="1">
+            <wp:simplePos x="0" y="0"/>
+            <wp:positionH relativeFrom="page">
+              <wp:posOffset>0</wp:posOffset>
+            </wp:positionH>
+            <wp:positionV relativeFrom="page">
+              <wp:posOffset>0</wp:posOffset>
+            </wp:positionV>
+            <wp:extent cx="5029200" cy="7772400"/>
+            <wp:effectExtent l="0" t="0" r="0" b="0"/>
+            <wp:wrapNone/>
+            <wp:docPr id="1022" name="Destaque 1022"/>
+            <wp:cNvGraphicFramePr/>
+            <a:graphic xmlns:a="http://schemas.openxmlformats.org/drawingml/2006/main">
+              <a:graphicData uri="http://schemas.openxmlformats.org/drawingml/2006/picture">
+                <pic:pic xmlns:pic="http://schemas.openxmlformats.org/drawingml/2006/picture">
+                  <pic:nvPicPr>
+                    <pic:cNvPr id="1022" name="destaque_relogio_dir.png"/>
+                    <pic:cNvPicPr/>
+                  </pic:nvPicPr>
+                  <pic:blipFill>
+                    <a:blip r:embed="rIdImg4"/>
+                    <a:stretch>
+                      <a:fillRect/>
+                    </a:stretch>
+                  </pic:blipFill>
+                  <pic:spPr>
+                    <a:xfrm>
+                      <a:off x="0" y="0"/>
+                      <a:ext cx="5029200" cy="7772400"/>
+                    </a:xfrm>
+                    <a:prstGeom prst="rect">
+                      <a:avLst/>
+                    </a:prstGeom>
+                  </pic:spPr>
+                </pic:pic>
+              </a:graphicData>
+            </a:graphic>
+          </wp:anchor>
+        </w:drawing>
+      </w:r>
+    </w:p>
+    <w:p>
+      <w:pPr>
+        <w:spacing w:before="900" w:after="0" w:line="927" w:lineRule="exact"/>
+        <w:ind w:firstLine="0"/>
+        <w:jc w:val="left"/>
+      </w:pPr>
+      <w:r>
+        <w:rPr>
+          <w:rFonts w:ascii="Bebas Neue" w:hAnsi="Bebas Neue" w:cs="Bebas Neue"/>
+          <w:caps/>
+          <w:color w:val="A9A9A4"/>
+          <w:sz w:val="90"/>
+          <w:szCs w:val="90"/>
+        </w:rPr>
+        <w:t xml:space="preserve">PESSOA ORGULHOSA ACHA QUE ESTÁ SE PROTEGENDO, E </w:t>
+      </w:r>
+      <w:r>
+        <w:rPr>
+          <w:rFonts w:ascii="Bebas Neue" w:hAnsi="Bebas Neue" w:cs="Bebas Neue"/>
+          <w:caps/>
+          <w:color w:val="FFFFFF"/>
+          <w:sz w:val="90"/>
+          <w:szCs w:val="90"/>
+        </w:rPr>
+        <w:t xml:space="preserve">SÓ ESTÁ SE ESCONDENDO</w:t>
+      </w:r>
+      <w:r>
+        <w:rPr>
+          <w:rFonts w:ascii="Bebas Neue" w:hAnsi="Bebas Neue" w:cs="Bebas Neue"/>
+          <w:caps/>
+          <w:color w:val="A9A9A4"/>
+          <w:sz w:val="90"/>
+          <w:szCs w:val="90"/>
+        </w:rPr>
+        <w:t xml:space="preserve">.</w:t>
+      </w:r>
+    </w:p>
+    <w:p>
+      <w:pPr>
+        <w:spacing w:before="240" w:after="0"/>
+        <w:ind w:firstLine="0"/>
+        <w:jc w:val="left"/>
+      </w:pPr>
+      <w:r>
+        <w:rPr>
+          <w:rFonts w:ascii="Bebas Neue" w:hAnsi="Bebas Neue"/>
+          <w:caps/>
+          <w:color w:val="A9A9A4"/>
+          <w:spacing w:val="30"/>
+          <w:sz w:val="26"/>
+        </w:rPr>
+        <w:t xml:space="preserve">— MINHA MÃE</w:t>
+      </w:r>
+    </w:p>
+    <w:p>
+      <w:r>
+        <w:br w:type="page"/>
       </w:r>
     </w:p>
     <w:p>
@@ -7780,161 +9970,12 @@
         <w:ind w:firstLine="0"/>
       </w:pPr>
       <w:r>
-        <w:t xml:space="preserve">Minha mãe estava na cozinha, de avental, fazendo nishime numa panela grande. O Marcos estava sentado à mesa, tomando café, com a mesma cara de quando era menino e esperava o pudim.</w:t>
-      </w:r>
-    </w:p>
-    <w:p>
-      <w:r>
-        <w:t xml:space="preserve">Eu cheguei falando. Falei do curso, das coisas que eu ia mudar, do que o Kousuke devia entender, do que o Kousuke não entendia, da sala, do contrato, do travesseiro no sofá. Falei vinte minutos sem parar, enquanto minha mãe mexia a panela e o Marcos mexia o café.</w:t>
-      </w:r>
-    </w:p>
-    <w:p>
-      <w:r>
-        <w:t xml:space="preserve">Quando eu parei para respirar, o Marcos pôs a xícara na mesa.</w:t>
-      </w:r>
-    </w:p>
-    <w:p>
-      <w:pPr>
-        <w:ind w:firstLine="0"/>
-      </w:pPr>
-      <w:r>
-        <w:t xml:space="preserve">— Lu. Você já parou para pensar que você também erra?</w:t>
-      </w:r>
-    </w:p>
-    <w:p>
-      <w:pPr>
-        <w:ind w:firstLine="0"/>
-      </w:pPr>
-      <w:r>
-        <w:t xml:space="preserve">— Eu erro. Todo mundo erra.</w:t>
-      </w:r>
-    </w:p>
-    <w:p>
-      <w:pPr>
-        <w:ind w:firstLine="0"/>
-      </w:pPr>
-      <w:r>
-        <w:t xml:space="preserve">— Você falou do Kousuke vinte minutos. Não falou uma vez de você.</w:t>
-      </w:r>
-    </w:p>
-    <w:p>
-      <w:r>
-        <w:t xml:space="preserve">Eu olhei para a minha mãe, esperando que ela me defendesse. Ela tampou a panela, bateu a colher de pau duas vezes na borda, enxugou as mãos no avental e sentou do outro lado da mesa.</w:t>
-      </w:r>
-    </w:p>
-    <w:p>
-      <w:pPr>
-        <w:ind w:firstLine="0"/>
-      </w:pPr>
-      <w:r>
-        <w:t xml:space="preserve">— Filha. Lembra do hospital, lá no Japão? Do dia da cirurgia?</w:t>
-      </w:r>
-    </w:p>
-    <w:p>
-      <w:pPr>
-        <w:ind w:firstLine="0"/>
-      </w:pPr>
-      <w:r>
-        <w:t xml:space="preserve">— Lembro.</w:t>
-      </w:r>
-    </w:p>
-    <w:p>
-      <w:pPr>
-        <w:ind w:firstLine="0"/>
-      </w:pPr>
-      <w:r>
-        <w:t xml:space="preserve">— Você me disse que tinha sido tudo ótimo.</w:t>
-      </w:r>
-    </w:p>
-    <w:p>
-      <w:r>
-        <w:t xml:space="preserve">Eu senti o chão da cozinha inclinar, como o pátio do pré.</w:t>
-      </w:r>
-    </w:p>
-    <w:p>
-      <w:pPr>
-        <w:ind w:firstLine="0"/>
-      </w:pPr>
-      <w:r>
-        <w:t xml:space="preserve">— A senhora lembra disso?</w:t>
-      </w:r>
-    </w:p>
-    <w:p>
-      <w:pPr>
-        <w:ind w:firstLine="0"/>
-      </w:pPr>
-      <w:r>
-        <w:t xml:space="preserve">— Naquela noite, o médico passou no quarto e falou com a enfermeira do lado da minha cama, achando que eu estava dormindo. — Ela disse sem mágoa, arrumando a toalha da mesa com a mão, como quem alisa um lençol. — Japonês eu entendo mais do que vocês pensam. Cresci ouvindo minha mãe brigar com meu pai nessa língua.</w:t>
-      </w:r>
-    </w:p>
-    <w:p>
-      <w:pPr>
-        <w:ind w:firstLine="0"/>
-      </w:pPr>
-      <w:r>
-        <w:t xml:space="preserve">— A senhora sabia?</w:t>
-      </w:r>
-    </w:p>
-    <w:p>
-      <w:pPr>
-        <w:ind w:firstLine="0"/>
-      </w:pPr>
-      <w:r>
-        <w:t xml:space="preserve">— Mãe sabe.</w:t>
-      </w:r>
-    </w:p>
-    <w:p>
-      <w:pPr>
-        <w:ind w:firstLine="0"/>
-      </w:pPr>
-      <w:r>
-        <w:t xml:space="preserve">— E por que a senhora não disse nada?</w:t>
-      </w:r>
-    </w:p>
-    <w:p>
-      <w:pPr>
-        <w:ind w:firstLine="0"/>
-      </w:pPr>
-      <w:r>
-        <w:t xml:space="preserve">— Porque você precisava que tivesse sido ótimo. E eu também. — Ela deu de ombros. — Você é orgulhosa, filha. Igualzinha a mim. Pessoa orgulhosa acha que está se protegendo, e só está se escondendo.</w:t>
-      </w:r>
-    </w:p>
-    <w:p>
-      <w:r>
-        <w:t xml:space="preserve">Eu quis responder. Tinha a resposta pronta. Abri a boca e o que saiu foi o choro.</w:t>
-      </w:r>
-    </w:p>
-    <w:p>
-      <w:r>
-        <w:t xml:space="preserve">O choro que eu não tinha tido na sala do infarto, no corredor do pronto-socorro, no banheiro do hospital japonês, no estacionamento do aeroporto. Veio de uma vez, sentada na cozinha da minha mãe, com o cheiro do nishime, na frente do meu irmão, que não sabia o que fazer com as mãos e acabou pondo uma delas no meu ombro, desajeitado, pesada, do jeito que o Kousuke punha a mão nas minhas costas no futon do primeiro Japão.</w:t>
-      </w:r>
-    </w:p>
-    <w:p>
-      <w:r>
-        <w:t xml:space="preserve">Minha mãe não me abraçou. Pôs uma xícara de café na minha frente, com açúcar, do jeito que eu tomava aos quinze anos, e ficou sentada do outro lado da mesa, olhando para mim com aquela cara do hospital.</w:t>
-      </w:r>
-    </w:p>
-    <w:p>
-      <w:pPr>
-        <w:spacing w:before="240" w:after="240"/>
-        <w:ind w:firstLine="0"/>
-        <w:jc w:val="center"/>
-      </w:pPr>
-      <w:r>
-        <w:t xml:space="preserve">*</w:t>
-      </w:r>
-    </w:p>
-    <w:p>
-      <w:pPr>
-        <w:ind w:firstLine="0"/>
-      </w:pPr>
-      <w:r>
         <w:t xml:space="preserve">Voltei para o Japão na semana do Natal.</w:t>
       </w:r>
     </w:p>
     <w:p>
       <w:r>
-        <w:t xml:space="preserve">No avião, não dormi. Fiquei olhando o aviãozinho branco atravessar o oceano na telinha e ensaiando o que ia dizer. Ensaiava e desmontava, como a Mity com o cubo, e começava de novo.</w:t>
+        <w:t xml:space="preserve">No avião, não dormi. Fiquei olhando o aviãozinho branco atravessar o oceano na telinha e ensaiando o que ia dizer. Ensaiava e apagava, como o Kousuke com a última linha da planilha, e começava de novo.</w:t>
       </w:r>
     </w:p>
     <w:p>
@@ -8009,6 +10050,91 @@
       </w:r>
     </w:p>
     <w:p>
+      <w:r>
+        <w:t xml:space="preserve">Enquanto eu estava no Brasil, a Mity tentou montar o cubo mágico durante três semanas, e durante três semanas o cubo voltou para a caixa desmontado.</w:t>
+      </w:r>
+    </w:p>
+    <w:p>
+      <w:r>
+        <w:t xml:space="preserve">Ela tinha visto o pai montando. O Kousuke tinha comprado um cubo para ele mesmo, sem motivo, numa loja de conveniência, e aprendido em poucos dias, com vídeos, anotando os movimentos num caderninho com a letra pequena de quem faz planilha. A Mity ficou olhando por cima do ombro dele e, no dia seguinte, pediu um cubo também. Tentava depois da escola, no sofá, com a língua no canto da boca. Conseguia uma face, às vezes duas, e na terceira tudo desmontava. O pai explicava de novo, com paciência, e ela bufava. Na semana em que eu voltei, jogou o cubo nas almofadas e disse que aquilo era impossível, que só o pai conseguia, que ela nunca ia conseguir.</w:t>
+      </w:r>
+    </w:p>
+    <w:p>
+      <w:pPr>
+        <w:ind w:firstLine="0"/>
+      </w:pPr>
+      <w:r>
+        <w:t xml:space="preserve">— Eu também vou aprender — eu disse.</w:t>
+      </w:r>
+    </w:p>
+    <w:p>
+      <w:r>
+        <w:t xml:space="preserve">Ela me olhou de lado, com aquela cara de pré-adolescente que eu tinha aprendido a temer.</w:t>
+      </w:r>
+    </w:p>
+    <w:p>
+      <w:pPr>
+        <w:ind w:firstLine="0"/>
+      </w:pPr>
+      <w:r>
+        <w:t xml:space="preserve">— Você, mãe?</w:t>
+      </w:r>
+    </w:p>
+    <w:p>
+      <w:pPr>
+        <w:ind w:firstLine="0"/>
+      </w:pPr>
+      <w:r>
+        <w:t xml:space="preserve">— Eu.</w:t>
+      </w:r>
+    </w:p>
+    <w:p>
+      <w:r>
+        <w:t xml:space="preserve">Eu não sabia montar nem uma face. Nunca tinha tido paciência para aquilo. Mas naquela noite, depois que as três dormiram, eu peguei o cubo dela nas almofadas, sentei no chão da sala com o celular apoiado na perna e abri um vídeo. Girei, errei, voltei o vídeo, girei de novo. Uma face. Desmontou. Uma face de novo. Duas. Desmontou tudo. O Kousuke passou para beber água à uma da manhã, olhou para mim sentada no chão com o cubo na mão, encheu um segundo copo, deixou do meu lado, no chão, e voltou para a cama.</w:t>
+      </w:r>
+    </w:p>
+    <w:p>
+      <w:r>
+        <w:t xml:space="preserve">Às três da manhã, a última peça encaixou. Seis faces, cada uma de uma cor. Eu fiquei olhando para aquilo nas minhas mãos como tinha olhado o carimbo do zeimusho de Kariya, sem acreditar. Não acordei ninguém. Pus o cubo montado em cima da mesa, no lugar exato onde a Mity sentava para tomar café, e fui dormir.</w:t>
+      </w:r>
+    </w:p>
+    <w:p>
+      <w:r>
+        <w:t xml:space="preserve">De manhã, a Mity viu o cubo. Olhou para ele um tempo. Depois olhou para mim, que fingia procurar o açúcar.</w:t>
+      </w:r>
+    </w:p>
+    <w:p>
+      <w:pPr>
+        <w:ind w:firstLine="0"/>
+      </w:pPr>
+      <w:r>
+        <w:t xml:space="preserve">— Foi você?</w:t>
+      </w:r>
+    </w:p>
+    <w:p>
+      <w:pPr>
+        <w:ind w:firstLine="0"/>
+      </w:pPr>
+      <w:r>
+        <w:t xml:space="preserve">— Às três da manhã.</w:t>
+      </w:r>
+    </w:p>
+    <w:p>
+      <w:r>
+        <w:t xml:space="preserve">Ela não disse nada. Desmontou o cubo inteiro, girando com força, e começou de novo. Naquela mesma semana, o Kousuke comprou para ela um curso de cubo mágico pela internet, e em menos de uma semana ela montava em um minuto. Depois em menos. A Ayumi, vendo a irmã, quis aprender também, e aprendeu, depois de muito brigar com o cubo. A Tiemi, vendo as duas, pediu um. Ela tinha dois anos e montava no nível mais fácil de todos, uma cor por vez, e cada vez que terminava levantava o cubo acima da cabeça e gritava, como quem ganhou uma copa do mundo.</w:t>
+      </w:r>
+    </w:p>
+    <w:p>
+      <w:pPr>
+        <w:spacing w:before="240" w:after="240"/>
+        <w:ind w:firstLine="0"/>
+        <w:jc w:val="center"/>
+      </w:pPr>
+      <w:r>
+        <w:t xml:space="preserve">*</w:t>
+      </w:r>
+    </w:p>
+    <w:p>
       <w:pPr>
         <w:ind w:firstLine="0"/>
       </w:pPr>
@@ -8108,6 +10234,98 @@
     <w:p>
       <w:r>
         <w:t xml:space="preserve">Eu tirei uma foto, sozinha, de baixo para cima. Não saiu bonita. Saiu torta, com o céu estourado de branco. Não apaguei.</w:t>
+      </w:r>
+    </w:p>
+    <w:p>
+      <w:pPr>
+        <w:pageBreakBefore/>
+        <w:spacing w:before="0" w:after="0"/>
+        <w:ind w:firstLine="0"/>
+      </w:pPr>
+      <w:r>
+        <w:drawing>
+          <wp:anchor distT="0" distB="0" distL="0" distR="0" simplePos="0" relativeHeight="0" behindDoc="1" locked="1" layoutInCell="1" allowOverlap="1">
+            <wp:simplePos x="0" y="0"/>
+            <wp:positionH relativeFrom="page">
+              <wp:posOffset>0</wp:posOffset>
+            </wp:positionH>
+            <wp:positionV relativeFrom="page">
+              <wp:posOffset>0</wp:posOffset>
+            </wp:positionV>
+            <wp:extent cx="5029200" cy="7772400"/>
+            <wp:effectExtent l="0" t="0" r="0" b="0"/>
+            <wp:wrapNone/>
+            <wp:docPr id="1023" name="Destaque 1023"/>
+            <wp:cNvGraphicFramePr/>
+            <a:graphic xmlns:a="http://schemas.openxmlformats.org/drawingml/2006/main">
+              <a:graphicData uri="http://schemas.openxmlformats.org/drawingml/2006/picture">
+                <pic:pic xmlns:pic="http://schemas.openxmlformats.org/drawingml/2006/picture">
+                  <pic:nvPicPr>
+                    <pic:cNvPr id="1023" name="destaque_vinha_esq.png"/>
+                    <pic:cNvPicPr/>
+                  </pic:nvPicPr>
+                  <pic:blipFill>
+                    <a:blip r:embed="rIdImg5"/>
+                    <a:stretch>
+                      <a:fillRect/>
+                    </a:stretch>
+                  </pic:blipFill>
+                  <pic:spPr>
+                    <a:xfrm>
+                      <a:off x="0" y="0"/>
+                      <a:ext cx="5029200" cy="7772400"/>
+                    </a:xfrm>
+                    <a:prstGeom prst="rect">
+                      <a:avLst/>
+                    </a:prstGeom>
+                  </pic:spPr>
+                </pic:pic>
+              </a:graphicData>
+            </a:graphic>
+          </wp:anchor>
+        </w:drawing>
+      </w:r>
+    </w:p>
+    <w:p>
+      <w:pPr>
+        <w:spacing w:before="900" w:after="0" w:line="993" w:lineRule="exact"/>
+        <w:ind w:firstLine="0"/>
+        <w:jc w:val="right"/>
+      </w:pPr>
+      <w:r>
+        <w:rPr>
+          <w:rFonts w:ascii="Bebas Neue" w:hAnsi="Bebas Neue" w:cs="Bebas Neue"/>
+          <w:caps/>
+          <w:color w:val="A9A9A4"/>
+          <w:sz w:val="96"/>
+          <w:szCs w:val="96"/>
+        </w:rPr>
+        <w:t xml:space="preserve">UMA TORRE ENORME, FIRME, QUE </w:t>
+      </w:r>
+      <w:r>
+        <w:rPr>
+          <w:rFonts w:ascii="Bebas Neue" w:hAnsi="Bebas Neue" w:cs="Bebas Neue"/>
+          <w:caps/>
+          <w:color w:val="FFFFFF"/>
+          <w:sz w:val="96"/>
+          <w:szCs w:val="96"/>
+        </w:rPr>
+        <w:t xml:space="preserve">NÃO PEDIA DESCULPA PELO TAMANHO</w:t>
+      </w:r>
+      <w:r>
+        <w:rPr>
+          <w:rFonts w:ascii="Bebas Neue" w:hAnsi="Bebas Neue" w:cs="Bebas Neue"/>
+          <w:caps/>
+          <w:color w:val="A9A9A4"/>
+          <w:sz w:val="96"/>
+          <w:szCs w:val="96"/>
+        </w:rPr>
+        <w:t xml:space="preserve">.</w:t>
+      </w:r>
+    </w:p>
+    <w:p>
+      <w:r>
+        <w:br w:type="page"/>
       </w:r>
     </w:p>
     <w:p>

</xml_diff>

<commit_message>
A Menina Elefante: ramos de oliveira nas páginas de destaque
Os ornamentos das 23 páginas de destaque passam a ser ramos de oliveira
(ramo longo, ramos cruzados e ramo em arco), gerados em Python puro.

Co-Authored-By: Claude Opus 5.5 <noreply@anthropic.com>
Claude-Session: https://claude.ai/code/session_011ZTeK22H8KBNtWenzEUTZE
</commit_message>
<xml_diff>
--- a/menina_elefante/saidas/A_Menina_Elefante_V2.docx
+++ b/menina_elefante/saidas/A_Menina_Elefante_V2.docx
@@ -323,7 +323,7 @@
               <a:graphicData uri="http://schemas.openxmlformats.org/drawingml/2006/picture">
                 <pic:pic xmlns:pic="http://schemas.openxmlformats.org/drawingml/2006/picture">
                   <pic:nvPicPr>
-                    <pic:cNvPr id="1001" name="destaque_relogio_esq.png"/>
+                    <pic:cNvPr id="1001" name="destaque_oliveira_longa_esq.png"/>
                     <pic:cNvPicPr/>
                   </pic:nvPicPr>
                   <pic:blipFill>
@@ -831,7 +831,7 @@
               <a:graphicData uri="http://schemas.openxmlformats.org/drawingml/2006/picture">
                 <pic:pic xmlns:pic="http://schemas.openxmlformats.org/drawingml/2006/picture">
                   <pic:nvPicPr>
-                    <pic:cNvPr id="1002" name="destaque_vinha_dir.png"/>
+                    <pic:cNvPr id="1002" name="destaque_oliveira_cruzada_dir.png"/>
                     <pic:cNvPicPr/>
                   </pic:nvPicPr>
                   <pic:blipFill>
@@ -1433,7 +1433,7 @@
               <a:graphicData uri="http://schemas.openxmlformats.org/drawingml/2006/picture">
                 <pic:pic xmlns:pic="http://schemas.openxmlformats.org/drawingml/2006/picture">
                   <pic:nvPicPr>
-                    <pic:cNvPr id="1003" name="destaque_ramo_esq.png"/>
+                    <pic:cNvPr id="1003" name="destaque_oliveira_arco_esq.png"/>
                     <pic:cNvPicPr/>
                   </pic:nvPicPr>
                   <pic:blipFill>
@@ -2111,7 +2111,7 @@
               <a:graphicData uri="http://schemas.openxmlformats.org/drawingml/2006/picture">
                 <pic:pic xmlns:pic="http://schemas.openxmlformats.org/drawingml/2006/picture">
                   <pic:nvPicPr>
-                    <pic:cNvPr id="1004" name="destaque_relogio_dir.png"/>
+                    <pic:cNvPr id="1004" name="destaque_oliveira_longa_dir.png"/>
                     <pic:cNvPicPr/>
                   </pic:nvPicPr>
                   <pic:blipFill>
@@ -2629,7 +2629,7 @@
               <a:graphicData uri="http://schemas.openxmlformats.org/drawingml/2006/picture">
                 <pic:pic xmlns:pic="http://schemas.openxmlformats.org/drawingml/2006/picture">
                   <pic:nvPicPr>
-                    <pic:cNvPr id="1005" name="destaque_vinha_esq.png"/>
+                    <pic:cNvPr id="1005" name="destaque_oliveira_cruzada_esq.png"/>
                     <pic:cNvPicPr/>
                   </pic:nvPicPr>
                   <pic:blipFill>
@@ -2990,7 +2990,7 @@
               <a:graphicData uri="http://schemas.openxmlformats.org/drawingml/2006/picture">
                 <pic:pic xmlns:pic="http://schemas.openxmlformats.org/drawingml/2006/picture">
                   <pic:nvPicPr>
-                    <pic:cNvPr id="1006" name="destaque_ramo_dir.png"/>
+                    <pic:cNvPr id="1006" name="destaque_oliveira_arco_dir.png"/>
                     <pic:cNvPicPr/>
                   </pic:nvPicPr>
                   <pic:blipFill>
@@ -3479,7 +3479,7 @@
               <a:graphicData uri="http://schemas.openxmlformats.org/drawingml/2006/picture">
                 <pic:pic xmlns:pic="http://schemas.openxmlformats.org/drawingml/2006/picture">
                   <pic:nvPicPr>
-                    <pic:cNvPr id="1007" name="destaque_relogio_esq.png"/>
+                    <pic:cNvPr id="1007" name="destaque_oliveira_longa_esq.png"/>
                     <pic:cNvPicPr/>
                   </pic:nvPicPr>
                   <pic:blipFill>
@@ -3848,7 +3848,7 @@
               <a:graphicData uri="http://schemas.openxmlformats.org/drawingml/2006/picture">
                 <pic:pic xmlns:pic="http://schemas.openxmlformats.org/drawingml/2006/picture">
                   <pic:nvPicPr>
-                    <pic:cNvPr id="1008" name="destaque_vinha_dir.png"/>
+                    <pic:cNvPr id="1008" name="destaque_oliveira_cruzada_dir.png"/>
                     <pic:cNvPicPr/>
                   </pic:nvPicPr>
                   <pic:blipFill>
@@ -4575,7 +4575,7 @@
               <a:graphicData uri="http://schemas.openxmlformats.org/drawingml/2006/picture">
                 <pic:pic xmlns:pic="http://schemas.openxmlformats.org/drawingml/2006/picture">
                   <pic:nvPicPr>
-                    <pic:cNvPr id="1009" name="destaque_ramo_esq.png"/>
+                    <pic:cNvPr id="1009" name="destaque_oliveira_arco_esq.png"/>
                     <pic:cNvPicPr/>
                   </pic:nvPicPr>
                   <pic:blipFill>
@@ -5549,7 +5549,7 @@
               <a:graphicData uri="http://schemas.openxmlformats.org/drawingml/2006/picture">
                 <pic:pic xmlns:pic="http://schemas.openxmlformats.org/drawingml/2006/picture">
                   <pic:nvPicPr>
-                    <pic:cNvPr id="1010" name="destaque_relogio_dir.png"/>
+                    <pic:cNvPr id="1010" name="destaque_oliveira_longa_dir.png"/>
                     <pic:cNvPicPr/>
                   </pic:nvPicPr>
                   <pic:blipFill>
@@ -5807,7 +5807,7 @@
               <a:graphicData uri="http://schemas.openxmlformats.org/drawingml/2006/picture">
                 <pic:pic xmlns:pic="http://schemas.openxmlformats.org/drawingml/2006/picture">
                   <pic:nvPicPr>
-                    <pic:cNvPr id="1011" name="destaque_vinha_esq.png"/>
+                    <pic:cNvPr id="1011" name="destaque_oliveira_cruzada_esq.png"/>
                     <pic:cNvPicPr/>
                   </pic:nvPicPr>
                   <pic:blipFill>
@@ -6493,7 +6493,7 @@
               <a:graphicData uri="http://schemas.openxmlformats.org/drawingml/2006/picture">
                 <pic:pic xmlns:pic="http://schemas.openxmlformats.org/drawingml/2006/picture">
                   <pic:nvPicPr>
-                    <pic:cNvPr id="1012" name="destaque_ramo_dir.png"/>
+                    <pic:cNvPr id="1012" name="destaque_oliveira_arco_dir.png"/>
                     <pic:cNvPicPr/>
                   </pic:nvPicPr>
                   <pic:blipFill>
@@ -6824,7 +6824,7 @@
               <a:graphicData uri="http://schemas.openxmlformats.org/drawingml/2006/picture">
                 <pic:pic xmlns:pic="http://schemas.openxmlformats.org/drawingml/2006/picture">
                   <pic:nvPicPr>
-                    <pic:cNvPr id="1013" name="destaque_relogio_esq.png"/>
+                    <pic:cNvPr id="1013" name="destaque_oliveira_longa_esq.png"/>
                     <pic:cNvPicPr/>
                   </pic:nvPicPr>
                   <pic:blipFill>
@@ -7374,7 +7374,7 @@
               <a:graphicData uri="http://schemas.openxmlformats.org/drawingml/2006/picture">
                 <pic:pic xmlns:pic="http://schemas.openxmlformats.org/drawingml/2006/picture">
                   <pic:nvPicPr>
-                    <pic:cNvPr id="1014" name="destaque_vinha_dir.png"/>
+                    <pic:cNvPr id="1014" name="destaque_oliveira_cruzada_dir.png"/>
                     <pic:cNvPicPr/>
                   </pic:nvPicPr>
                   <pic:blipFill>
@@ -7677,7 +7677,7 @@
               <a:graphicData uri="http://schemas.openxmlformats.org/drawingml/2006/picture">
                 <pic:pic xmlns:pic="http://schemas.openxmlformats.org/drawingml/2006/picture">
                   <pic:nvPicPr>
-                    <pic:cNvPr id="1015" name="destaque_ramo_esq.png"/>
+                    <pic:cNvPr id="1015" name="destaque_oliveira_arco_esq.png"/>
                     <pic:cNvPicPr/>
                   </pic:nvPicPr>
                   <pic:blipFill>
@@ -8169,7 +8169,7 @@
               <a:graphicData uri="http://schemas.openxmlformats.org/drawingml/2006/picture">
                 <pic:pic xmlns:pic="http://schemas.openxmlformats.org/drawingml/2006/picture">
                   <pic:nvPicPr>
-                    <pic:cNvPr id="1016" name="destaque_relogio_dir.png"/>
+                    <pic:cNvPr id="1016" name="destaque_oliveira_longa_dir.png"/>
                     <pic:cNvPicPr/>
                   </pic:nvPicPr>
                   <pic:blipFill>
@@ -8673,7 +8673,7 @@
               <a:graphicData uri="http://schemas.openxmlformats.org/drawingml/2006/picture">
                 <pic:pic xmlns:pic="http://schemas.openxmlformats.org/drawingml/2006/picture">
                   <pic:nvPicPr>
-                    <pic:cNvPr id="1017" name="destaque_vinha_esq.png"/>
+                    <pic:cNvPr id="1017" name="destaque_oliveira_cruzada_esq.png"/>
                     <pic:cNvPicPr/>
                   </pic:nvPicPr>
                   <pic:blipFill>
@@ -9041,7 +9041,7 @@
               <a:graphicData uri="http://schemas.openxmlformats.org/drawingml/2006/picture">
                 <pic:pic xmlns:pic="http://schemas.openxmlformats.org/drawingml/2006/picture">
                   <pic:nvPicPr>
-                    <pic:cNvPr id="1018" name="destaque_ramo_dir.png"/>
+                    <pic:cNvPr id="1018" name="destaque_oliveira_arco_dir.png"/>
                     <pic:cNvPicPr/>
                   </pic:nvPicPr>
                   <pic:blipFill>
@@ -10066,7 +10066,7 @@
               <a:graphicData uri="http://schemas.openxmlformats.org/drawingml/2006/picture">
                 <pic:pic xmlns:pic="http://schemas.openxmlformats.org/drawingml/2006/picture">
                   <pic:nvPicPr>
-                    <pic:cNvPr id="1019" name="destaque_relogio_esq.png"/>
+                    <pic:cNvPr id="1019" name="destaque_oliveira_longa_esq.png"/>
                     <pic:cNvPicPr/>
                   </pic:nvPicPr>
                   <pic:blipFill>
@@ -10447,7 +10447,7 @@
               <a:graphicData uri="http://schemas.openxmlformats.org/drawingml/2006/picture">
                 <pic:pic xmlns:pic="http://schemas.openxmlformats.org/drawingml/2006/picture">
                   <pic:nvPicPr>
-                    <pic:cNvPr id="1020" name="destaque_vinha_dir.png"/>
+                    <pic:cNvPr id="1020" name="destaque_oliveira_cruzada_dir.png"/>
                     <pic:cNvPicPr/>
                   </pic:nvPicPr>
                   <pic:blipFill>
@@ -10735,7 +10735,7 @@
               <a:graphicData uri="http://schemas.openxmlformats.org/drawingml/2006/picture">
                 <pic:pic xmlns:pic="http://schemas.openxmlformats.org/drawingml/2006/picture">
                   <pic:nvPicPr>
-                    <pic:cNvPr id="1021" name="destaque_ramo_esq.png"/>
+                    <pic:cNvPr id="1021" name="destaque_oliveira_arco_esq.png"/>
                     <pic:cNvPicPr/>
                   </pic:nvPicPr>
                   <pic:blipFill>
@@ -11059,7 +11059,7 @@
               <a:graphicData uri="http://schemas.openxmlformats.org/drawingml/2006/picture">
                 <pic:pic xmlns:pic="http://schemas.openxmlformats.org/drawingml/2006/picture">
                   <pic:nvPicPr>
-                    <pic:cNvPr id="1022" name="destaque_relogio_dir.png"/>
+                    <pic:cNvPr id="1022" name="destaque_oliveira_longa_dir.png"/>
                     <pic:cNvPicPr/>
                   </pic:nvPicPr>
                   <pic:blipFill>
@@ -11505,7 +11505,7 @@
               <a:graphicData uri="http://schemas.openxmlformats.org/drawingml/2006/picture">
                 <pic:pic xmlns:pic="http://schemas.openxmlformats.org/drawingml/2006/picture">
                   <pic:nvPicPr>
-                    <pic:cNvPr id="1023" name="destaque_vinha_esq.png"/>
+                    <pic:cNvPr id="1023" name="destaque_oliveira_cruzada_esq.png"/>
                     <pic:cNvPicPr/>
                   </pic:nvPicPr>
                   <pic:blipFill>

</xml_diff>